<commit_message>
Guide: 18 decisions; Part 12 row for pushing to the wrong repo
Co-Authored-By: Claude Opus 5.5 <noreply@anthropic.com>
</commit_message>
<xml_diff>
--- a/docs/Campusly-Live-Session-Idea-to-Live.docx
+++ b/docs/Campusly-Live-Session-Idea-to-Live.docx
@@ -7721,15 +7721,15 @@
                 <w:sz w:val="19"/>
                 <w:szCs w:val="19"/>
               </w:rPr>
-              <w:t xml:space="preserve">16</w:t>
-            </w:r>
-            <w:r>
-              <w:rPr>
-                <w:rFonts w:ascii="Arial" w:cs="Arial" w:eastAsia="Arial" w:hAnsi="Arial"/>
-                <w:sz w:val="19"/>
-                <w:szCs w:val="19"/>
-              </w:rPr>
-              <w:t xml:space="preserve"> locked decisions, D-001 to D-016, each with a reason</w:t>
+              <w:t xml:space="preserve">18</w:t>
+            </w:r>
+            <w:r>
+              <w:rPr>
+                <w:rFonts w:ascii="Arial" w:cs="Arial" w:eastAsia="Arial" w:hAnsi="Arial"/>
+                <w:sz w:val="19"/>
+                <w:szCs w:val="19"/>
+              </w:rPr>
+              <w:t xml:space="preserve"> locked decisions, D-001 to D-018, each with a reason (D-016 is marked superseded by D-017)</w:t>
             </w:r>
           </w:p>
         </w:tc>
@@ -27335,6 +27335,141 @@
                 <w:sz w:val="19"/>
                 <w:szCs w:val="19"/>
               </w:rPr>
+              <w:t xml:space="preserve">Push fails with </w:t>
+            </w:r>
+            <w:r>
+              <w:rPr>
+                <w:rFonts w:ascii="Arial" w:cs="Arial" w:eastAsia="Arial" w:hAnsi="Arial"/>
+                <w:i/>
+                <w:iCs/>
+                <w:sz w:val="19"/>
+                <w:szCs w:val="19"/>
+              </w:rPr>
+              <w:t xml:space="preserve">Permission denied</w:t>
+            </w:r>
+            <w:r>
+              <w:rPr>
+                <w:rFonts w:ascii="Arial" w:cs="Arial" w:eastAsia="Arial" w:hAnsi="Arial"/>
+                <w:sz w:val="19"/>
+                <w:szCs w:val="19"/>
+              </w:rPr>
+              <w:t xml:space="preserve"> or </w:t>
+            </w:r>
+            <w:r>
+              <w:rPr>
+                <w:rFonts w:ascii="Arial" w:cs="Arial" w:eastAsia="Arial" w:hAnsi="Arial"/>
+                <w:i/>
+                <w:iCs/>
+                <w:sz w:val="19"/>
+                <w:szCs w:val="19"/>
+              </w:rPr>
+              <w:t xml:space="preserve">403</w:t>
+            </w:r>
+          </w:p>
+        </w:tc>
+        <w:tc>
+          <w:tcPr>
+            <w:tcW w:type="dxa" w:w="3013"/>
+            <w:tcBorders>
+              <w:top w:val="single" w:color="DBE3DA" w:sz="4"/>
+              <w:left w:val="single" w:color="DBE3DA" w:sz="4"/>
+              <w:bottom w:val="single" w:color="DBE3DA" w:sz="4"/>
+              <w:right w:val="single" w:color="DBE3DA" w:sz="4"/>
+            </w:tcBorders>
+            <w:shd w:fill="FAFBF9" w:color="auto" w:val="clear"/>
+            <w:tcMar>
+              <w:top w:type="dxa" w:w="80"/>
+              <w:left w:type="dxa" w:w="120"/>
+              <w:bottom w:type="dxa" w:w="80"/>
+              <w:right w:type="dxa" w:w="120"/>
+            </w:tcMar>
+          </w:tcPr>
+          <w:p>
+            <w:pPr>
+              <w:spacing w:after="40" w:line="252"/>
+            </w:pPr>
+            <w:r>
+              <w:rPr>
+                <w:rFonts w:ascii="Arial" w:cs="Arial" w:eastAsia="Arial" w:hAnsi="Arial"/>
+                <w:sz w:val="19"/>
+                <w:szCs w:val="19"/>
+              </w:rPr>
+              <w:t xml:space="preserve">You cloned the instructor's repository instead of your fork</w:t>
+            </w:r>
+          </w:p>
+        </w:tc>
+        <w:tc>
+          <w:tcPr>
+            <w:tcW w:type="dxa" w:w="3013"/>
+            <w:tcBorders>
+              <w:top w:val="single" w:color="DBE3DA" w:sz="4"/>
+              <w:left w:val="single" w:color="DBE3DA" w:sz="4"/>
+              <w:bottom w:val="single" w:color="DBE3DA" w:sz="4"/>
+              <w:right w:val="single" w:color="DBE3DA" w:sz="4"/>
+            </w:tcBorders>
+            <w:shd w:fill="FAFBF9" w:color="auto" w:val="clear"/>
+            <w:tcMar>
+              <w:top w:type="dxa" w:w="80"/>
+              <w:left w:type="dxa" w:w="120"/>
+              <w:bottom w:type="dxa" w:w="80"/>
+              <w:right w:type="dxa" w:w="120"/>
+            </w:tcMar>
+          </w:tcPr>
+          <w:p>
+            <w:pPr>
+              <w:spacing w:after="40" w:line="252"/>
+            </w:pPr>
+            <w:r>
+              <w:rPr>
+                <w:rFonts w:ascii="Arial" w:cs="Arial" w:eastAsia="Arial" w:hAnsi="Arial"/>
+                <w:sz w:val="19"/>
+                <w:szCs w:val="19"/>
+              </w:rPr>
+              <w:t xml:space="preserve">Fork it (Part 0.2), then ask Claude: </w:t>
+            </w:r>
+            <w:r>
+              <w:rPr>
+                <w:rFonts w:ascii="Arial" w:cs="Arial" w:eastAsia="Arial" w:hAnsi="Arial"/>
+                <w:i/>
+                <w:iCs/>
+                <w:sz w:val="19"/>
+                <w:szCs w:val="19"/>
+              </w:rPr>
+              <w:t xml:space="preserve">point origin at my fork, github.com/&lt;your-username&gt;/campusly, and push again</w:t>
+            </w:r>
+          </w:p>
+        </w:tc>
+      </w:tr>
+      <w:tr>
+        <w:trPr>
+          <w:cantSplit/>
+        </w:trPr>
+        <w:tc>
+          <w:tcPr>
+            <w:tcW w:type="dxa" w:w="3000"/>
+            <w:tcBorders>
+              <w:top w:val="single" w:color="DBE3DA" w:sz="4"/>
+              <w:left w:val="single" w:color="DBE3DA" w:sz="4"/>
+              <w:bottom w:val="single" w:color="DBE3DA" w:sz="4"/>
+              <w:right w:val="single" w:color="DBE3DA" w:sz="4"/>
+            </w:tcBorders>
+            <w:tcMar>
+              <w:top w:type="dxa" w:w="80"/>
+              <w:left w:type="dxa" w:w="120"/>
+              <w:bottom w:type="dxa" w:w="80"/>
+              <w:right w:type="dxa" w:w="120"/>
+            </w:tcMar>
+          </w:tcPr>
+          <w:p>
+            <w:pPr>
+              <w:spacing w:after="40" w:line="252"/>
+            </w:pPr>
+            <w:r>
+              <w:rPr>
+                <w:rFonts w:ascii="Arial" w:cs="Arial" w:eastAsia="Arial" w:hAnsi="Arial"/>
+                <w:sz w:val="19"/>
+                <w:szCs w:val="19"/>
+              </w:rPr>
               <w:t xml:space="preserve">You changed something by accident</w:t>
             </w:r>
           </w:p>
@@ -27348,7 +27483,6 @@
               <w:bottom w:val="single" w:color="DBE3DA" w:sz="4"/>
               <w:right w:val="single" w:color="DBE3DA" w:sz="4"/>
             </w:tcBorders>
-            <w:shd w:fill="FAFBF9" w:color="auto" w:val="clear"/>
             <w:tcMar>
               <w:top w:type="dxa" w:w="80"/>
               <w:left w:type="dxa" w:w="120"/>
@@ -27371,7 +27505,6 @@
               <w:bottom w:val="single" w:color="DBE3DA" w:sz="4"/>
               <w:right w:val="single" w:color="DBE3DA" w:sz="4"/>
             </w:tcBorders>
-            <w:shd w:fill="FAFBF9" w:color="auto" w:val="clear"/>
             <w:tcMar>
               <w:top w:type="dxa" w:w="80"/>
               <w:left w:type="dxa" w:w="120"/>

</xml_diff>

<commit_message>
Guided document v3: rebuilt around fork → explore → build → go live
Cover: session in four steps, public repo and live app URLs. Part 0.5 compare with the live app.
Part 5: CI green check and the real CI failure. Part 10: deploy docs and history. Part 11: work in your fork.
Part 13: new Explore prompt 13.1 for the deploy scripts, renumbered 13.2-13.9. Part 12 and appendices updated.
Verified: text extracted with mammoth (11 Explore, 9 Build prompts, 24 figures); cover rendered with Quick Look.
Not verified: full page-by-page layout.

Co-Authored-By: Claude Opus 5.5 <noreply@anthropic.com>
</commit_message>
<xml_diff>
--- a/docs/Campusly-Live-Session-Idea-to-Live.docx
+++ b/docs/Campusly-Live-Session-Idea-to-Live.docx
@@ -41,7 +41,7 @@
           <w:sz w:val="24"/>
           <w:szCs w:val="24"/>
         </w:rPr>
-        <w:t xml:space="preserve">You receive a finished, tested application. First you take it apart with Claude, stage by stage, and check every claim against the code. Then you extend it with new features, using the same method that built it.</w:t>
+        <w:t xml:space="preserve">You fork a finished, tested, live application. First you take it apart with Claude, stage by stage, and check every claim against the code. Then you extend it with new features, using the same method that built it. Finally you see how it went live on AWS.</w:t>
       </w:r>
     </w:p>
     <w:p>
@@ -113,7 +113,7 @@
         <w:rPr>
           <w:rFonts w:ascii="Arial" w:cs="Arial" w:eastAsia="Arial" w:hAnsi="Arial"/>
         </w:rPr>
-        <w:t xml:space="preserve">, an operating manual for an AI agent. You get the repository. For every stage that is already built, you run a </w:t>
+        <w:t xml:space="preserve">, an operating manual for an AI agent. Its repository is </w:t>
       </w:r>
       <w:r>
         <w:rPr>
@@ -121,13 +121,13 @@
           <w:b/>
           <w:bCs/>
         </w:rPr>
-        <w:t xml:space="preserve">read-only Explore prompt</w:t>
-      </w:r>
-      <w:r>
-        <w:rPr>
-          <w:rFonts w:ascii="Arial" w:cs="Arial" w:eastAsia="Arial" w:hAnsi="Arial"/>
-        </w:rPr>
-        <w:t xml:space="preserve">: Claude finds that stage in the code and shows you the evidence, and you verify it yourself. Then you run </w:t>
+        <w:t xml:space="preserve">public</w:t>
+      </w:r>
+      <w:r>
+        <w:rPr>
+          <w:rFonts w:ascii="Arial" w:cs="Arial" w:eastAsia="Arial" w:hAnsi="Arial"/>
+        </w:rPr>
+        <w:t xml:space="preserve">, and you work on your own fork of it. For every stage that is already built, you run a </w:t>
       </w:r>
       <w:r>
         <w:rPr>
@@ -135,14 +135,122 @@
           <w:b/>
           <w:bCs/>
         </w:rPr>
+        <w:t xml:space="preserve">read-only Explore prompt</w:t>
+      </w:r>
+      <w:r>
+        <w:rPr>
+          <w:rFonts w:ascii="Arial" w:cs="Arial" w:eastAsia="Arial" w:hAnsi="Arial"/>
+        </w:rPr>
+        <w:t xml:space="preserve">: Claude finds that stage in the code and shows you the evidence, and you verify it yourself. Then you run </w:t>
+      </w:r>
+      <w:r>
+        <w:rPr>
+          <w:rFonts w:ascii="Arial" w:cs="Arial" w:eastAsia="Arial" w:hAnsi="Arial"/>
+          <w:b/>
+          <w:bCs/>
+        </w:rPr>
         <w:t xml:space="preserve">Build prompts</w:t>
       </w:r>
       <w:r>
         <w:rPr>
           <w:rFonts w:ascii="Arial" w:cs="Arial" w:eastAsia="Arial" w:hAnsi="Arial"/>
         </w:rPr>
-        <w:t xml:space="preserve"> to add new features. Both kinds of prompt use the same five-line formula.</w:t>
-      </w:r>
+        <w:t xml:space="preserve"> to add new features on your own branches. Both kinds of prompt use the same five-line formula. The session ends with the deployment: the same code, running on a real server.</w:t>
+      </w:r>
+    </w:p>
+    <w:tbl>
+      <w:tblPr>
+        <w:tblW w:type="dxa" w:w="9026"/>
+        <w:tblBorders>
+          <w:top w:val="single" w:color="auto" w:sz="4"/>
+          <w:left w:val="single" w:color="auto" w:sz="4"/>
+          <w:bottom w:val="single" w:color="auto" w:sz="4"/>
+          <w:right w:val="single" w:color="auto" w:sz="4"/>
+          <w:insideH w:val="single" w:color="auto" w:sz="4"/>
+          <w:insideV w:val="single" w:color="auto" w:sz="4"/>
+        </w:tblBorders>
+        <w:tblLayout w:type="fixed"/>
+      </w:tblPr>
+      <w:tblGrid>
+        <w:gridCol w:w="9026"/>
+      </w:tblGrid>
+      <w:tr>
+        <w:tc>
+          <w:tcPr>
+            <w:tcW w:type="dxa" w:w="9026"/>
+            <w:tcBorders>
+              <w:top w:val="none" w:color="FFFFFF" w:sz="0"/>
+              <w:left w:val="none" w:color="FFFFFF" w:sz="0"/>
+              <w:bottom w:val="none" w:color="FFFFFF" w:sz="0"/>
+              <w:right w:val="none" w:color="FFFFFF" w:sz="0"/>
+            </w:tcBorders>
+            <w:shd w:fill="E3F3EF" w:color="auto" w:val="clear"/>
+            <w:tcMar>
+              <w:top w:type="dxa" w:w="80"/>
+              <w:left w:type="dxa" w:w="120"/>
+              <w:bottom w:type="dxa" w:w="80"/>
+              <w:right w:type="dxa" w:w="120"/>
+            </w:tcMar>
+          </w:tcPr>
+          <w:p>
+            <w:pPr>
+              <w:spacing w:after="20" w:line="252"/>
+            </w:pPr>
+            <w:r>
+              <w:rPr>
+                <w:rFonts w:ascii="Arial" w:cs="Arial" w:eastAsia="Arial" w:hAnsi="Arial"/>
+                <w:b/>
+                <w:bCs/>
+                <w:color w:val="0B6E5F"/>
+                <w:sz w:val="19"/>
+                <w:szCs w:val="19"/>
+              </w:rPr>
+              <w:t xml:space="preserve">EVERYONE USES  </w:t>
+            </w:r>
+            <w:r>
+              <w:rPr>
+                <w:rFonts w:ascii="Arial" w:cs="Arial" w:eastAsia="Arial" w:hAnsi="Arial"/>
+                <w:sz w:val="19"/>
+                <w:szCs w:val="19"/>
+              </w:rPr>
+              <w:t xml:space="preserve">Repository: </w:t>
+            </w:r>
+            <w:r>
+              <w:rPr>
+                <w:rFonts w:ascii="Arial" w:cs="Arial" w:eastAsia="Arial" w:hAnsi="Arial"/>
+                <w:b/>
+                <w:bCs/>
+                <w:sz w:val="19"/>
+                <w:szCs w:val="19"/>
+              </w:rPr>
+              <w:t xml:space="preserve">https://github.com/shivavashishtha/campusly</w:t>
+            </w:r>
+            <w:r>
+              <w:rPr>
+                <w:rFonts w:ascii="Arial" w:cs="Arial" w:eastAsia="Arial" w:hAnsi="Arial"/>
+                <w:sz w:val="19"/>
+                <w:szCs w:val="19"/>
+              </w:rPr>
+              <w:t xml:space="preserve">   ·   Live app: </w:t>
+            </w:r>
+            <w:r>
+              <w:rPr>
+                <w:rFonts w:ascii="Arial" w:cs="Arial" w:eastAsia="Arial" w:hAnsi="Arial"/>
+                <w:b/>
+                <w:bCs/>
+                <w:sz w:val="19"/>
+                <w:szCs w:val="19"/>
+              </w:rPr>
+              <w:t xml:space="preserve">https://campusly.13-127-195-244.sslip.io</w:t>
+            </w:r>
+          </w:p>
+        </w:tc>
+      </w:tr>
+    </w:tbl>
+    <w:p>
+      <w:pPr>
+        <w:spacing w:after="120" w:before="0" w:line="276"/>
+      </w:pPr>
     </w:p>
     <w:p>
       <w:pPr>
@@ -170,7 +278,7 @@
         <w:rPr>
           <w:rFonts w:ascii="Arial" w:cs="Arial" w:eastAsia="Arial" w:hAnsi="Arial"/>
         </w:rPr>
-        <w:t xml:space="preserve">A working copy of Campusly on your machine; a clear picture of how each playbook stage shows up in real code; at least one new feature you added yourself, with tests; and a prompt method you can reuse on any idea.</w:t>
+        <w:t xml:space="preserve">Your own fork of Campusly, running on your machine; a clear picture of how each playbook stage shows up in real code; at least one new feature you added yourself, with tests, in a pull request on your fork; an understanding of how the app reached a live server; and a prompt method you can reuse on any idea.</w:t>
       </w:r>
     </w:p>
     <w:p>
@@ -184,7 +292,7 @@
           <wp:inline distT="0" distB="0" distL="0" distR="0">
             <wp:extent cx="5486400" cy="3429000"/>
             <wp:effectExtent t="0" r="0" b="0" l="0"/>
-            <wp:docPr id="1" name="Figure 0.1" descr="Campusly, the application you receive" title="Figure 0.1"/>
+            <wp:docPr id="1" name="Figure 0.1" descr="Campusly, the application you fork, explore, extend and see go live" title="Figure 0.1"/>
             <wp:cNvGraphicFramePr>
               <a:graphicFrameLocks xmlns:a="http://schemas.openxmlformats.org/drawingml/2006/main" noChangeAspect="1"/>
             </wp:cNvGraphicFramePr>
@@ -245,8 +353,693 @@
           <w:sz w:val="17"/>
           <w:szCs w:val="17"/>
         </w:rPr>
-        <w:t xml:space="preserve">Campusly, the application you receive</w:t>
-      </w:r>
+        <w:t xml:space="preserve">Campusly, the application you fork, explore, extend and see go live</w:t>
+      </w:r>
+    </w:p>
+    <w:p>
+      <w:pPr>
+        <w:pStyle w:val="Heading2"/>
+      </w:pPr>
+      <w:r>
+        <w:rPr>
+          <w:rFonts w:ascii="Arial" w:cs="Arial" w:eastAsia="Arial" w:hAnsi="Arial"/>
+        </w:rPr>
+        <w:t xml:space="preserve">The session in four steps</w:t>
+      </w:r>
+    </w:p>
+    <w:tbl>
+      <w:tblPr>
+        <w:tblW w:type="dxa" w:w="9026"/>
+        <w:tblBorders>
+          <w:top w:val="single" w:color="auto" w:sz="4"/>
+          <w:left w:val="single" w:color="auto" w:sz="4"/>
+          <w:bottom w:val="single" w:color="auto" w:sz="4"/>
+          <w:right w:val="single" w:color="auto" w:sz="4"/>
+          <w:insideH w:val="single" w:color="auto" w:sz="4"/>
+          <w:insideV w:val="single" w:color="auto" w:sz="4"/>
+        </w:tblBorders>
+        <w:tblLayout w:type="fixed"/>
+      </w:tblPr>
+      <w:tblGrid>
+        <w:gridCol w:w="1500"/>
+        <w:gridCol w:w="1900"/>
+        <w:gridCol w:w="4426"/>
+        <w:gridCol w:w="1200"/>
+      </w:tblGrid>
+      <w:tr>
+        <w:trPr>
+          <w:tblHeader/>
+        </w:trPr>
+        <w:tc>
+          <w:tcPr>
+            <w:tcW w:type="dxa" w:w="1500"/>
+            <w:tcBorders>
+              <w:top w:val="single" w:color="DBE3DA" w:sz="4"/>
+              <w:left w:val="single" w:color="DBE3DA" w:sz="4"/>
+              <w:bottom w:val="single" w:color="DBE3DA" w:sz="4"/>
+              <w:right w:val="single" w:color="DBE3DA" w:sz="4"/>
+            </w:tcBorders>
+            <w:shd w:fill="0B6E5F" w:color="auto" w:val="clear"/>
+            <w:tcMar>
+              <w:top w:type="dxa" w:w="80"/>
+              <w:left w:type="dxa" w:w="120"/>
+              <w:bottom w:type="dxa" w:w="80"/>
+              <w:right w:type="dxa" w:w="120"/>
+            </w:tcMar>
+          </w:tcPr>
+          <w:p>
+            <w:pPr>
+              <w:spacing w:after="40" w:line="252"/>
+            </w:pPr>
+            <w:r>
+              <w:rPr>
+                <w:rFonts w:ascii="Arial" w:cs="Arial" w:eastAsia="Arial" w:hAnsi="Arial"/>
+                <w:b/>
+                <w:bCs/>
+                <w:color w:val="FFFFFF"/>
+                <w:sz w:val="18"/>
+                <w:szCs w:val="18"/>
+              </w:rPr>
+              <w:t xml:space="preserve">Step</w:t>
+            </w:r>
+          </w:p>
+        </w:tc>
+        <w:tc>
+          <w:tcPr>
+            <w:tcW w:type="dxa" w:w="1900"/>
+            <w:tcBorders>
+              <w:top w:val="single" w:color="DBE3DA" w:sz="4"/>
+              <w:left w:val="single" w:color="DBE3DA" w:sz="4"/>
+              <w:bottom w:val="single" w:color="DBE3DA" w:sz="4"/>
+              <w:right w:val="single" w:color="DBE3DA" w:sz="4"/>
+            </w:tcBorders>
+            <w:shd w:fill="0B6E5F" w:color="auto" w:val="clear"/>
+            <w:tcMar>
+              <w:top w:type="dxa" w:w="80"/>
+              <w:left w:type="dxa" w:w="120"/>
+              <w:bottom w:type="dxa" w:w="80"/>
+              <w:right w:type="dxa" w:w="120"/>
+            </w:tcMar>
+          </w:tcPr>
+          <w:p>
+            <w:pPr>
+              <w:spacing w:after="40" w:line="252"/>
+            </w:pPr>
+            <w:r>
+              <w:rPr>
+                <w:rFonts w:ascii="Arial" w:cs="Arial" w:eastAsia="Arial" w:hAnsi="Arial"/>
+                <w:b/>
+                <w:bCs/>
+                <w:color w:val="FFFFFF"/>
+                <w:sz w:val="18"/>
+                <w:szCs w:val="18"/>
+              </w:rPr>
+              <w:t xml:space="preserve">When</w:t>
+            </w:r>
+          </w:p>
+        </w:tc>
+        <w:tc>
+          <w:tcPr>
+            <w:tcW w:type="dxa" w:w="4426"/>
+            <w:tcBorders>
+              <w:top w:val="single" w:color="DBE3DA" w:sz="4"/>
+              <w:left w:val="single" w:color="DBE3DA" w:sz="4"/>
+              <w:bottom w:val="single" w:color="DBE3DA" w:sz="4"/>
+              <w:right w:val="single" w:color="DBE3DA" w:sz="4"/>
+            </w:tcBorders>
+            <w:shd w:fill="0B6E5F" w:color="auto" w:val="clear"/>
+            <w:tcMar>
+              <w:top w:type="dxa" w:w="80"/>
+              <w:left w:type="dxa" w:w="120"/>
+              <w:bottom w:type="dxa" w:w="80"/>
+              <w:right w:type="dxa" w:w="120"/>
+            </w:tcMar>
+          </w:tcPr>
+          <w:p>
+            <w:pPr>
+              <w:spacing w:after="40" w:line="252"/>
+            </w:pPr>
+            <w:r>
+              <w:rPr>
+                <w:rFonts w:ascii="Arial" w:cs="Arial" w:eastAsia="Arial" w:hAnsi="Arial"/>
+                <w:b/>
+                <w:bCs/>
+                <w:color w:val="FFFFFF"/>
+                <w:sz w:val="18"/>
+                <w:szCs w:val="18"/>
+              </w:rPr>
+              <w:t xml:space="preserve">What you do</w:t>
+            </w:r>
+          </w:p>
+        </w:tc>
+        <w:tc>
+          <w:tcPr>
+            <w:tcW w:type="dxa" w:w="1200"/>
+            <w:tcBorders>
+              <w:top w:val="single" w:color="DBE3DA" w:sz="4"/>
+              <w:left w:val="single" w:color="DBE3DA" w:sz="4"/>
+              <w:bottom w:val="single" w:color="DBE3DA" w:sz="4"/>
+              <w:right w:val="single" w:color="DBE3DA" w:sz="4"/>
+            </w:tcBorders>
+            <w:shd w:fill="0B6E5F" w:color="auto" w:val="clear"/>
+            <w:tcMar>
+              <w:top w:type="dxa" w:w="80"/>
+              <w:left w:type="dxa" w:w="120"/>
+              <w:bottom w:type="dxa" w:w="80"/>
+              <w:right w:type="dxa" w:w="120"/>
+            </w:tcMar>
+          </w:tcPr>
+          <w:p>
+            <w:pPr>
+              <w:spacing w:after="40" w:line="252"/>
+            </w:pPr>
+            <w:r>
+              <w:rPr>
+                <w:rFonts w:ascii="Arial" w:cs="Arial" w:eastAsia="Arial" w:hAnsi="Arial"/>
+                <w:b/>
+                <w:bCs/>
+                <w:color w:val="FFFFFF"/>
+                <w:sz w:val="18"/>
+                <w:szCs w:val="18"/>
+              </w:rPr>
+              <w:t xml:space="preserve">Parts</w:t>
+            </w:r>
+          </w:p>
+        </w:tc>
+      </w:tr>
+      <w:tr>
+        <w:trPr>
+          <w:cantSplit/>
+        </w:trPr>
+        <w:tc>
+          <w:tcPr>
+            <w:tcW w:type="dxa" w:w="1500"/>
+            <w:tcBorders>
+              <w:top w:val="single" w:color="DBE3DA" w:sz="4"/>
+              <w:left w:val="single" w:color="DBE3DA" w:sz="4"/>
+              <w:bottom w:val="single" w:color="DBE3DA" w:sz="4"/>
+              <w:right w:val="single" w:color="DBE3DA" w:sz="4"/>
+            </w:tcBorders>
+            <w:tcMar>
+              <w:top w:type="dxa" w:w="80"/>
+              <w:left w:type="dxa" w:w="120"/>
+              <w:bottom w:type="dxa" w:w="80"/>
+              <w:right w:type="dxa" w:w="120"/>
+            </w:tcMar>
+          </w:tcPr>
+          <w:p>
+            <w:pPr>
+              <w:spacing w:after="40" w:line="252"/>
+            </w:pPr>
+            <w:r>
+              <w:rPr>
+                <w:rFonts w:ascii="Arial" w:cs="Arial" w:eastAsia="Arial" w:hAnsi="Arial"/>
+                <w:sz w:val="19"/>
+                <w:szCs w:val="19"/>
+              </w:rPr>
+              <w:t xml:space="preserve">1 · Set up</w:t>
+            </w:r>
+          </w:p>
+        </w:tc>
+        <w:tc>
+          <w:tcPr>
+            <w:tcW w:type="dxa" w:w="1900"/>
+            <w:tcBorders>
+              <w:top w:val="single" w:color="DBE3DA" w:sz="4"/>
+              <w:left w:val="single" w:color="DBE3DA" w:sz="4"/>
+              <w:bottom w:val="single" w:color="DBE3DA" w:sz="4"/>
+              <w:right w:val="single" w:color="DBE3DA" w:sz="4"/>
+            </w:tcBorders>
+            <w:tcMar>
+              <w:top w:type="dxa" w:w="80"/>
+              <w:left w:type="dxa" w:w="120"/>
+              <w:bottom w:type="dxa" w:w="80"/>
+              <w:right w:type="dxa" w:w="120"/>
+            </w:tcMar>
+          </w:tcPr>
+          <w:p>
+            <w:pPr>
+              <w:spacing w:after="40" w:line="252"/>
+            </w:pPr>
+            <w:r>
+              <w:rPr>
+                <w:rFonts w:ascii="Arial" w:cs="Arial" w:eastAsia="Arial" w:hAnsi="Arial"/>
+                <w:sz w:val="19"/>
+                <w:szCs w:val="19"/>
+              </w:rPr>
+              <w:t xml:space="preserve">Before the session</w:t>
+            </w:r>
+          </w:p>
+        </w:tc>
+        <w:tc>
+          <w:tcPr>
+            <w:tcW w:type="dxa" w:w="4426"/>
+            <w:tcBorders>
+              <w:top w:val="single" w:color="DBE3DA" w:sz="4"/>
+              <w:left w:val="single" w:color="DBE3DA" w:sz="4"/>
+              <w:bottom w:val="single" w:color="DBE3DA" w:sz="4"/>
+              <w:right w:val="single" w:color="DBE3DA" w:sz="4"/>
+            </w:tcBorders>
+            <w:tcMar>
+              <w:top w:type="dxa" w:w="80"/>
+              <w:left w:type="dxa" w:w="120"/>
+              <w:bottom w:type="dxa" w:w="80"/>
+              <w:right w:type="dxa" w:w="120"/>
+            </w:tcMar>
+          </w:tcPr>
+          <w:p>
+            <w:pPr>
+              <w:spacing w:after="40" w:line="252"/>
+            </w:pPr>
+            <w:r>
+              <w:rPr>
+                <w:rFonts w:ascii="Arial" w:cs="Arial" w:eastAsia="Arial" w:hAnsi="Arial"/>
+                <w:sz w:val="19"/>
+                <w:szCs w:val="19"/>
+              </w:rPr>
+              <w:t xml:space="preserve">Fork the public repository, clone your fork, run the app</w:t>
+            </w:r>
+          </w:p>
+        </w:tc>
+        <w:tc>
+          <w:tcPr>
+            <w:tcW w:type="dxa" w:w="1200"/>
+            <w:tcBorders>
+              <w:top w:val="single" w:color="DBE3DA" w:sz="4"/>
+              <w:left w:val="single" w:color="DBE3DA" w:sz="4"/>
+              <w:bottom w:val="single" w:color="DBE3DA" w:sz="4"/>
+              <w:right w:val="single" w:color="DBE3DA" w:sz="4"/>
+            </w:tcBorders>
+            <w:tcMar>
+              <w:top w:type="dxa" w:w="80"/>
+              <w:left w:type="dxa" w:w="120"/>
+              <w:bottom w:type="dxa" w:w="80"/>
+              <w:right w:type="dxa" w:w="120"/>
+            </w:tcMar>
+          </w:tcPr>
+          <w:p>
+            <w:pPr>
+              <w:spacing w:after="40" w:line="252"/>
+            </w:pPr>
+            <w:r>
+              <w:rPr>
+                <w:rFonts w:ascii="Arial" w:cs="Arial" w:eastAsia="Arial" w:hAnsi="Arial"/>
+                <w:sz w:val="19"/>
+                <w:szCs w:val="19"/>
+              </w:rPr>
+              <w:t xml:space="preserve">0</w:t>
+            </w:r>
+          </w:p>
+        </w:tc>
+      </w:tr>
+      <w:tr>
+        <w:trPr>
+          <w:cantSplit/>
+        </w:trPr>
+        <w:tc>
+          <w:tcPr>
+            <w:tcW w:type="dxa" w:w="1500"/>
+            <w:tcBorders>
+              <w:top w:val="single" w:color="DBE3DA" w:sz="4"/>
+              <w:left w:val="single" w:color="DBE3DA" w:sz="4"/>
+              <w:bottom w:val="single" w:color="DBE3DA" w:sz="4"/>
+              <w:right w:val="single" w:color="DBE3DA" w:sz="4"/>
+            </w:tcBorders>
+            <w:shd w:fill="FAFBF9" w:color="auto" w:val="clear"/>
+            <w:tcMar>
+              <w:top w:type="dxa" w:w="80"/>
+              <w:left w:type="dxa" w:w="120"/>
+              <w:bottom w:type="dxa" w:w="80"/>
+              <w:right w:type="dxa" w:w="120"/>
+            </w:tcMar>
+          </w:tcPr>
+          <w:p>
+            <w:pPr>
+              <w:spacing w:after="40" w:line="252"/>
+            </w:pPr>
+            <w:r>
+              <w:rPr>
+                <w:rFonts w:ascii="Arial" w:cs="Arial" w:eastAsia="Arial" w:hAnsi="Arial"/>
+                <w:sz w:val="19"/>
+                <w:szCs w:val="19"/>
+              </w:rPr>
+              <w:t xml:space="preserve">2 · Explore</w:t>
+            </w:r>
+          </w:p>
+        </w:tc>
+        <w:tc>
+          <w:tcPr>
+            <w:tcW w:type="dxa" w:w="1900"/>
+            <w:tcBorders>
+              <w:top w:val="single" w:color="DBE3DA" w:sz="4"/>
+              <w:left w:val="single" w:color="DBE3DA" w:sz="4"/>
+              <w:bottom w:val="single" w:color="DBE3DA" w:sz="4"/>
+              <w:right w:val="single" w:color="DBE3DA" w:sz="4"/>
+            </w:tcBorders>
+            <w:shd w:fill="FAFBF9" w:color="auto" w:val="clear"/>
+            <w:tcMar>
+              <w:top w:type="dxa" w:w="80"/>
+              <w:left w:type="dxa" w:w="120"/>
+              <w:bottom w:type="dxa" w:w="80"/>
+              <w:right w:type="dxa" w:w="120"/>
+            </w:tcMar>
+          </w:tcPr>
+          <w:p>
+            <w:pPr>
+              <w:spacing w:after="40" w:line="252"/>
+            </w:pPr>
+            <w:r>
+              <w:rPr>
+                <w:rFonts w:ascii="Arial" w:cs="Arial" w:eastAsia="Arial" w:hAnsi="Arial"/>
+                <w:sz w:val="19"/>
+                <w:szCs w:val="19"/>
+              </w:rPr>
+              <w:t xml:space="preserve">In the session</w:t>
+            </w:r>
+          </w:p>
+        </w:tc>
+        <w:tc>
+          <w:tcPr>
+            <w:tcW w:type="dxa" w:w="4426"/>
+            <w:tcBorders>
+              <w:top w:val="single" w:color="DBE3DA" w:sz="4"/>
+              <w:left w:val="single" w:color="DBE3DA" w:sz="4"/>
+              <w:bottom w:val="single" w:color="DBE3DA" w:sz="4"/>
+              <w:right w:val="single" w:color="DBE3DA" w:sz="4"/>
+            </w:tcBorders>
+            <w:shd w:fill="FAFBF9" w:color="auto" w:val="clear"/>
+            <w:tcMar>
+              <w:top w:type="dxa" w:w="80"/>
+              <w:left w:type="dxa" w:w="120"/>
+              <w:bottom w:type="dxa" w:w="80"/>
+              <w:right w:type="dxa" w:w="120"/>
+            </w:tcMar>
+          </w:tcPr>
+          <w:p>
+            <w:pPr>
+              <w:spacing w:after="40" w:line="252"/>
+            </w:pPr>
+            <w:r>
+              <w:rPr>
+                <w:rFonts w:ascii="Arial" w:cs="Arial" w:eastAsia="Arial" w:hAnsi="Arial"/>
+                <w:sz w:val="19"/>
+                <w:szCs w:val="19"/>
+              </w:rPr>
+              <w:t xml:space="preserve">Reverse-engineer each built stage with read-only prompts and verify the evidence yourself</w:t>
+            </w:r>
+          </w:p>
+        </w:tc>
+        <w:tc>
+          <w:tcPr>
+            <w:tcW w:type="dxa" w:w="1200"/>
+            <w:tcBorders>
+              <w:top w:val="single" w:color="DBE3DA" w:sz="4"/>
+              <w:left w:val="single" w:color="DBE3DA" w:sz="4"/>
+              <w:bottom w:val="single" w:color="DBE3DA" w:sz="4"/>
+              <w:right w:val="single" w:color="DBE3DA" w:sz="4"/>
+            </w:tcBorders>
+            <w:shd w:fill="FAFBF9" w:color="auto" w:val="clear"/>
+            <w:tcMar>
+              <w:top w:type="dxa" w:w="80"/>
+              <w:left w:type="dxa" w:w="120"/>
+              <w:bottom w:type="dxa" w:w="80"/>
+              <w:right w:type="dxa" w:w="120"/>
+            </w:tcMar>
+          </w:tcPr>
+          <w:p>
+            <w:pPr>
+              <w:spacing w:after="40" w:line="252"/>
+            </w:pPr>
+            <w:r>
+              <w:rPr>
+                <w:rFonts w:ascii="Arial" w:cs="Arial" w:eastAsia="Arial" w:hAnsi="Arial"/>
+                <w:sz w:val="19"/>
+                <w:szCs w:val="19"/>
+              </w:rPr>
+              <w:t xml:space="preserve">1–10</w:t>
+            </w:r>
+          </w:p>
+        </w:tc>
+      </w:tr>
+      <w:tr>
+        <w:trPr>
+          <w:cantSplit/>
+        </w:trPr>
+        <w:tc>
+          <w:tcPr>
+            <w:tcW w:type="dxa" w:w="1500"/>
+            <w:tcBorders>
+              <w:top w:val="single" w:color="DBE3DA" w:sz="4"/>
+              <w:left w:val="single" w:color="DBE3DA" w:sz="4"/>
+              <w:bottom w:val="single" w:color="DBE3DA" w:sz="4"/>
+              <w:right w:val="single" w:color="DBE3DA" w:sz="4"/>
+            </w:tcBorders>
+            <w:tcMar>
+              <w:top w:type="dxa" w:w="80"/>
+              <w:left w:type="dxa" w:w="120"/>
+              <w:bottom w:type="dxa" w:w="80"/>
+              <w:right w:type="dxa" w:w="120"/>
+            </w:tcMar>
+          </w:tcPr>
+          <w:p>
+            <w:pPr>
+              <w:spacing w:after="40" w:line="252"/>
+            </w:pPr>
+            <w:r>
+              <w:rPr>
+                <w:rFonts w:ascii="Arial" w:cs="Arial" w:eastAsia="Arial" w:hAnsi="Arial"/>
+                <w:sz w:val="19"/>
+                <w:szCs w:val="19"/>
+              </w:rPr>
+              <w:t xml:space="preserve">3 · Build</w:t>
+            </w:r>
+          </w:p>
+        </w:tc>
+        <w:tc>
+          <w:tcPr>
+            <w:tcW w:type="dxa" w:w="1900"/>
+            <w:tcBorders>
+              <w:top w:val="single" w:color="DBE3DA" w:sz="4"/>
+              <w:left w:val="single" w:color="DBE3DA" w:sz="4"/>
+              <w:bottom w:val="single" w:color="DBE3DA" w:sz="4"/>
+              <w:right w:val="single" w:color="DBE3DA" w:sz="4"/>
+            </w:tcBorders>
+            <w:tcMar>
+              <w:top w:type="dxa" w:w="80"/>
+              <w:left w:type="dxa" w:w="120"/>
+              <w:bottom w:type="dxa" w:w="80"/>
+              <w:right w:type="dxa" w:w="120"/>
+            </w:tcMar>
+          </w:tcPr>
+          <w:p>
+            <w:pPr>
+              <w:spacing w:after="40" w:line="252"/>
+            </w:pPr>
+            <w:r>
+              <w:rPr>
+                <w:rFonts w:ascii="Arial" w:cs="Arial" w:eastAsia="Arial" w:hAnsi="Arial"/>
+                <w:sz w:val="19"/>
+                <w:szCs w:val="19"/>
+              </w:rPr>
+              <w:t xml:space="preserve">In the session, then on your own</w:t>
+            </w:r>
+          </w:p>
+        </w:tc>
+        <w:tc>
+          <w:tcPr>
+            <w:tcW w:type="dxa" w:w="4426"/>
+            <w:tcBorders>
+              <w:top w:val="single" w:color="DBE3DA" w:sz="4"/>
+              <w:left w:val="single" w:color="DBE3DA" w:sz="4"/>
+              <w:bottom w:val="single" w:color="DBE3DA" w:sz="4"/>
+              <w:right w:val="single" w:color="DBE3DA" w:sz="4"/>
+            </w:tcBorders>
+            <w:tcMar>
+              <w:top w:type="dxa" w:w="80"/>
+              <w:left w:type="dxa" w:w="120"/>
+              <w:bottom w:type="dxa" w:w="80"/>
+              <w:right w:type="dxa" w:w="120"/>
+            </w:tcMar>
+          </w:tcPr>
+          <w:p>
+            <w:pPr>
+              <w:spacing w:after="40" w:line="252"/>
+            </w:pPr>
+            <w:r>
+              <w:rPr>
+                <w:rFonts w:ascii="Arial" w:cs="Arial" w:eastAsia="Arial" w:hAnsi="Arial"/>
+                <w:sz w:val="19"/>
+                <w:szCs w:val="19"/>
+              </w:rPr>
+              <w:t xml:space="preserve">Add new features on your own branches, with tests, and open pull requests on your fork</w:t>
+            </w:r>
+          </w:p>
+        </w:tc>
+        <w:tc>
+          <w:tcPr>
+            <w:tcW w:type="dxa" w:w="1200"/>
+            <w:tcBorders>
+              <w:top w:val="single" w:color="DBE3DA" w:sz="4"/>
+              <w:left w:val="single" w:color="DBE3DA" w:sz="4"/>
+              <w:bottom w:val="single" w:color="DBE3DA" w:sz="4"/>
+              <w:right w:val="single" w:color="DBE3DA" w:sz="4"/>
+            </w:tcBorders>
+            <w:tcMar>
+              <w:top w:type="dxa" w:w="80"/>
+              <w:left w:type="dxa" w:w="120"/>
+              <w:bottom w:type="dxa" w:w="80"/>
+              <w:right w:type="dxa" w:w="120"/>
+            </w:tcMar>
+          </w:tcPr>
+          <w:p>
+            <w:pPr>
+              <w:spacing w:after="40" w:line="252"/>
+            </w:pPr>
+            <w:r>
+              <w:rPr>
+                <w:rFonts w:ascii="Arial" w:cs="Arial" w:eastAsia="Arial" w:hAnsi="Arial"/>
+                <w:sz w:val="19"/>
+                <w:szCs w:val="19"/>
+              </w:rPr>
+              <w:t xml:space="preserve">11</w:t>
+            </w:r>
+          </w:p>
+        </w:tc>
+      </w:tr>
+      <w:tr>
+        <w:trPr>
+          <w:cantSplit/>
+        </w:trPr>
+        <w:tc>
+          <w:tcPr>
+            <w:tcW w:type="dxa" w:w="1500"/>
+            <w:tcBorders>
+              <w:top w:val="single" w:color="DBE3DA" w:sz="4"/>
+              <w:left w:val="single" w:color="DBE3DA" w:sz="4"/>
+              <w:bottom w:val="single" w:color="DBE3DA" w:sz="4"/>
+              <w:right w:val="single" w:color="DBE3DA" w:sz="4"/>
+            </w:tcBorders>
+            <w:shd w:fill="FAFBF9" w:color="auto" w:val="clear"/>
+            <w:tcMar>
+              <w:top w:type="dxa" w:w="80"/>
+              <w:left w:type="dxa" w:w="120"/>
+              <w:bottom w:type="dxa" w:w="80"/>
+              <w:right w:type="dxa" w:w="120"/>
+            </w:tcMar>
+          </w:tcPr>
+          <w:p>
+            <w:pPr>
+              <w:spacing w:after="40" w:line="252"/>
+            </w:pPr>
+            <w:r>
+              <w:rPr>
+                <w:rFonts w:ascii="Arial" w:cs="Arial" w:eastAsia="Arial" w:hAnsi="Arial"/>
+                <w:sz w:val="19"/>
+                <w:szCs w:val="19"/>
+              </w:rPr>
+              <w:t xml:space="preserve">4 · Go live</w:t>
+            </w:r>
+          </w:p>
+        </w:tc>
+        <w:tc>
+          <w:tcPr>
+            <w:tcW w:type="dxa" w:w="1900"/>
+            <w:tcBorders>
+              <w:top w:val="single" w:color="DBE3DA" w:sz="4"/>
+              <w:left w:val="single" w:color="DBE3DA" w:sz="4"/>
+              <w:bottom w:val="single" w:color="DBE3DA" w:sz="4"/>
+              <w:right w:val="single" w:color="DBE3DA" w:sz="4"/>
+            </w:tcBorders>
+            <w:shd w:fill="FAFBF9" w:color="auto" w:val="clear"/>
+            <w:tcMar>
+              <w:top w:type="dxa" w:w="80"/>
+              <w:left w:type="dxa" w:w="120"/>
+              <w:bottom w:type="dxa" w:w="80"/>
+              <w:right w:type="dxa" w:w="120"/>
+            </w:tcMar>
+          </w:tcPr>
+          <w:p>
+            <w:pPr>
+              <w:spacing w:after="40" w:line="252"/>
+            </w:pPr>
+            <w:r>
+              <w:rPr>
+                <w:rFonts w:ascii="Arial" w:cs="Arial" w:eastAsia="Arial" w:hAnsi="Arial"/>
+                <w:sz w:val="19"/>
+                <w:szCs w:val="19"/>
+              </w:rPr>
+              <w:t xml:space="preserve">End of the session</w:t>
+            </w:r>
+          </w:p>
+        </w:tc>
+        <w:tc>
+          <w:tcPr>
+            <w:tcW w:type="dxa" w:w="4426"/>
+            <w:tcBorders>
+              <w:top w:val="single" w:color="DBE3DA" w:sz="4"/>
+              <w:left w:val="single" w:color="DBE3DA" w:sz="4"/>
+              <w:bottom w:val="single" w:color="DBE3DA" w:sz="4"/>
+              <w:right w:val="single" w:color="DBE3DA" w:sz="4"/>
+            </w:tcBorders>
+            <w:shd w:fill="FAFBF9" w:color="auto" w:val="clear"/>
+            <w:tcMar>
+              <w:top w:type="dxa" w:w="80"/>
+              <w:left w:type="dxa" w:w="120"/>
+              <w:bottom w:type="dxa" w:w="80"/>
+              <w:right w:type="dxa" w:w="120"/>
+            </w:tcMar>
+          </w:tcPr>
+          <w:p>
+            <w:pPr>
+              <w:spacing w:after="40" w:line="252"/>
+            </w:pPr>
+            <w:r>
+              <w:rPr>
+                <w:rFonts w:ascii="Arial" w:cs="Arial" w:eastAsia="Arial" w:hAnsi="Arial"/>
+                <w:sz w:val="19"/>
+                <w:szCs w:val="19"/>
+              </w:rPr>
+              <w:t xml:space="preserve">See how the same code was deployed to AWS EC2, and explore the deploy scripts</w:t>
+            </w:r>
+          </w:p>
+        </w:tc>
+        <w:tc>
+          <w:tcPr>
+            <w:tcW w:type="dxa" w:w="1200"/>
+            <w:tcBorders>
+              <w:top w:val="single" w:color="DBE3DA" w:sz="4"/>
+              <w:left w:val="single" w:color="DBE3DA" w:sz="4"/>
+              <w:bottom w:val="single" w:color="DBE3DA" w:sz="4"/>
+              <w:right w:val="single" w:color="DBE3DA" w:sz="4"/>
+            </w:tcBorders>
+            <w:shd w:fill="FAFBF9" w:color="auto" w:val="clear"/>
+            <w:tcMar>
+              <w:top w:type="dxa" w:w="80"/>
+              <w:left w:type="dxa" w:w="120"/>
+              <w:bottom w:type="dxa" w:w="80"/>
+              <w:right w:type="dxa" w:w="120"/>
+            </w:tcMar>
+          </w:tcPr>
+          <w:p>
+            <w:pPr>
+              <w:spacing w:after="40" w:line="252"/>
+            </w:pPr>
+            <w:r>
+              <w:rPr>
+                <w:rFonts w:ascii="Arial" w:cs="Arial" w:eastAsia="Arial" w:hAnsi="Arial"/>
+                <w:sz w:val="19"/>
+                <w:szCs w:val="19"/>
+              </w:rPr>
+              <w:t xml:space="preserve">13</w:t>
+            </w:r>
+          </w:p>
+        </w:tc>
+      </w:tr>
+    </w:tbl>
+    <w:p>
+      <w:pPr>
+        <w:spacing w:after="80" w:before="0" w:line="276"/>
+      </w:pPr>
     </w:p>
     <w:p>
       <w:pPr>
@@ -444,7 +1237,7 @@
                 <w:sz w:val="19"/>
                 <w:szCs w:val="19"/>
               </w:rPr>
-              <w:t xml:space="preserve">Get the repository running on your machine</w:t>
+              <w:t xml:space="preserve">Fork the public repository and run it on your machine</w:t>
             </w:r>
           </w:p>
         </w:tc>
@@ -927,7 +1720,7 @@
                 <w:sz w:val="19"/>
                 <w:szCs w:val="19"/>
               </w:rPr>
-              <w:t xml:space="preserve">See how the app is deployed to AWS</w:t>
+              <w:t xml:space="preserve">See how the app went live on AWS EC2</w:t>
             </w:r>
           </w:p>
         </w:tc>
@@ -958,7 +1751,7 @@
                 <w:sz w:val="19"/>
                 <w:szCs w:val="19"/>
               </w:rPr>
-              <w:t xml:space="preserve">None (instructor demonstration)</w:t>
+              <w:t xml:space="preserve">Explore, then instructor demonstration</w:t>
             </w:r>
           </w:p>
         </w:tc>
@@ -2794,6 +3587,42 @@
     </w:p>
     <w:p>
       <w:pPr>
+        <w:pStyle w:val="Heading2"/>
+      </w:pPr>
+      <w:r>
+        <w:rPr>
+          <w:rFonts w:ascii="Arial" w:cs="Arial" w:eastAsia="Arial" w:hAnsi="Arial"/>
+        </w:rPr>
+        <w:t xml:space="preserve">0.5 Compare with the live app</w:t>
+      </w:r>
+    </w:p>
+    <w:p>
+      <w:pPr>
+        <w:spacing w:after="120" w:before="0" w:line="276"/>
+      </w:pPr>
+      <w:r>
+        <w:rPr>
+          <w:rFonts w:ascii="Arial" w:cs="Arial" w:eastAsia="Arial" w:hAnsi="Arial"/>
+        </w:rPr>
+        <w:t xml:space="preserve">The same code runs on the internet at </w:t>
+      </w:r>
+      <w:r>
+        <w:rPr>
+          <w:rFonts w:ascii="Arial" w:cs="Arial" w:eastAsia="Arial" w:hAnsi="Arial"/>
+          <w:b/>
+          <w:bCs/>
+        </w:rPr>
+        <w:t xml:space="preserve">https://campusly.13-127-195-244.sslip.io</w:t>
+      </w:r>
+      <w:r>
+        <w:rPr>
+          <w:rFonts w:ascii="Arial" w:cs="Arial" w:eastAsia="Arial" w:hAnsi="Arial"/>
+        </w:rPr>
+        <w:t xml:space="preserve">. Open it on your phone and sign in with the same account. Sign-up is closed there on purpose (it's a shared classroom demo), and the demo data is reset before each class. Your local copy is yours to change; the live one is not.</w:t>
+      </w:r>
+    </w:p>
+    <w:p>
+      <w:pPr>
         <w:pStyle w:val="Heading1"/>
         <w:pageBreakBefore/>
       </w:pPr>
@@ -3354,7 +4183,7 @@
                 <w:sz w:val="19"/>
                 <w:szCs w:val="19"/>
               </w:rPr>
-              <w:t xml:space="preserve">10 built: Part 8 · Deploy: Part 13</w:t>
+              <w:t xml:space="preserve">10 built: Part 8 · 11 built (live on EC2): Part 13</w:t>
             </w:r>
           </w:p>
         </w:tc>
@@ -4095,7 +4924,7 @@
                 <w:sz w:val="18"/>
                 <w:szCs w:val="18"/>
               </w:rPr>
-              <w:t xml:space="preserve">Explore prompt (Parts 0, 2–10)</w:t>
+              <w:t xml:space="preserve">Explore prompt (Parts 0, 2–10, 13)</w:t>
             </w:r>
           </w:p>
         </w:tc>
@@ -11445,7 +12274,7 @@
                 <w:sz w:val="19"/>
                 <w:szCs w:val="19"/>
               </w:rPr>
-              <w:t xml:space="preserve">Every change on GitHub runs: typecheck → lint → tests → browser tests → audit → secret scan</w:t>
+              <w:t xml:space="preserve">Every change on GitHub runs: typecheck → lint → tests → browser tests → audit → secret scan, and the latest run is green</w:t>
             </w:r>
           </w:p>
         </w:tc>
@@ -11475,7 +12304,25 @@
                 <w:sz w:val="17"/>
                 <w:szCs w:val="17"/>
               </w:rPr>
-              <w:t xml:space="preserve">.github/workflows/ci.yml</w:t>
+              <w:t xml:space="preserve">.github/workflows/ci.yml; the repository's </w:t>
+            </w:r>
+            <w:r>
+              <w:rPr>
+                <w:rFonts w:ascii="Arial" w:cs="Arial" w:eastAsia="Arial" w:hAnsi="Arial"/>
+                <w:b/>
+                <w:bCs/>
+                <w:sz w:val="17"/>
+                <w:szCs w:val="17"/>
+              </w:rPr>
+              <w:t xml:space="preserve">Actions</w:t>
+            </w:r>
+            <w:r>
+              <w:rPr>
+                <w:rFonts w:ascii="Arial" w:cs="Arial" w:eastAsia="Arial" w:hAnsi="Arial"/>
+                <w:sz w:val="17"/>
+                <w:szCs w:val="17"/>
+              </w:rPr>
+              <w:t xml:space="preserve"> tab</w:t>
             </w:r>
           </w:p>
         </w:tc>
@@ -11856,7 +12703,109 @@
                 <w:sz w:val="19"/>
                 <w:szCs w:val="19"/>
               </w:rPr>
-              <w:t xml:space="preserve">.</w:t>
+              <w:t xml:space="preserve">. Then open the </w:t>
+            </w:r>
+            <w:r>
+              <w:rPr>
+                <w:rFonts w:ascii="Arial" w:cs="Arial" w:eastAsia="Arial" w:hAnsi="Arial"/>
+                <w:b/>
+                <w:bCs/>
+                <w:sz w:val="19"/>
+                <w:szCs w:val="19"/>
+              </w:rPr>
+              <w:t xml:space="preserve">Actions</w:t>
+            </w:r>
+            <w:r>
+              <w:rPr>
+                <w:rFonts w:ascii="Arial" w:cs="Arial" w:eastAsia="Arial" w:hAnsi="Arial"/>
+                <w:sz w:val="19"/>
+                <w:szCs w:val="19"/>
+              </w:rPr>
+              <w:t xml:space="preserve"> tab of https://github.com/shivavashishtha/campusly: the latest run has a green tick.</w:t>
+            </w:r>
+          </w:p>
+        </w:tc>
+      </w:tr>
+    </w:tbl>
+    <w:p>
+      <w:pPr>
+        <w:spacing w:after="120" w:before="0" w:line="276"/>
+      </w:pPr>
+    </w:p>
+    <w:tbl>
+      <w:tblPr>
+        <w:tblW w:type="dxa" w:w="9026"/>
+        <w:tblBorders>
+          <w:top w:val="single" w:color="auto" w:sz="4"/>
+          <w:left w:val="single" w:color="auto" w:sz="4"/>
+          <w:bottom w:val="single" w:color="auto" w:sz="4"/>
+          <w:right w:val="single" w:color="auto" w:sz="4"/>
+          <w:insideH w:val="single" w:color="auto" w:sz="4"/>
+          <w:insideV w:val="single" w:color="auto" w:sz="4"/>
+        </w:tblBorders>
+        <w:tblLayout w:type="fixed"/>
+      </w:tblPr>
+      <w:tblGrid>
+        <w:gridCol w:w="9026"/>
+      </w:tblGrid>
+      <w:tr>
+        <w:tc>
+          <w:tcPr>
+            <w:tcW w:type="dxa" w:w="9026"/>
+            <w:tcBorders>
+              <w:top w:val="none" w:color="FFFFFF" w:sz="0"/>
+              <w:left w:val="none" w:color="FFFFFF" w:sz="0"/>
+              <w:bottom w:val="none" w:color="FFFFFF" w:sz="0"/>
+              <w:right w:val="none" w:color="FFFFFF" w:sz="0"/>
+            </w:tcBorders>
+            <w:shd w:fill="FCF0DC" w:color="auto" w:val="clear"/>
+            <w:tcMar>
+              <w:top w:type="dxa" w:w="80"/>
+              <w:left w:type="dxa" w:w="120"/>
+              <w:bottom w:type="dxa" w:w="80"/>
+              <w:right w:type="dxa" w:w="120"/>
+            </w:tcMar>
+          </w:tcPr>
+          <w:p>
+            <w:pPr>
+              <w:spacing w:after="20" w:line="252"/>
+            </w:pPr>
+            <w:r>
+              <w:rPr>
+                <w:rFonts w:ascii="Arial" w:cs="Arial" w:eastAsia="Arial" w:hAnsi="Arial"/>
+                <w:b/>
+                <w:bCs/>
+                <w:color w:val="8D4A06"/>
+                <w:sz w:val="19"/>
+                <w:szCs w:val="19"/>
+              </w:rPr>
+              <w:t xml:space="preserve">A REAL CI FAILURE FROM THIS BUILD  </w:t>
+            </w:r>
+            <w:r>
+              <w:rPr>
+                <w:rFonts w:ascii="Arial" w:cs="Arial" w:eastAsia="Arial" w:hAnsi="Arial"/>
+                <w:sz w:val="19"/>
+                <w:szCs w:val="19"/>
+              </w:rPr>
+              <w:t xml:space="preserve">For the first few pushes, every CI run failed in its first step and </w:t>
+            </w:r>
+            <w:r>
+              <w:rPr>
+                <w:rFonts w:ascii="Arial" w:cs="Arial" w:eastAsia="Arial" w:hAnsi="Arial"/>
+                <w:b/>
+                <w:bCs/>
+                <w:sz w:val="19"/>
+                <w:szCs w:val="19"/>
+              </w:rPr>
+              <w:t xml:space="preserve">no checks ran at all</w:t>
+            </w:r>
+            <w:r>
+              <w:rPr>
+                <w:rFonts w:ascii="Arial" w:cs="Arial" w:eastAsia="Arial" w:hAnsi="Arial"/>
+                <w:sz w:val="19"/>
+                <w:szCs w:val="19"/>
+              </w:rPr>
+              <w:t xml:space="preserve">: the pnpm version was written in two places (the workflow file and package.json), and the setup step refused to guess. The fix was deleting one line. Lesson: a red cross that nobody reads protects nothing. Check the Actions tab after you push.</w:t>
             </w:r>
           </w:p>
         </w:tc>
@@ -20448,7 +21397,7 @@
                 <w:sz w:val="19"/>
                 <w:szCs w:val="19"/>
               </w:rPr>
-              <w:t xml:space="preserve">Decisions, plan, decision journal, engineering guide, runbook, incident rules, notes</w:t>
+              <w:t xml:space="preserve">Decisions, plan, decision journal, engineering guide, runbook, incident rules, notes, deployment guide</w:t>
             </w:r>
           </w:p>
         </w:tc>
@@ -20478,7 +21427,7 @@
                 <w:sz w:val="17"/>
                 <w:szCs w:val="17"/>
               </w:rPr>
-              <w:t xml:space="preserve">docs/</w:t>
+              <w:t xml:space="preserve">docs/ (DEPLOY_AWS.md for the deployment)</w:t>
             </w:r>
           </w:p>
         </w:tc>
@@ -20543,7 +21492,102 @@
                 <w:sz w:val="19"/>
                 <w:szCs w:val="19"/>
               </w:rPr>
-              <w:t xml:space="preserve">One commit per stage, oldest first, starting with "Stage 1–2: research, decision journal…"</w:t>
+              <w:t xml:space="preserve">The server scripts</w:t>
+            </w:r>
+          </w:p>
+        </w:tc>
+        <w:tc>
+          <w:tcPr>
+            <w:tcW w:type="dxa" w:w="3226"/>
+            <w:tcBorders>
+              <w:top w:val="single" w:color="DBE3DA" w:sz="4"/>
+              <w:left w:val="single" w:color="DBE3DA" w:sz="4"/>
+              <w:bottom w:val="single" w:color="DBE3DA" w:sz="4"/>
+              <w:right w:val="single" w:color="DBE3DA" w:sz="4"/>
+            </w:tcBorders>
+            <w:tcMar>
+              <w:top w:type="dxa" w:w="80"/>
+              <w:left w:type="dxa" w:w="120"/>
+              <w:bottom w:type="dxa" w:w="80"/>
+              <w:right w:type="dxa" w:w="120"/>
+            </w:tcMar>
+          </w:tcPr>
+          <w:p>
+            <w:pPr>
+              <w:spacing w:after="40" w:line="252"/>
+            </w:pPr>
+            <w:r>
+              <w:rPr>
+                <w:rFonts w:ascii="Arial" w:cs="Arial" w:eastAsia="Arial" w:hAnsi="Arial"/>
+                <w:sz w:val="17"/>
+                <w:szCs w:val="17"/>
+              </w:rPr>
+              <w:t xml:space="preserve">deploy/</w:t>
+            </w:r>
+          </w:p>
+        </w:tc>
+      </w:tr>
+      <w:tr>
+        <w:trPr>
+          <w:cantSplit/>
+        </w:trPr>
+        <w:tc>
+          <w:tcPr>
+            <w:tcW w:type="dxa" w:w="500"/>
+            <w:tcBorders>
+              <w:top w:val="single" w:color="DBE3DA" w:sz="4"/>
+              <w:left w:val="single" w:color="DBE3DA" w:sz="4"/>
+              <w:bottom w:val="single" w:color="DBE3DA" w:sz="4"/>
+              <w:right w:val="single" w:color="DBE3DA" w:sz="4"/>
+            </w:tcBorders>
+            <w:tcMar>
+              <w:top w:type="dxa" w:w="80"/>
+              <w:left w:type="dxa" w:w="120"/>
+              <w:bottom w:type="dxa" w:w="80"/>
+              <w:right w:type="dxa" w:w="120"/>
+            </w:tcMar>
+          </w:tcPr>
+          <w:p>
+            <w:pPr>
+              <w:spacing w:after="40" w:line="252"/>
+            </w:pPr>
+            <w:r>
+              <w:rPr>
+                <w:rFonts w:ascii="Arial" w:cs="Arial" w:eastAsia="Arial" w:hAnsi="Arial"/>
+                <w:sz w:val="19"/>
+                <w:szCs w:val="19"/>
+              </w:rPr>
+              <w:t xml:space="preserve">☐</w:t>
+            </w:r>
+          </w:p>
+        </w:tc>
+        <w:tc>
+          <w:tcPr>
+            <w:tcW w:type="dxa" w:w="5300"/>
+            <w:tcBorders>
+              <w:top w:val="single" w:color="DBE3DA" w:sz="4"/>
+              <w:left w:val="single" w:color="DBE3DA" w:sz="4"/>
+              <w:bottom w:val="single" w:color="DBE3DA" w:sz="4"/>
+              <w:right w:val="single" w:color="DBE3DA" w:sz="4"/>
+            </w:tcBorders>
+            <w:tcMar>
+              <w:top w:type="dxa" w:w="80"/>
+              <w:left w:type="dxa" w:w="120"/>
+              <w:bottom w:type="dxa" w:w="80"/>
+              <w:right w:type="dxa" w:w="120"/>
+            </w:tcMar>
+          </w:tcPr>
+          <w:p>
+            <w:pPr>
+              <w:spacing w:after="40" w:line="252"/>
+            </w:pPr>
+            <w:r>
+              <w:rPr>
+                <w:rFonts w:ascii="Arial" w:cs="Arial" w:eastAsia="Arial" w:hAnsi="Arial"/>
+                <w:sz w:val="19"/>
+                <w:szCs w:val="19"/>
+              </w:rPr>
+              <w:t xml:space="preserve">One commit per stage, oldest first, starting with "Stage 1–2: research, decision journal…", then the deployment commits</w:t>
             </w:r>
           </w:p>
         </w:tc>
@@ -20761,6 +21805,24 @@
                 <w:szCs w:val="19"/>
               </w:rPr>
               <w:t xml:space="preserve">Stage 1–2: research, decision journal, locked decisions, phase-1 plan</w:t>
+            </w:r>
+            <w:r>
+              <w:rPr>
+                <w:rFonts w:ascii="Arial" w:cs="Arial" w:eastAsia="Arial" w:hAnsi="Arial"/>
+                <w:sz w:val="19"/>
+                <w:szCs w:val="19"/>
+              </w:rPr>
+              <w:t xml:space="preserve">. Your fork has exactly the same history as the original; GitHub shows </w:t>
+            </w:r>
+            <w:r>
+              <w:rPr>
+                <w:rFonts w:ascii="Arial" w:cs="Arial" w:eastAsia="Arial" w:hAnsi="Arial"/>
+                <w:i/>
+                <w:iCs/>
+                <w:sz w:val="19"/>
+                <w:szCs w:val="19"/>
+              </w:rPr>
+              <w:t xml:space="preserve">This branch is up to date with shivavashishtha/campusly:main</w:t>
             </w:r>
             <w:r>
               <w:rPr>
@@ -21069,7 +22131,21 @@
         <w:rPr>
           <w:rFonts w:ascii="Arial" w:cs="Arial" w:eastAsia="Arial" w:hAnsi="Arial"/>
         </w:rPr>
-        <w:t xml:space="preserve">Now you change the code. Every Build prompt follows the same five lines, and names the rules from Parts 2–8 that the new feature must respect.</w:t>
+        <w:t xml:space="preserve">Now you change the code, in </w:t>
+      </w:r>
+      <w:r>
+        <w:rPr>
+          <w:rFonts w:ascii="Arial" w:cs="Arial" w:eastAsia="Arial" w:hAnsi="Arial"/>
+          <w:b/>
+          <w:bCs/>
+        </w:rPr>
+        <w:t xml:space="preserve">your fork</w:t>
+      </w:r>
+      <w:r>
+        <w:rPr>
+          <w:rFonts w:ascii="Arial" w:cs="Arial" w:eastAsia="Arial" w:hAnsi="Arial"/>
+        </w:rPr>
+        <w:t xml:space="preserve">. Every Build prompt follows the same five lines, and names the rules from Parts 2–8 that the new feature must respect. Your changes never touch the instructor's repository or the live app.</w:t>
       </w:r>
     </w:p>
     <w:p>
@@ -22368,7 +23444,7 @@
                 <w:sz w:val="19"/>
                 <w:szCs w:val="19"/>
               </w:rPr>
-              <w:t xml:space="preserve">Campusly repository on a new feature branch; CLAUDE.md and the module pattern in docs/ENGINEERING_GUIDE.md apply.</w:t>
+              <w:t xml:space="preserve">My fork of the Campusly repository, on a new feature branch; CLAUDE.md and the module pattern in docs/ENGINEERING_GUIDE.md apply.</w:t>
             </w:r>
           </w:p>
         </w:tc>
@@ -22896,7 +23972,7 @@
                 <w:sz w:val="19"/>
                 <w:szCs w:val="19"/>
               </w:rPr>
-              <w:t xml:space="preserve">Campusly repository on a new feature branch; CLAUDE.md and the module pattern in docs/ENGINEERING_GUIDE.md apply.</w:t>
+              <w:t xml:space="preserve">My fork of the Campusly repository, on a new feature branch; CLAUDE.md and the module pattern in docs/ENGINEERING_GUIDE.md apply.</w:t>
             </w:r>
           </w:p>
         </w:tc>
@@ -23408,7 +24484,7 @@
                 <w:sz w:val="19"/>
                 <w:szCs w:val="19"/>
               </w:rPr>
-              <w:t xml:space="preserve">Campusly repository on a new feature branch; CLAUDE.md and the module pattern in docs/ENGINEERING_GUIDE.md apply.</w:t>
+              <w:t xml:space="preserve">My fork of the Campusly repository, on a new feature branch; CLAUDE.md and the module pattern in docs/ENGINEERING_GUIDE.md apply.</w:t>
             </w:r>
           </w:p>
         </w:tc>
@@ -23920,7 +24996,7 @@
                 <w:sz w:val="19"/>
                 <w:szCs w:val="19"/>
               </w:rPr>
-              <w:t xml:space="preserve">Campusly repository on a new feature branch; CLAUDE.md and the module pattern in docs/ENGINEERING_GUIDE.md apply.</w:t>
+              <w:t xml:space="preserve">My fork of the Campusly repository, on a new feature branch; CLAUDE.md and the module pattern in docs/ENGINEERING_GUIDE.md apply.</w:t>
             </w:r>
           </w:p>
         </w:tc>
@@ -24432,7 +25508,7 @@
                 <w:sz w:val="19"/>
                 <w:szCs w:val="19"/>
               </w:rPr>
-              <w:t xml:space="preserve">Campusly repository on a new feature branch; CLAUDE.md and the module pattern in docs/ENGINEERING_GUIDE.md apply.</w:t>
+              <w:t xml:space="preserve">My fork of the Campusly repository, on a new feature branch; CLAUDE.md and the module pattern in docs/ENGINEERING_GUIDE.md apply.</w:t>
             </w:r>
           </w:p>
         </w:tc>
@@ -24944,7 +26020,7 @@
                 <w:sz w:val="19"/>
                 <w:szCs w:val="19"/>
               </w:rPr>
-              <w:t xml:space="preserve">Campusly repository on a new feature branch; CLAUDE.md and the module pattern in docs/ENGINEERING_GUIDE.md apply.</w:t>
+              <w:t xml:space="preserve">My fork of the Campusly repository, on a new feature branch; CLAUDE.md and the module pattern in docs/ENGINEERING_GUIDE.md apply.</w:t>
             </w:r>
           </w:p>
         </w:tc>
@@ -25466,7 +26542,7 @@
                 <w:sz w:val="19"/>
                 <w:szCs w:val="19"/>
               </w:rPr>
-              <w:t xml:space="preserve">Campusly repository on a new feature branch; CLAUDE.md and the module pattern in docs/ENGINEERING_GUIDE.md apply.</w:t>
+              <w:t xml:space="preserve">My fork of the Campusly repository, on a new feature branch; CLAUDE.md and the module pattern in docs/ENGINEERING_GUIDE.md apply.</w:t>
             </w:r>
           </w:p>
         </w:tc>
@@ -25978,7 +27054,7 @@
                 <w:sz w:val="19"/>
                 <w:szCs w:val="19"/>
               </w:rPr>
-              <w:t xml:space="preserve">Campusly repository on a new feature branch; CLAUDE.md and the module pattern in docs/ENGINEERING_GUIDE.md apply.</w:t>
+              <w:t xml:space="preserve">My fork of the Campusly repository, on a new feature branch; CLAUDE.md and the module pattern in docs/ENGINEERING_GUIDE.md apply.</w:t>
             </w:r>
           </w:p>
         </w:tc>
@@ -27470,6 +28546,120 @@
                 <w:sz w:val="19"/>
                 <w:szCs w:val="19"/>
               </w:rPr>
+              <w:t xml:space="preserve">On the live app, </w:t>
+            </w:r>
+            <w:r>
+              <w:rPr>
+                <w:rFonts w:ascii="Arial" w:cs="Arial" w:eastAsia="Arial" w:hAnsi="Arial"/>
+                <w:i/>
+                <w:iCs/>
+                <w:sz w:val="19"/>
+                <w:szCs w:val="19"/>
+              </w:rPr>
+              <w:t xml:space="preserve">Create an account</w:t>
+            </w:r>
+            <w:r>
+              <w:rPr>
+                <w:rFonts w:ascii="Arial" w:cs="Arial" w:eastAsia="Arial" w:hAnsi="Arial"/>
+                <w:sz w:val="19"/>
+                <w:szCs w:val="19"/>
+              </w:rPr>
+              <w:t xml:space="preserve"> says sign-ups are closed</w:t>
+            </w:r>
+          </w:p>
+        </w:tc>
+        <w:tc>
+          <w:tcPr>
+            <w:tcW w:type="dxa" w:w="3013"/>
+            <w:tcBorders>
+              <w:top w:val="single" w:color="DBE3DA" w:sz="4"/>
+              <w:left w:val="single" w:color="DBE3DA" w:sz="4"/>
+              <w:bottom w:val="single" w:color="DBE3DA" w:sz="4"/>
+              <w:right w:val="single" w:color="DBE3DA" w:sz="4"/>
+            </w:tcBorders>
+            <w:tcMar>
+              <w:top w:type="dxa" w:w="80"/>
+              <w:left w:type="dxa" w:w="120"/>
+              <w:bottom w:type="dxa" w:w="80"/>
+              <w:right w:type="dxa" w:w="120"/>
+            </w:tcMar>
+          </w:tcPr>
+          <w:p>
+            <w:pPr>
+              <w:spacing w:after="40" w:line="252"/>
+            </w:pPr>
+            <w:r>
+              <w:rPr>
+                <w:rFonts w:ascii="Arial" w:cs="Arial" w:eastAsia="Arial" w:hAnsi="Arial"/>
+                <w:sz w:val="19"/>
+                <w:szCs w:val="19"/>
+              </w:rPr>
+              <w:t xml:space="preserve">The live app is a shared classroom demo (decision D-015)</w:t>
+            </w:r>
+          </w:p>
+        </w:tc>
+        <w:tc>
+          <w:tcPr>
+            <w:tcW w:type="dxa" w:w="3013"/>
+            <w:tcBorders>
+              <w:top w:val="single" w:color="DBE3DA" w:sz="4"/>
+              <w:left w:val="single" w:color="DBE3DA" w:sz="4"/>
+              <w:bottom w:val="single" w:color="DBE3DA" w:sz="4"/>
+              <w:right w:val="single" w:color="DBE3DA" w:sz="4"/>
+            </w:tcBorders>
+            <w:tcMar>
+              <w:top w:type="dxa" w:w="80"/>
+              <w:left w:type="dxa" w:w="120"/>
+              <w:bottom w:type="dxa" w:w="80"/>
+              <w:right w:type="dxa" w:w="120"/>
+            </w:tcMar>
+          </w:tcPr>
+          <w:p>
+            <w:pPr>
+              <w:spacing w:after="40" w:line="252"/>
+            </w:pPr>
+            <w:r>
+              <w:rPr>
+                <w:rFonts w:ascii="Arial" w:cs="Arial" w:eastAsia="Arial" w:hAnsi="Arial"/>
+                <w:sz w:val="19"/>
+                <w:szCs w:val="19"/>
+              </w:rPr>
+              <w:t xml:space="preserve">Sign in with a demo account; to try sign-up, use your local copy (emails appear at localhost:3000/dev/mail)</w:t>
+            </w:r>
+          </w:p>
+        </w:tc>
+      </w:tr>
+      <w:tr>
+        <w:trPr>
+          <w:cantSplit/>
+        </w:trPr>
+        <w:tc>
+          <w:tcPr>
+            <w:tcW w:type="dxa" w:w="3000"/>
+            <w:tcBorders>
+              <w:top w:val="single" w:color="DBE3DA" w:sz="4"/>
+              <w:left w:val="single" w:color="DBE3DA" w:sz="4"/>
+              <w:bottom w:val="single" w:color="DBE3DA" w:sz="4"/>
+              <w:right w:val="single" w:color="DBE3DA" w:sz="4"/>
+            </w:tcBorders>
+            <w:shd w:fill="FAFBF9" w:color="auto" w:val="clear"/>
+            <w:tcMar>
+              <w:top w:type="dxa" w:w="80"/>
+              <w:left w:type="dxa" w:w="120"/>
+              <w:bottom w:type="dxa" w:w="80"/>
+              <w:right w:type="dxa" w:w="120"/>
+            </w:tcMar>
+          </w:tcPr>
+          <w:p>
+            <w:pPr>
+              <w:spacing w:after="40" w:line="252"/>
+            </w:pPr>
+            <w:r>
+              <w:rPr>
+                <w:rFonts w:ascii="Arial" w:cs="Arial" w:eastAsia="Arial" w:hAnsi="Arial"/>
+                <w:sz w:val="19"/>
+                <w:szCs w:val="19"/>
+              </w:rPr>
               <w:t xml:space="preserve">You changed something by accident</w:t>
             </w:r>
           </w:p>
@@ -27483,6 +28673,7 @@
               <w:bottom w:val="single" w:color="DBE3DA" w:sz="4"/>
               <w:right w:val="single" w:color="DBE3DA" w:sz="4"/>
             </w:tcBorders>
+            <w:shd w:fill="FAFBF9" w:color="auto" w:val="clear"/>
             <w:tcMar>
               <w:top w:type="dxa" w:w="80"/>
               <w:left w:type="dxa" w:w="120"/>
@@ -27505,6 +28696,7 @@
               <w:bottom w:val="single" w:color="DBE3DA" w:sz="4"/>
               <w:right w:val="single" w:color="DBE3DA" w:sz="4"/>
             </w:tcBorders>
+            <w:shd w:fill="FAFBF9" w:color="auto" w:val="clear"/>
             <w:tcMar>
               <w:top w:type="dxa" w:w="80"/>
               <w:left w:type="dxa" w:w="120"/>
@@ -27552,7 +28744,7 @@
         <w:rPr>
           <w:rFonts w:ascii="Arial" w:cs="Arial" w:eastAsia="Arial" w:hAnsi="Arial"/>
         </w:rPr>
-        <w:t xml:space="preserve">Part 13 · Deploy to AWS EC2 (instructor demonstration)</w:t>
+        <w:t xml:space="preserve">Part 13 · Go live: deploy to AWS EC2</w:t>
       </w:r>
     </w:p>
     <w:p>
@@ -27563,7 +28755,7 @@
         <w:rPr>
           <w:rFonts w:ascii="Arial" w:cs="Arial" w:eastAsia="Arial" w:hAnsi="Arial"/>
         </w:rPr>
-        <w:t xml:space="preserve">You don't need an AWS account for this course. This part shows how the instructor put Campusly on an AWS EC2 server, with Claude doing the clicking through the Claude in Chrome extension. The result is live at https://campusly.13-127-195-244.sslip.io.</w:t>
+        <w:t xml:space="preserve">Playbook Stage 11. You don't need an AWS account for this course. First you explore the deploy scripts in the repository, exactly as in Parts 2–10. Then the instructor shows how Campusly was put on an AWS EC2 server, with Claude doing the clicking through the Claude in Chrome extension. The result is live at https://campusly.13-127-195-244.sslip.io.</w:t>
       </w:r>
     </w:p>
     <w:p>
@@ -27574,7 +28766,1340 @@
         <w:rPr>
           <w:rFonts w:ascii="Arial" w:cs="Arial" w:eastAsia="Arial" w:hAnsi="Arial"/>
         </w:rPr>
-        <w:t xml:space="preserve">13.1 Decisions</w:t>
+        <w:t xml:space="preserve">13.1 Explore prompt</w:t>
+      </w:r>
+    </w:p>
+    <w:tbl>
+      <w:tblPr>
+        <w:tblW w:type="dxa" w:w="9026"/>
+        <w:tblBorders>
+          <w:top w:val="single" w:color="auto" w:sz="4"/>
+          <w:left w:val="single" w:color="auto" w:sz="4"/>
+          <w:bottom w:val="single" w:color="auto" w:sz="4"/>
+          <w:right w:val="single" w:color="auto" w:sz="4"/>
+          <w:insideH w:val="single" w:color="auto" w:sz="4"/>
+          <w:insideV w:val="single" w:color="auto" w:sz="4"/>
+        </w:tblBorders>
+        <w:tblLayout w:type="fixed"/>
+      </w:tblPr>
+      <w:tblGrid>
+        <w:gridCol w:w="1600"/>
+        <w:gridCol w:w="7426"/>
+      </w:tblGrid>
+      <w:tr>
+        <w:tc>
+          <w:tcPr>
+            <w:tcW w:type="dxa" w:w="1600"/>
+            <w:tcBorders>
+              <w:top w:val="single" w:color="DBE3DA" w:sz="4"/>
+              <w:left w:val="single" w:color="DBE3DA" w:sz="4"/>
+              <w:bottom w:val="single" w:color="DBE3DA" w:sz="4"/>
+              <w:right w:val="single" w:color="DBE3DA" w:sz="4"/>
+            </w:tcBorders>
+            <w:shd w:fill="0B6E5F" w:color="auto" w:val="clear"/>
+            <w:tcMar>
+              <w:top w:type="dxa" w:w="80"/>
+              <w:left w:type="dxa" w:w="120"/>
+              <w:bottom w:type="dxa" w:w="80"/>
+              <w:right w:type="dxa" w:w="120"/>
+            </w:tcMar>
+          </w:tcPr>
+          <w:p>
+            <w:pPr>
+              <w:spacing w:after="40" w:line="252"/>
+            </w:pPr>
+            <w:r>
+              <w:rPr>
+                <w:rFonts w:ascii="Arial" w:cs="Arial" w:eastAsia="Arial" w:hAnsi="Arial"/>
+                <w:b/>
+                <w:bCs/>
+                <w:color w:val="FFFFFF"/>
+                <w:sz w:val="18"/>
+                <w:szCs w:val="18"/>
+              </w:rPr>
+              <w:t xml:space="preserve">EXPLORE PROMPT 13.1</w:t>
+            </w:r>
+          </w:p>
+        </w:tc>
+        <w:tc>
+          <w:tcPr>
+            <w:tcW w:type="dxa" w:w="7426"/>
+            <w:tcBorders>
+              <w:top w:val="single" w:color="DBE3DA" w:sz="4"/>
+              <w:left w:val="single" w:color="DBE3DA" w:sz="4"/>
+              <w:bottom w:val="single" w:color="DBE3DA" w:sz="4"/>
+              <w:right w:val="single" w:color="DBE3DA" w:sz="4"/>
+            </w:tcBorders>
+            <w:shd w:fill="0B6E5F" w:color="auto" w:val="clear"/>
+            <w:tcMar>
+              <w:top w:type="dxa" w:w="80"/>
+              <w:left w:type="dxa" w:w="120"/>
+              <w:bottom w:type="dxa" w:w="80"/>
+              <w:right w:type="dxa" w:w="120"/>
+            </w:tcMar>
+          </w:tcPr>
+          <w:p>
+            <w:pPr>
+              <w:spacing w:after="40" w:line="252"/>
+            </w:pPr>
+            <w:r>
+              <w:rPr>
+                <w:rFonts w:ascii="Arial" w:cs="Arial" w:eastAsia="Arial" w:hAnsi="Arial"/>
+                <w:b/>
+                <w:bCs/>
+                <w:color w:val="FFFFFF"/>
+                <w:sz w:val="19"/>
+                <w:szCs w:val="19"/>
+              </w:rPr>
+              <w:t xml:space="preserve">Explain how the server sets itself up</w:t>
+            </w:r>
+          </w:p>
+        </w:tc>
+      </w:tr>
+      <w:tr>
+        <w:trPr>
+          <w:cantSplit/>
+        </w:trPr>
+        <w:tc>
+          <w:tcPr>
+            <w:tcW w:type="dxa" w:w="1600"/>
+            <w:tcBorders>
+              <w:top w:val="single" w:color="DBE3DA" w:sz="4"/>
+              <w:left w:val="single" w:color="DBE3DA" w:sz="4"/>
+              <w:bottom w:val="single" w:color="DBE3DA" w:sz="4"/>
+              <w:right w:val="single" w:color="DBE3DA" w:sz="4"/>
+            </w:tcBorders>
+            <w:shd w:fill="E3F3EF" w:color="auto" w:val="clear"/>
+            <w:tcMar>
+              <w:top w:type="dxa" w:w="80"/>
+              <w:left w:type="dxa" w:w="120"/>
+              <w:bottom w:type="dxa" w:w="80"/>
+              <w:right w:type="dxa" w:w="120"/>
+            </w:tcMar>
+          </w:tcPr>
+          <w:p>
+            <w:pPr>
+              <w:spacing w:after="40" w:line="252"/>
+            </w:pPr>
+            <w:r>
+              <w:rPr>
+                <w:rFonts w:ascii="Arial" w:cs="Arial" w:eastAsia="Arial" w:hAnsi="Arial"/>
+                <w:b/>
+                <w:bCs/>
+                <w:sz w:val="19"/>
+                <w:szCs w:val="19"/>
+              </w:rPr>
+              <w:t xml:space="preserve">Context</w:t>
+            </w:r>
+          </w:p>
+        </w:tc>
+        <w:tc>
+          <w:tcPr>
+            <w:tcW w:type="dxa" w:w="7426"/>
+            <w:tcBorders>
+              <w:top w:val="single" w:color="DBE3DA" w:sz="4"/>
+              <w:left w:val="single" w:color="DBE3DA" w:sz="4"/>
+              <w:bottom w:val="single" w:color="DBE3DA" w:sz="4"/>
+              <w:right w:val="single" w:color="DBE3DA" w:sz="4"/>
+            </w:tcBorders>
+            <w:tcMar>
+              <w:top w:type="dxa" w:w="80"/>
+              <w:left w:type="dxa" w:w="120"/>
+              <w:bottom w:type="dxa" w:w="80"/>
+              <w:right w:type="dxa" w:w="120"/>
+            </w:tcMar>
+          </w:tcPr>
+          <w:p>
+            <w:pPr>
+              <w:spacing w:after="40" w:line="252"/>
+            </w:pPr>
+            <w:r>
+              <w:rPr>
+                <w:rFonts w:ascii="Arial" w:cs="Arial" w:eastAsia="Arial" w:hAnsi="Arial"/>
+                <w:sz w:val="19"/>
+                <w:szCs w:val="19"/>
+              </w:rPr>
+              <w:t xml:space="preserve">My fork of the Campusly repository; I am studying Stage 11 (Deploy).</w:t>
+            </w:r>
+          </w:p>
+        </w:tc>
+      </w:tr>
+      <w:tr>
+        <w:trPr>
+          <w:cantSplit/>
+        </w:trPr>
+        <w:tc>
+          <w:tcPr>
+            <w:tcW w:type="dxa" w:w="1600"/>
+            <w:tcBorders>
+              <w:top w:val="single" w:color="DBE3DA" w:sz="4"/>
+              <w:left w:val="single" w:color="DBE3DA" w:sz="4"/>
+              <w:bottom w:val="single" w:color="DBE3DA" w:sz="4"/>
+              <w:right w:val="single" w:color="DBE3DA" w:sz="4"/>
+            </w:tcBorders>
+            <w:shd w:fill="E3F3EF" w:color="auto" w:val="clear"/>
+            <w:tcMar>
+              <w:top w:type="dxa" w:w="80"/>
+              <w:left w:type="dxa" w:w="120"/>
+              <w:bottom w:type="dxa" w:w="80"/>
+              <w:right w:type="dxa" w:w="120"/>
+            </w:tcMar>
+          </w:tcPr>
+          <w:p>
+            <w:pPr>
+              <w:spacing w:after="40" w:line="252"/>
+            </w:pPr>
+            <w:r>
+              <w:rPr>
+                <w:rFonts w:ascii="Arial" w:cs="Arial" w:eastAsia="Arial" w:hAnsi="Arial"/>
+                <w:b/>
+                <w:bCs/>
+                <w:sz w:val="19"/>
+                <w:szCs w:val="19"/>
+              </w:rPr>
+              <w:t xml:space="preserve">Goal</w:t>
+            </w:r>
+          </w:p>
+        </w:tc>
+        <w:tc>
+          <w:tcPr>
+            <w:tcW w:type="dxa" w:w="7426"/>
+            <w:tcBorders>
+              <w:top w:val="single" w:color="DBE3DA" w:sz="4"/>
+              <w:left w:val="single" w:color="DBE3DA" w:sz="4"/>
+              <w:bottom w:val="single" w:color="DBE3DA" w:sz="4"/>
+              <w:right w:val="single" w:color="DBE3DA" w:sz="4"/>
+            </w:tcBorders>
+            <w:tcMar>
+              <w:top w:type="dxa" w:w="80"/>
+              <w:left w:type="dxa" w:w="120"/>
+              <w:bottom w:type="dxa" w:w="80"/>
+              <w:right w:type="dxa" w:w="120"/>
+            </w:tcMar>
+          </w:tcPr>
+          <w:p>
+            <w:pPr>
+              <w:spacing w:after="40" w:line="252"/>
+            </w:pPr>
+            <w:r>
+              <w:rPr>
+                <w:rFonts w:ascii="Arial" w:cs="Arial" w:eastAsia="Arial" w:hAnsi="Arial"/>
+                <w:sz w:val="19"/>
+                <w:szCs w:val="19"/>
+              </w:rPr>
+              <w:t xml:space="preserve">Explain, in order, what happens from the moment the EC2 server first boots until the site answers: which file runs first, what each script in deploy/ does, where the secret comes from, how the web address and HTTPS are set up, and how the site is updated later. Then list the deploy decisions and the mistakes recorded along the way.</w:t>
+            </w:r>
+          </w:p>
+        </w:tc>
+      </w:tr>
+      <w:tr>
+        <w:trPr>
+          <w:cantSplit/>
+        </w:trPr>
+        <w:tc>
+          <w:tcPr>
+            <w:tcW w:type="dxa" w:w="1600"/>
+            <w:tcBorders>
+              <w:top w:val="single" w:color="DBE3DA" w:sz="4"/>
+              <w:left w:val="single" w:color="DBE3DA" w:sz="4"/>
+              <w:bottom w:val="single" w:color="DBE3DA" w:sz="4"/>
+              <w:right w:val="single" w:color="DBE3DA" w:sz="4"/>
+            </w:tcBorders>
+            <w:shd w:fill="E3F3EF" w:color="auto" w:val="clear"/>
+            <w:tcMar>
+              <w:top w:type="dxa" w:w="80"/>
+              <w:left w:type="dxa" w:w="120"/>
+              <w:bottom w:type="dxa" w:w="80"/>
+              <w:right w:type="dxa" w:w="120"/>
+            </w:tcMar>
+          </w:tcPr>
+          <w:p>
+            <w:pPr>
+              <w:spacing w:after="40" w:line="252"/>
+            </w:pPr>
+            <w:r>
+              <w:rPr>
+                <w:rFonts w:ascii="Arial" w:cs="Arial" w:eastAsia="Arial" w:hAnsi="Arial"/>
+                <w:b/>
+                <w:bCs/>
+                <w:sz w:val="19"/>
+                <w:szCs w:val="19"/>
+              </w:rPr>
+              <w:t xml:space="preserve">Rules</w:t>
+            </w:r>
+          </w:p>
+        </w:tc>
+        <w:tc>
+          <w:tcPr>
+            <w:tcW w:type="dxa" w:w="7426"/>
+            <w:tcBorders>
+              <w:top w:val="single" w:color="DBE3DA" w:sz="4"/>
+              <w:left w:val="single" w:color="DBE3DA" w:sz="4"/>
+              <w:bottom w:val="single" w:color="DBE3DA" w:sz="4"/>
+              <w:right w:val="single" w:color="DBE3DA" w:sz="4"/>
+            </w:tcBorders>
+            <w:tcMar>
+              <w:top w:type="dxa" w:w="80"/>
+              <w:left w:type="dxa" w:w="120"/>
+              <w:bottom w:type="dxa" w:w="80"/>
+              <w:right w:type="dxa" w:w="120"/>
+            </w:tcMar>
+          </w:tcPr>
+          <w:p>
+            <w:pPr>
+              <w:spacing w:after="40" w:line="252"/>
+            </w:pPr>
+            <w:r>
+              <w:rPr>
+                <w:rFonts w:ascii="Arial" w:cs="Arial" w:eastAsia="Arial" w:hAnsi="Arial"/>
+                <w:sz w:val="19"/>
+                <w:szCs w:val="19"/>
+              </w:rPr>
+              <w:t xml:space="preserve">Only what the repository says; name the file for each step. PLAYBOOK §2.4 (the agent never handles accounts or secrets).</w:t>
+            </w:r>
+          </w:p>
+        </w:tc>
+      </w:tr>
+      <w:tr>
+        <w:trPr>
+          <w:cantSplit/>
+        </w:trPr>
+        <w:tc>
+          <w:tcPr>
+            <w:tcW w:type="dxa" w:w="1600"/>
+            <w:tcBorders>
+              <w:top w:val="single" w:color="DBE3DA" w:sz="4"/>
+              <w:left w:val="single" w:color="DBE3DA" w:sz="4"/>
+              <w:bottom w:val="single" w:color="DBE3DA" w:sz="4"/>
+              <w:right w:val="single" w:color="DBE3DA" w:sz="4"/>
+            </w:tcBorders>
+            <w:shd w:fill="E3F3EF" w:color="auto" w:val="clear"/>
+            <w:tcMar>
+              <w:top w:type="dxa" w:w="80"/>
+              <w:left w:type="dxa" w:w="120"/>
+              <w:bottom w:type="dxa" w:w="80"/>
+              <w:right w:type="dxa" w:w="120"/>
+            </w:tcMar>
+          </w:tcPr>
+          <w:p>
+            <w:pPr>
+              <w:spacing w:after="40" w:line="252"/>
+            </w:pPr>
+            <w:r>
+              <w:rPr>
+                <w:rFonts w:ascii="Arial" w:cs="Arial" w:eastAsia="Arial" w:hAnsi="Arial"/>
+                <w:b/>
+                <w:bCs/>
+                <w:sz w:val="19"/>
+                <w:szCs w:val="19"/>
+              </w:rPr>
+              <w:t xml:space="preserve">Constraints</w:t>
+            </w:r>
+          </w:p>
+        </w:tc>
+        <w:tc>
+          <w:tcPr>
+            <w:tcW w:type="dxa" w:w="7426"/>
+            <w:tcBorders>
+              <w:top w:val="single" w:color="DBE3DA" w:sz="4"/>
+              <w:left w:val="single" w:color="DBE3DA" w:sz="4"/>
+              <w:bottom w:val="single" w:color="DBE3DA" w:sz="4"/>
+              <w:right w:val="single" w:color="DBE3DA" w:sz="4"/>
+            </w:tcBorders>
+            <w:tcMar>
+              <w:top w:type="dxa" w:w="80"/>
+              <w:left w:type="dxa" w:w="120"/>
+              <w:bottom w:type="dxa" w:w="80"/>
+              <w:right w:type="dxa" w:w="120"/>
+            </w:tcMar>
+          </w:tcPr>
+          <w:p>
+            <w:pPr>
+              <w:spacing w:after="40" w:line="252"/>
+            </w:pPr>
+            <w:r>
+              <w:rPr>
+                <w:rFonts w:ascii="Arial" w:cs="Arial" w:eastAsia="Arial" w:hAnsi="Arial"/>
+                <w:sz w:val="19"/>
+                <w:szCs w:val="19"/>
+              </w:rPr>
+              <w:t xml:space="preserve">Do not change any files. Do not try to connect to any server.</w:t>
+            </w:r>
+          </w:p>
+        </w:tc>
+      </w:tr>
+      <w:tr>
+        <w:trPr>
+          <w:cantSplit/>
+        </w:trPr>
+        <w:tc>
+          <w:tcPr>
+            <w:tcW w:type="dxa" w:w="1600"/>
+            <w:tcBorders>
+              <w:top w:val="single" w:color="DBE3DA" w:sz="4"/>
+              <w:left w:val="single" w:color="DBE3DA" w:sz="4"/>
+              <w:bottom w:val="single" w:color="DBE3DA" w:sz="4"/>
+              <w:right w:val="single" w:color="DBE3DA" w:sz="4"/>
+            </w:tcBorders>
+            <w:shd w:fill="E3F3EF" w:color="auto" w:val="clear"/>
+            <w:tcMar>
+              <w:top w:type="dxa" w:w="80"/>
+              <w:left w:type="dxa" w:w="120"/>
+              <w:bottom w:type="dxa" w:w="80"/>
+              <w:right w:type="dxa" w:w="120"/>
+            </w:tcMar>
+          </w:tcPr>
+          <w:p>
+            <w:pPr>
+              <w:spacing w:after="40" w:line="252"/>
+            </w:pPr>
+            <w:r>
+              <w:rPr>
+                <w:rFonts w:ascii="Arial" w:cs="Arial" w:eastAsia="Arial" w:hAnsi="Arial"/>
+                <w:b/>
+                <w:bCs/>
+                <w:sz w:val="19"/>
+                <w:szCs w:val="19"/>
+              </w:rPr>
+              <w:t xml:space="preserve">Proof</w:t>
+            </w:r>
+          </w:p>
+        </w:tc>
+        <w:tc>
+          <w:tcPr>
+            <w:tcW w:type="dxa" w:w="7426"/>
+            <w:tcBorders>
+              <w:top w:val="single" w:color="DBE3DA" w:sz="4"/>
+              <w:left w:val="single" w:color="DBE3DA" w:sz="4"/>
+              <w:bottom w:val="single" w:color="DBE3DA" w:sz="4"/>
+              <w:right w:val="single" w:color="DBE3DA" w:sz="4"/>
+            </w:tcBorders>
+            <w:tcMar>
+              <w:top w:type="dxa" w:w="80"/>
+              <w:left w:type="dxa" w:w="120"/>
+              <w:bottom w:type="dxa" w:w="80"/>
+              <w:right w:type="dxa" w:w="120"/>
+            </w:tcMar>
+          </w:tcPr>
+          <w:p>
+            <w:pPr>
+              <w:spacing w:after="40" w:line="252"/>
+            </w:pPr>
+            <w:r>
+              <w:rPr>
+                <w:rFonts w:ascii="Arial" w:cs="Arial" w:eastAsia="Arial" w:hAnsi="Arial"/>
+                <w:sz w:val="19"/>
+                <w:szCs w:val="19"/>
+              </w:rPr>
+              <w:t xml:space="preserve">Your steps match docs/DEPLOY_AWS.md, and you name the line that makes the app run in demo mode.</w:t>
+            </w:r>
+          </w:p>
+        </w:tc>
+      </w:tr>
+      <w:tr>
+        <w:tc>
+          <w:tcPr>
+            <w:tcW w:type="dxa" w:w="1600"/>
+            <w:tcBorders>
+              <w:top w:val="single" w:color="DBE3DA" w:sz="4"/>
+              <w:left w:val="single" w:color="DBE3DA" w:sz="4"/>
+              <w:bottom w:val="single" w:color="DBE3DA" w:sz="4"/>
+              <w:right w:val="single" w:color="DBE3DA" w:sz="4"/>
+            </w:tcBorders>
+            <w:shd w:fill="E3F3EF" w:color="auto" w:val="clear"/>
+            <w:tcMar>
+              <w:top w:type="dxa" w:w="80"/>
+              <w:left w:type="dxa" w:w="120"/>
+              <w:bottom w:type="dxa" w:w="80"/>
+              <w:right w:type="dxa" w:w="120"/>
+            </w:tcMar>
+          </w:tcPr>
+          <w:p>
+            <w:pPr>
+              <w:spacing w:after="40" w:line="252"/>
+            </w:pPr>
+          </w:p>
+        </w:tc>
+        <w:tc>
+          <w:tcPr>
+            <w:tcW w:type="dxa" w:w="7426"/>
+            <w:tcBorders>
+              <w:top w:val="single" w:color="DBE3DA" w:sz="4"/>
+              <w:left w:val="single" w:color="DBE3DA" w:sz="4"/>
+              <w:bottom w:val="single" w:color="DBE3DA" w:sz="4"/>
+              <w:right w:val="single" w:color="DBE3DA" w:sz="4"/>
+            </w:tcBorders>
+            <w:tcMar>
+              <w:top w:type="dxa" w:w="80"/>
+              <w:left w:type="dxa" w:w="120"/>
+              <w:bottom w:type="dxa" w:w="80"/>
+              <w:right w:type="dxa" w:w="120"/>
+            </w:tcMar>
+          </w:tcPr>
+          <w:p>
+            <w:pPr>
+              <w:spacing w:after="40" w:line="252"/>
+            </w:pPr>
+            <w:r>
+              <w:rPr>
+                <w:rFonts w:ascii="Arial" w:cs="Arial" w:eastAsia="Arial" w:hAnsi="Arial"/>
+                <w:b/>
+                <w:bCs/>
+                <w:sz w:val="19"/>
+                <w:szCs w:val="19"/>
+              </w:rPr>
+              <w:t xml:space="preserve">Plan first.</w:t>
+            </w:r>
+          </w:p>
+        </w:tc>
+      </w:tr>
+    </w:tbl>
+    <w:p>
+      <w:pPr>
+        <w:spacing w:after="140" w:before="0" w:line="276"/>
+      </w:pPr>
+      <w:r>
+        <w:rPr>
+          <w:rFonts w:ascii="Arial" w:cs="Arial" w:eastAsia="Arial" w:hAnsi="Arial"/>
+          <w:i/>
+          <w:iCs/>
+          <w:color w:val="55635C"/>
+          <w:sz w:val="17"/>
+          <w:szCs w:val="17"/>
+        </w:rPr>
+        <w:t xml:space="preserve">Copy all five lines and "Plan first." into Claude Code as one message.</w:t>
+      </w:r>
+    </w:p>
+    <w:tbl>
+      <w:tblPr>
+        <w:tblW w:type="dxa" w:w="9026"/>
+        <w:tblBorders>
+          <w:top w:val="single" w:color="auto" w:sz="4"/>
+          <w:left w:val="single" w:color="auto" w:sz="4"/>
+          <w:bottom w:val="single" w:color="auto" w:sz="4"/>
+          <w:right w:val="single" w:color="auto" w:sz="4"/>
+          <w:insideH w:val="single" w:color="auto" w:sz="4"/>
+          <w:insideV w:val="single" w:color="auto" w:sz="4"/>
+        </w:tblBorders>
+        <w:tblLayout w:type="fixed"/>
+      </w:tblPr>
+      <w:tblGrid>
+        <w:gridCol w:w="500"/>
+        <w:gridCol w:w="5300"/>
+        <w:gridCol w:w="3226"/>
+      </w:tblGrid>
+      <w:tr>
+        <w:trPr>
+          <w:tblHeader/>
+        </w:trPr>
+        <w:tc>
+          <w:tcPr>
+            <w:tcW w:type="dxa" w:w="500"/>
+            <w:tcBorders>
+              <w:top w:val="single" w:color="DBE3DA" w:sz="4"/>
+              <w:left w:val="single" w:color="DBE3DA" w:sz="4"/>
+              <w:bottom w:val="single" w:color="DBE3DA" w:sz="4"/>
+              <w:right w:val="single" w:color="DBE3DA" w:sz="4"/>
+            </w:tcBorders>
+            <w:shd w:fill="0B6E5F" w:color="auto" w:val="clear"/>
+            <w:tcMar>
+              <w:top w:type="dxa" w:w="80"/>
+              <w:left w:type="dxa" w:w="120"/>
+              <w:bottom w:type="dxa" w:w="80"/>
+              <w:right w:type="dxa" w:w="120"/>
+            </w:tcMar>
+          </w:tcPr>
+          <w:p>
+            <w:pPr>
+              <w:spacing w:after="40" w:line="252"/>
+            </w:pPr>
+            <w:r>
+              <w:rPr>
+                <w:rFonts w:ascii="Arial" w:cs="Arial" w:eastAsia="Arial" w:hAnsi="Arial"/>
+                <w:b/>
+                <w:bCs/>
+                <w:color w:val="FFFFFF"/>
+                <w:sz w:val="19"/>
+                <w:szCs w:val="19"/>
+              </w:rPr>
+              <w:t xml:space="preserve">✓</w:t>
+            </w:r>
+          </w:p>
+        </w:tc>
+        <w:tc>
+          <w:tcPr>
+            <w:tcW w:type="dxa" w:w="5300"/>
+            <w:tcBorders>
+              <w:top w:val="single" w:color="DBE3DA" w:sz="4"/>
+              <w:left w:val="single" w:color="DBE3DA" w:sz="4"/>
+              <w:bottom w:val="single" w:color="DBE3DA" w:sz="4"/>
+              <w:right w:val="single" w:color="DBE3DA" w:sz="4"/>
+            </w:tcBorders>
+            <w:shd w:fill="0B6E5F" w:color="auto" w:val="clear"/>
+            <w:tcMar>
+              <w:top w:type="dxa" w:w="80"/>
+              <w:left w:type="dxa" w:w="120"/>
+              <w:bottom w:type="dxa" w:w="80"/>
+              <w:right w:type="dxa" w:w="120"/>
+            </w:tcMar>
+          </w:tcPr>
+          <w:p>
+            <w:pPr>
+              <w:spacing w:after="40" w:line="252"/>
+            </w:pPr>
+            <w:r>
+              <w:rPr>
+                <w:rFonts w:ascii="Arial" w:cs="Arial" w:eastAsia="Arial" w:hAnsi="Arial"/>
+                <w:b/>
+                <w:bCs/>
+                <w:color w:val="FFFFFF"/>
+                <w:sz w:val="18"/>
+                <w:szCs w:val="18"/>
+              </w:rPr>
+              <w:t xml:space="preserve">Claude should show you…</w:t>
+            </w:r>
+          </w:p>
+        </w:tc>
+        <w:tc>
+          <w:tcPr>
+            <w:tcW w:type="dxa" w:w="3226"/>
+            <w:tcBorders>
+              <w:top w:val="single" w:color="DBE3DA" w:sz="4"/>
+              <w:left w:val="single" w:color="DBE3DA" w:sz="4"/>
+              <w:bottom w:val="single" w:color="DBE3DA" w:sz="4"/>
+              <w:right w:val="single" w:color="DBE3DA" w:sz="4"/>
+            </w:tcBorders>
+            <w:shd w:fill="0B6E5F" w:color="auto" w:val="clear"/>
+            <w:tcMar>
+              <w:top w:type="dxa" w:w="80"/>
+              <w:left w:type="dxa" w:w="120"/>
+              <w:bottom w:type="dxa" w:w="80"/>
+              <w:right w:type="dxa" w:w="120"/>
+            </w:tcMar>
+          </w:tcPr>
+          <w:p>
+            <w:pPr>
+              <w:spacing w:after="40" w:line="252"/>
+            </w:pPr>
+            <w:r>
+              <w:rPr>
+                <w:rFonts w:ascii="Arial" w:cs="Arial" w:eastAsia="Arial" w:hAnsi="Arial"/>
+                <w:b/>
+                <w:bCs/>
+                <w:color w:val="FFFFFF"/>
+                <w:sz w:val="18"/>
+                <w:szCs w:val="18"/>
+              </w:rPr>
+              <w:t xml:space="preserve">Where it lives</w:t>
+            </w:r>
+          </w:p>
+        </w:tc>
+      </w:tr>
+      <w:tr>
+        <w:trPr>
+          <w:cantSplit/>
+        </w:trPr>
+        <w:tc>
+          <w:tcPr>
+            <w:tcW w:type="dxa" w:w="500"/>
+            <w:tcBorders>
+              <w:top w:val="single" w:color="DBE3DA" w:sz="4"/>
+              <w:left w:val="single" w:color="DBE3DA" w:sz="4"/>
+              <w:bottom w:val="single" w:color="DBE3DA" w:sz="4"/>
+              <w:right w:val="single" w:color="DBE3DA" w:sz="4"/>
+            </w:tcBorders>
+            <w:tcMar>
+              <w:top w:type="dxa" w:w="80"/>
+              <w:left w:type="dxa" w:w="120"/>
+              <w:bottom w:type="dxa" w:w="80"/>
+              <w:right w:type="dxa" w:w="120"/>
+            </w:tcMar>
+          </w:tcPr>
+          <w:p>
+            <w:pPr>
+              <w:spacing w:after="40" w:line="252"/>
+            </w:pPr>
+            <w:r>
+              <w:rPr>
+                <w:rFonts w:ascii="Arial" w:cs="Arial" w:eastAsia="Arial" w:hAnsi="Arial"/>
+                <w:sz w:val="19"/>
+                <w:szCs w:val="19"/>
+              </w:rPr>
+              <w:t xml:space="preserve">☐</w:t>
+            </w:r>
+          </w:p>
+        </w:tc>
+        <w:tc>
+          <w:tcPr>
+            <w:tcW w:type="dxa" w:w="5300"/>
+            <w:tcBorders>
+              <w:top w:val="single" w:color="DBE3DA" w:sz="4"/>
+              <w:left w:val="single" w:color="DBE3DA" w:sz="4"/>
+              <w:bottom w:val="single" w:color="DBE3DA" w:sz="4"/>
+              <w:right w:val="single" w:color="DBE3DA" w:sz="4"/>
+            </w:tcBorders>
+            <w:tcMar>
+              <w:top w:type="dxa" w:w="80"/>
+              <w:left w:type="dxa" w:w="120"/>
+              <w:bottom w:type="dxa" w:w="80"/>
+              <w:right w:type="dxa" w:w="120"/>
+            </w:tcMar>
+          </w:tcPr>
+          <w:p>
+            <w:pPr>
+              <w:spacing w:after="40" w:line="252"/>
+            </w:pPr>
+            <w:r>
+              <w:rPr>
+                <w:rFonts w:ascii="Arial" w:cs="Arial" w:eastAsia="Arial" w:hAnsi="Arial"/>
+                <w:sz w:val="19"/>
+                <w:szCs w:val="19"/>
+              </w:rPr>
+              <w:t xml:space="preserve">User data runs once on first boot: downloads the public repository, then runs the installer</w:t>
+            </w:r>
+          </w:p>
+        </w:tc>
+        <w:tc>
+          <w:tcPr>
+            <w:tcW w:type="dxa" w:w="3226"/>
+            <w:tcBorders>
+              <w:top w:val="single" w:color="DBE3DA" w:sz="4"/>
+              <w:left w:val="single" w:color="DBE3DA" w:sz="4"/>
+              <w:bottom w:val="single" w:color="DBE3DA" w:sz="4"/>
+              <w:right w:val="single" w:color="DBE3DA" w:sz="4"/>
+            </w:tcBorders>
+            <w:tcMar>
+              <w:top w:type="dxa" w:w="80"/>
+              <w:left w:type="dxa" w:w="120"/>
+              <w:bottom w:type="dxa" w:w="80"/>
+              <w:right w:type="dxa" w:w="120"/>
+            </w:tcMar>
+          </w:tcPr>
+          <w:p>
+            <w:pPr>
+              <w:spacing w:after="40" w:line="252"/>
+            </w:pPr>
+            <w:r>
+              <w:rPr>
+                <w:rFonts w:ascii="Arial" w:cs="Arial" w:eastAsia="Arial" w:hAnsi="Arial"/>
+                <w:sz w:val="17"/>
+                <w:szCs w:val="17"/>
+              </w:rPr>
+              <w:t xml:space="preserve">deploy/ec2-user-data.sh</w:t>
+            </w:r>
+          </w:p>
+        </w:tc>
+      </w:tr>
+      <w:tr>
+        <w:trPr>
+          <w:cantSplit/>
+        </w:trPr>
+        <w:tc>
+          <w:tcPr>
+            <w:tcW w:type="dxa" w:w="500"/>
+            <w:tcBorders>
+              <w:top w:val="single" w:color="DBE3DA" w:sz="4"/>
+              <w:left w:val="single" w:color="DBE3DA" w:sz="4"/>
+              <w:bottom w:val="single" w:color="DBE3DA" w:sz="4"/>
+              <w:right w:val="single" w:color="DBE3DA" w:sz="4"/>
+            </w:tcBorders>
+            <w:tcMar>
+              <w:top w:type="dxa" w:w="80"/>
+              <w:left w:type="dxa" w:w="120"/>
+              <w:bottom w:type="dxa" w:w="80"/>
+              <w:right w:type="dxa" w:w="120"/>
+            </w:tcMar>
+          </w:tcPr>
+          <w:p>
+            <w:pPr>
+              <w:spacing w:after="40" w:line="252"/>
+            </w:pPr>
+            <w:r>
+              <w:rPr>
+                <w:rFonts w:ascii="Arial" w:cs="Arial" w:eastAsia="Arial" w:hAnsi="Arial"/>
+                <w:sz w:val="19"/>
+                <w:szCs w:val="19"/>
+              </w:rPr>
+              <w:t xml:space="preserve">☐</w:t>
+            </w:r>
+          </w:p>
+        </w:tc>
+        <w:tc>
+          <w:tcPr>
+            <w:tcW w:type="dxa" w:w="5300"/>
+            <w:tcBorders>
+              <w:top w:val="single" w:color="DBE3DA" w:sz="4"/>
+              <w:left w:val="single" w:color="DBE3DA" w:sz="4"/>
+              <w:bottom w:val="single" w:color="DBE3DA" w:sz="4"/>
+              <w:right w:val="single" w:color="DBE3DA" w:sz="4"/>
+            </w:tcBorders>
+            <w:tcMar>
+              <w:top w:type="dxa" w:w="80"/>
+              <w:left w:type="dxa" w:w="120"/>
+              <w:bottom w:type="dxa" w:w="80"/>
+              <w:right w:type="dxa" w:w="120"/>
+            </w:tcMar>
+          </w:tcPr>
+          <w:p>
+            <w:pPr>
+              <w:spacing w:after="40" w:line="252"/>
+            </w:pPr>
+            <w:r>
+              <w:rPr>
+                <w:rFonts w:ascii="Arial" w:cs="Arial" w:eastAsia="Arial" w:hAnsi="Arial"/>
+                <w:sz w:val="19"/>
+                <w:szCs w:val="19"/>
+              </w:rPr>
+              <w:t xml:space="preserve">The installer: swap memory, Node.js 22, Caddy, an app user, a secret generated </w:t>
+            </w:r>
+            <w:r>
+              <w:rPr>
+                <w:rFonts w:ascii="Arial" w:cs="Arial" w:eastAsia="Arial" w:hAnsi="Arial"/>
+                <w:b/>
+                <w:bCs/>
+                <w:sz w:val="19"/>
+                <w:szCs w:val="19"/>
+              </w:rPr>
+              <w:t xml:space="preserve">on the server</w:t>
+            </w:r>
+            <w:r>
+              <w:rPr>
+                <w:rFonts w:ascii="Arial" w:cs="Arial" w:eastAsia="Arial" w:hAnsi="Arial"/>
+                <w:sz w:val="19"/>
+                <w:szCs w:val="19"/>
+              </w:rPr>
+              <w:t xml:space="preserve">, seed, build, start</w:t>
+            </w:r>
+          </w:p>
+        </w:tc>
+        <w:tc>
+          <w:tcPr>
+            <w:tcW w:type="dxa" w:w="3226"/>
+            <w:tcBorders>
+              <w:top w:val="single" w:color="DBE3DA" w:sz="4"/>
+              <w:left w:val="single" w:color="DBE3DA" w:sz="4"/>
+              <w:bottom w:val="single" w:color="DBE3DA" w:sz="4"/>
+              <w:right w:val="single" w:color="DBE3DA" w:sz="4"/>
+            </w:tcBorders>
+            <w:tcMar>
+              <w:top w:type="dxa" w:w="80"/>
+              <w:left w:type="dxa" w:w="120"/>
+              <w:bottom w:type="dxa" w:w="80"/>
+              <w:right w:type="dxa" w:w="120"/>
+            </w:tcMar>
+          </w:tcPr>
+          <w:p>
+            <w:pPr>
+              <w:spacing w:after="40" w:line="252"/>
+            </w:pPr>
+            <w:r>
+              <w:rPr>
+                <w:rFonts w:ascii="Arial" w:cs="Arial" w:eastAsia="Arial" w:hAnsi="Arial"/>
+                <w:sz w:val="17"/>
+                <w:szCs w:val="17"/>
+              </w:rPr>
+              <w:t xml:space="preserve">deploy/install.sh</w:t>
+            </w:r>
+          </w:p>
+        </w:tc>
+      </w:tr>
+      <w:tr>
+        <w:trPr>
+          <w:cantSplit/>
+        </w:trPr>
+        <w:tc>
+          <w:tcPr>
+            <w:tcW w:type="dxa" w:w="500"/>
+            <w:tcBorders>
+              <w:top w:val="single" w:color="DBE3DA" w:sz="4"/>
+              <w:left w:val="single" w:color="DBE3DA" w:sz="4"/>
+              <w:bottom w:val="single" w:color="DBE3DA" w:sz="4"/>
+              <w:right w:val="single" w:color="DBE3DA" w:sz="4"/>
+            </w:tcBorders>
+            <w:tcMar>
+              <w:top w:type="dxa" w:w="80"/>
+              <w:left w:type="dxa" w:w="120"/>
+              <w:bottom w:type="dxa" w:w="80"/>
+              <w:right w:type="dxa" w:w="120"/>
+            </w:tcMar>
+          </w:tcPr>
+          <w:p>
+            <w:pPr>
+              <w:spacing w:after="40" w:line="252"/>
+            </w:pPr>
+            <w:r>
+              <w:rPr>
+                <w:rFonts w:ascii="Arial" w:cs="Arial" w:eastAsia="Arial" w:hAnsi="Arial"/>
+                <w:sz w:val="19"/>
+                <w:szCs w:val="19"/>
+              </w:rPr>
+              <w:t xml:space="preserve">☐</w:t>
+            </w:r>
+          </w:p>
+        </w:tc>
+        <w:tc>
+          <w:tcPr>
+            <w:tcW w:type="dxa" w:w="5300"/>
+            <w:tcBorders>
+              <w:top w:val="single" w:color="DBE3DA" w:sz="4"/>
+              <w:left w:val="single" w:color="DBE3DA" w:sz="4"/>
+              <w:bottom w:val="single" w:color="DBE3DA" w:sz="4"/>
+              <w:right w:val="single" w:color="DBE3DA" w:sz="4"/>
+            </w:tcBorders>
+            <w:tcMar>
+              <w:top w:type="dxa" w:w="80"/>
+              <w:left w:type="dxa" w:w="120"/>
+              <w:bottom w:type="dxa" w:w="80"/>
+              <w:right w:type="dxa" w:w="120"/>
+            </w:tcMar>
+          </w:tcPr>
+          <w:p>
+            <w:pPr>
+              <w:spacing w:after="40" w:line="252"/>
+            </w:pPr>
+            <w:r>
+              <w:rPr>
+                <w:rFonts w:ascii="Arial" w:cs="Arial" w:eastAsia="Arial" w:hAnsi="Arial"/>
+                <w:sz w:val="19"/>
+                <w:szCs w:val="19"/>
+              </w:rPr>
+              <w:t xml:space="preserve">Every boot: the address campusly.&lt;ip-with-dashes&gt;.sslip.io, the settings file (including DEMO_MODE=1) and HTTPS</w:t>
+            </w:r>
+          </w:p>
+        </w:tc>
+        <w:tc>
+          <w:tcPr>
+            <w:tcW w:type="dxa" w:w="3226"/>
+            <w:tcBorders>
+              <w:top w:val="single" w:color="DBE3DA" w:sz="4"/>
+              <w:left w:val="single" w:color="DBE3DA" w:sz="4"/>
+              <w:bottom w:val="single" w:color="DBE3DA" w:sz="4"/>
+              <w:right w:val="single" w:color="DBE3DA" w:sz="4"/>
+            </w:tcBorders>
+            <w:tcMar>
+              <w:top w:type="dxa" w:w="80"/>
+              <w:left w:type="dxa" w:w="120"/>
+              <w:bottom w:type="dxa" w:w="80"/>
+              <w:right w:type="dxa" w:w="120"/>
+            </w:tcMar>
+          </w:tcPr>
+          <w:p>
+            <w:pPr>
+              <w:spacing w:after="40" w:line="252"/>
+            </w:pPr>
+            <w:r>
+              <w:rPr>
+                <w:rFonts w:ascii="Arial" w:cs="Arial" w:eastAsia="Arial" w:hAnsi="Arial"/>
+                <w:sz w:val="17"/>
+                <w:szCs w:val="17"/>
+              </w:rPr>
+              <w:t xml:space="preserve">deploy/configure.sh</w:t>
+            </w:r>
+          </w:p>
+        </w:tc>
+      </w:tr>
+      <w:tr>
+        <w:trPr>
+          <w:cantSplit/>
+        </w:trPr>
+        <w:tc>
+          <w:tcPr>
+            <w:tcW w:type="dxa" w:w="500"/>
+            <w:tcBorders>
+              <w:top w:val="single" w:color="DBE3DA" w:sz="4"/>
+              <w:left w:val="single" w:color="DBE3DA" w:sz="4"/>
+              <w:bottom w:val="single" w:color="DBE3DA" w:sz="4"/>
+              <w:right w:val="single" w:color="DBE3DA" w:sz="4"/>
+            </w:tcBorders>
+            <w:tcMar>
+              <w:top w:type="dxa" w:w="80"/>
+              <w:left w:type="dxa" w:w="120"/>
+              <w:bottom w:type="dxa" w:w="80"/>
+              <w:right w:type="dxa" w:w="120"/>
+            </w:tcMar>
+          </w:tcPr>
+          <w:p>
+            <w:pPr>
+              <w:spacing w:after="40" w:line="252"/>
+            </w:pPr>
+            <w:r>
+              <w:rPr>
+                <w:rFonts w:ascii="Arial" w:cs="Arial" w:eastAsia="Arial" w:hAnsi="Arial"/>
+                <w:sz w:val="19"/>
+                <w:szCs w:val="19"/>
+              </w:rPr>
+              <w:t xml:space="preserve">☐</w:t>
+            </w:r>
+          </w:p>
+        </w:tc>
+        <w:tc>
+          <w:tcPr>
+            <w:tcW w:type="dxa" w:w="5300"/>
+            <w:tcBorders>
+              <w:top w:val="single" w:color="DBE3DA" w:sz="4"/>
+              <w:left w:val="single" w:color="DBE3DA" w:sz="4"/>
+              <w:bottom w:val="single" w:color="DBE3DA" w:sz="4"/>
+              <w:right w:val="single" w:color="DBE3DA" w:sz="4"/>
+            </w:tcBorders>
+            <w:tcMar>
+              <w:top w:type="dxa" w:w="80"/>
+              <w:left w:type="dxa" w:w="120"/>
+              <w:bottom w:type="dxa" w:w="80"/>
+              <w:right w:type="dxa" w:w="120"/>
+            </w:tcMar>
+          </w:tcPr>
+          <w:p>
+            <w:pPr>
+              <w:spacing w:after="40" w:line="252"/>
+            </w:pPr>
+            <w:r>
+              <w:rPr>
+                <w:rFonts w:ascii="Arial" w:cs="Arial" w:eastAsia="Arial" w:hAnsi="Arial"/>
+                <w:sz w:val="19"/>
+                <w:szCs w:val="19"/>
+              </w:rPr>
+              <w:t xml:space="preserve">The app restarts by itself if it crashes</w:t>
+            </w:r>
+          </w:p>
+        </w:tc>
+        <w:tc>
+          <w:tcPr>
+            <w:tcW w:type="dxa" w:w="3226"/>
+            <w:tcBorders>
+              <w:top w:val="single" w:color="DBE3DA" w:sz="4"/>
+              <w:left w:val="single" w:color="DBE3DA" w:sz="4"/>
+              <w:bottom w:val="single" w:color="DBE3DA" w:sz="4"/>
+              <w:right w:val="single" w:color="DBE3DA" w:sz="4"/>
+            </w:tcBorders>
+            <w:tcMar>
+              <w:top w:type="dxa" w:w="80"/>
+              <w:left w:type="dxa" w:w="120"/>
+              <w:bottom w:type="dxa" w:w="80"/>
+              <w:right w:type="dxa" w:w="120"/>
+            </w:tcMar>
+          </w:tcPr>
+          <w:p>
+            <w:pPr>
+              <w:spacing w:after="40" w:line="252"/>
+            </w:pPr>
+            <w:r>
+              <w:rPr>
+                <w:rFonts w:ascii="Arial" w:cs="Arial" w:eastAsia="Arial" w:hAnsi="Arial"/>
+                <w:sz w:val="17"/>
+                <w:szCs w:val="17"/>
+              </w:rPr>
+              <w:t xml:space="preserve">deploy/campusly.service</w:t>
+            </w:r>
+          </w:p>
+        </w:tc>
+      </w:tr>
+      <w:tr>
+        <w:trPr>
+          <w:cantSplit/>
+        </w:trPr>
+        <w:tc>
+          <w:tcPr>
+            <w:tcW w:type="dxa" w:w="500"/>
+            <w:tcBorders>
+              <w:top w:val="single" w:color="DBE3DA" w:sz="4"/>
+              <w:left w:val="single" w:color="DBE3DA" w:sz="4"/>
+              <w:bottom w:val="single" w:color="DBE3DA" w:sz="4"/>
+              <w:right w:val="single" w:color="DBE3DA" w:sz="4"/>
+            </w:tcBorders>
+            <w:tcMar>
+              <w:top w:type="dxa" w:w="80"/>
+              <w:left w:type="dxa" w:w="120"/>
+              <w:bottom w:type="dxa" w:w="80"/>
+              <w:right w:type="dxa" w:w="120"/>
+            </w:tcMar>
+          </w:tcPr>
+          <w:p>
+            <w:pPr>
+              <w:spacing w:after="40" w:line="252"/>
+            </w:pPr>
+            <w:r>
+              <w:rPr>
+                <w:rFonts w:ascii="Arial" w:cs="Arial" w:eastAsia="Arial" w:hAnsi="Arial"/>
+                <w:sz w:val="19"/>
+                <w:szCs w:val="19"/>
+              </w:rPr>
+              <w:t xml:space="preserve">☐</w:t>
+            </w:r>
+          </w:p>
+        </w:tc>
+        <w:tc>
+          <w:tcPr>
+            <w:tcW w:type="dxa" w:w="5300"/>
+            <w:tcBorders>
+              <w:top w:val="single" w:color="DBE3DA" w:sz="4"/>
+              <w:left w:val="single" w:color="DBE3DA" w:sz="4"/>
+              <w:bottom w:val="single" w:color="DBE3DA" w:sz="4"/>
+              <w:right w:val="single" w:color="DBE3DA" w:sz="4"/>
+            </w:tcBorders>
+            <w:tcMar>
+              <w:top w:type="dxa" w:w="80"/>
+              <w:left w:type="dxa" w:w="120"/>
+              <w:bottom w:type="dxa" w:w="80"/>
+              <w:right w:type="dxa" w:w="120"/>
+            </w:tcMar>
+          </w:tcPr>
+          <w:p>
+            <w:pPr>
+              <w:spacing w:after="40" w:line="252"/>
+            </w:pPr>
+            <w:r>
+              <w:rPr>
+                <w:rFonts w:ascii="Arial" w:cs="Arial" w:eastAsia="Arial" w:hAnsi="Arial"/>
+                <w:sz w:val="19"/>
+                <w:szCs w:val="19"/>
+              </w:rPr>
+              <w:t xml:space="preserve">Updating and resetting the live app: sudo campusly-update, sudo campusly-reset-demo</w:t>
+            </w:r>
+          </w:p>
+        </w:tc>
+        <w:tc>
+          <w:tcPr>
+            <w:tcW w:type="dxa" w:w="3226"/>
+            <w:tcBorders>
+              <w:top w:val="single" w:color="DBE3DA" w:sz="4"/>
+              <w:left w:val="single" w:color="DBE3DA" w:sz="4"/>
+              <w:bottom w:val="single" w:color="DBE3DA" w:sz="4"/>
+              <w:right w:val="single" w:color="DBE3DA" w:sz="4"/>
+            </w:tcBorders>
+            <w:tcMar>
+              <w:top w:type="dxa" w:w="80"/>
+              <w:left w:type="dxa" w:w="120"/>
+              <w:bottom w:type="dxa" w:w="80"/>
+              <w:right w:type="dxa" w:w="120"/>
+            </w:tcMar>
+          </w:tcPr>
+          <w:p>
+            <w:pPr>
+              <w:spacing w:after="40" w:line="252"/>
+            </w:pPr>
+            <w:r>
+              <w:rPr>
+                <w:rFonts w:ascii="Arial" w:cs="Arial" w:eastAsia="Arial" w:hAnsi="Arial"/>
+                <w:sz w:val="17"/>
+                <w:szCs w:val="17"/>
+              </w:rPr>
+              <w:t xml:space="preserve">deploy/update.sh, deploy/reset-demo.sh</w:t>
+            </w:r>
+          </w:p>
+        </w:tc>
+      </w:tr>
+      <w:tr>
+        <w:trPr>
+          <w:cantSplit/>
+        </w:trPr>
+        <w:tc>
+          <w:tcPr>
+            <w:tcW w:type="dxa" w:w="500"/>
+            <w:tcBorders>
+              <w:top w:val="single" w:color="DBE3DA" w:sz="4"/>
+              <w:left w:val="single" w:color="DBE3DA" w:sz="4"/>
+              <w:bottom w:val="single" w:color="DBE3DA" w:sz="4"/>
+              <w:right w:val="single" w:color="DBE3DA" w:sz="4"/>
+            </w:tcBorders>
+            <w:tcMar>
+              <w:top w:type="dxa" w:w="80"/>
+              <w:left w:type="dxa" w:w="120"/>
+              <w:bottom w:type="dxa" w:w="80"/>
+              <w:right w:type="dxa" w:w="120"/>
+            </w:tcMar>
+          </w:tcPr>
+          <w:p>
+            <w:pPr>
+              <w:spacing w:after="40" w:line="252"/>
+            </w:pPr>
+            <w:r>
+              <w:rPr>
+                <w:rFonts w:ascii="Arial" w:cs="Arial" w:eastAsia="Arial" w:hAnsi="Arial"/>
+                <w:sz w:val="19"/>
+                <w:szCs w:val="19"/>
+              </w:rPr>
+              <w:t xml:space="preserve">☐</w:t>
+            </w:r>
+          </w:p>
+        </w:tc>
+        <w:tc>
+          <w:tcPr>
+            <w:tcW w:type="dxa" w:w="5300"/>
+            <w:tcBorders>
+              <w:top w:val="single" w:color="DBE3DA" w:sz="4"/>
+              <w:left w:val="single" w:color="DBE3DA" w:sz="4"/>
+              <w:bottom w:val="single" w:color="DBE3DA" w:sz="4"/>
+              <w:right w:val="single" w:color="DBE3DA" w:sz="4"/>
+            </w:tcBorders>
+            <w:tcMar>
+              <w:top w:type="dxa" w:w="80"/>
+              <w:left w:type="dxa" w:w="120"/>
+              <w:bottom w:type="dxa" w:w="80"/>
+              <w:right w:type="dxa" w:w="120"/>
+            </w:tcMar>
+          </w:tcPr>
+          <w:p>
+            <w:pPr>
+              <w:spacing w:after="40" w:line="252"/>
+            </w:pPr>
+            <w:r>
+              <w:rPr>
+                <w:rFonts w:ascii="Arial" w:cs="Arial" w:eastAsia="Arial" w:hAnsi="Arial"/>
+                <w:sz w:val="19"/>
+                <w:szCs w:val="19"/>
+              </w:rPr>
+              <w:t xml:space="preserve">The decisions: demo mode, EC2, public repository; the Lightsail attempt superseded</w:t>
+            </w:r>
+          </w:p>
+        </w:tc>
+        <w:tc>
+          <w:tcPr>
+            <w:tcW w:type="dxa" w:w="3226"/>
+            <w:tcBorders>
+              <w:top w:val="single" w:color="DBE3DA" w:sz="4"/>
+              <w:left w:val="single" w:color="DBE3DA" w:sz="4"/>
+              <w:bottom w:val="single" w:color="DBE3DA" w:sz="4"/>
+              <w:right w:val="single" w:color="DBE3DA" w:sz="4"/>
+            </w:tcBorders>
+            <w:tcMar>
+              <w:top w:type="dxa" w:w="80"/>
+              <w:left w:type="dxa" w:w="120"/>
+              <w:bottom w:type="dxa" w:w="80"/>
+              <w:right w:type="dxa" w:w="120"/>
+            </w:tcMar>
+          </w:tcPr>
+          <w:p>
+            <w:pPr>
+              <w:spacing w:after="40" w:line="252"/>
+            </w:pPr>
+            <w:r>
+              <w:rPr>
+                <w:rFonts w:ascii="Arial" w:cs="Arial" w:eastAsia="Arial" w:hAnsi="Arial"/>
+                <w:sz w:val="17"/>
+                <w:szCs w:val="17"/>
+              </w:rPr>
+              <w:t xml:space="preserve">docs/DECISIONS.md D-015 to D-018, docs/DECISION_JOURNAL.md Entry 10</w:t>
+            </w:r>
+          </w:p>
+        </w:tc>
+      </w:tr>
+    </w:tbl>
+    <w:p>
+      <w:pPr>
+        <w:spacing w:after="80" w:before="0" w:line="276"/>
+      </w:pPr>
+    </w:p>
+    <w:tbl>
+      <w:tblPr>
+        <w:tblW w:type="dxa" w:w="9026"/>
+        <w:tblBorders>
+          <w:top w:val="single" w:color="auto" w:sz="4"/>
+          <w:left w:val="single" w:color="auto" w:sz="4"/>
+          <w:bottom w:val="single" w:color="auto" w:sz="4"/>
+          <w:right w:val="single" w:color="auto" w:sz="4"/>
+          <w:insideH w:val="single" w:color="auto" w:sz="4"/>
+          <w:insideV w:val="single" w:color="auto" w:sz="4"/>
+        </w:tblBorders>
+        <w:tblLayout w:type="fixed"/>
+      </w:tblPr>
+      <w:tblGrid>
+        <w:gridCol w:w="9026"/>
+      </w:tblGrid>
+      <w:tr>
+        <w:tc>
+          <w:tcPr>
+            <w:tcW w:type="dxa" w:w="9026"/>
+            <w:tcBorders>
+              <w:top w:val="none" w:color="FFFFFF" w:sz="0"/>
+              <w:left w:val="single" w:color="0B6E5F" w:sz="24"/>
+              <w:bottom w:val="none" w:color="FFFFFF" w:sz="0"/>
+              <w:right w:val="none" w:color="FFFFFF" w:sz="0"/>
+            </w:tcBorders>
+            <w:shd w:fill="F6F8F5" w:color="auto" w:val="clear"/>
+            <w:tcMar>
+              <w:top w:type="dxa" w:w="80"/>
+              <w:left w:type="dxa" w:w="120"/>
+              <w:bottom w:type="dxa" w:w="80"/>
+              <w:right w:type="dxa" w:w="120"/>
+            </w:tcMar>
+          </w:tcPr>
+          <w:p>
+            <w:pPr>
+              <w:spacing w:after="20" w:line="252"/>
+            </w:pPr>
+            <w:r>
+              <w:rPr>
+                <w:rFonts w:ascii="Arial" w:cs="Arial" w:eastAsia="Arial" w:hAnsi="Arial"/>
+                <w:b/>
+                <w:bCs/>
+                <w:color w:val="0B6E5F"/>
+                <w:sz w:val="19"/>
+                <w:szCs w:val="19"/>
+              </w:rPr>
+              <w:t xml:space="preserve">VERIFY  </w:t>
+            </w:r>
+            <w:r>
+              <w:rPr>
+                <w:rFonts w:ascii="Arial" w:cs="Arial" w:eastAsia="Arial" w:hAnsi="Arial"/>
+                <w:sz w:val="19"/>
+                <w:szCs w:val="19"/>
+              </w:rPr>
+              <w:t xml:space="preserve">Open </w:t>
+            </w:r>
+            <w:r>
+              <w:rPr>
+                <w:rFonts w:ascii="Arial" w:cs="Arial" w:eastAsia="Arial" w:hAnsi="Arial"/>
+                <w:b/>
+                <w:bCs/>
+                <w:sz w:val="19"/>
+                <w:szCs w:val="19"/>
+              </w:rPr>
+              <w:t xml:space="preserve">https://campusly.13-127-195-244.sslip.io</w:t>
+            </w:r>
+            <w:r>
+              <w:rPr>
+                <w:rFonts w:ascii="Arial" w:cs="Arial" w:eastAsia="Arial" w:hAnsi="Arial"/>
+                <w:sz w:val="19"/>
+                <w:szCs w:val="19"/>
+              </w:rPr>
+              <w:t xml:space="preserve">: the address bar shows a padlock. Sign in as </w:t>
+            </w:r>
+            <w:r>
+              <w:rPr>
+                <w:rFonts w:ascii="Arial" w:cs="Arial" w:eastAsia="Arial" w:hAnsi="Arial"/>
+                <w:b/>
+                <w:bCs/>
+                <w:sz w:val="19"/>
+                <w:szCs w:val="19"/>
+              </w:rPr>
+              <w:t xml:space="preserve">teacher@example.com</w:t>
+            </w:r>
+            <w:r>
+              <w:rPr>
+                <w:rFonts w:ascii="Arial" w:cs="Arial" w:eastAsia="Arial" w:hAnsi="Arial"/>
+                <w:sz w:val="19"/>
+                <w:szCs w:val="19"/>
+              </w:rPr>
+              <w:t xml:space="preserve">: you see Grade 5-A, the same as on your machine.</w:t>
+            </w:r>
+          </w:p>
+        </w:tc>
+      </w:tr>
+    </w:tbl>
+    <w:p>
+      <w:pPr>
+        <w:spacing w:after="120" w:before="0" w:line="276"/>
+      </w:pPr>
+    </w:p>
+    <w:p>
+      <w:pPr>
+        <w:pStyle w:val="Heading2"/>
+      </w:pPr>
+      <w:r>
+        <w:rPr>
+          <w:rFonts w:ascii="Arial" w:cs="Arial" w:eastAsia="Arial" w:hAnsi="Arial"/>
+        </w:rPr>
+        <w:t xml:space="preserve">13.2 Decisions</w:t>
       </w:r>
     </w:p>
     <w:tbl>
@@ -28295,7 +30820,7 @@
         <w:rPr>
           <w:rFonts w:ascii="Arial" w:cs="Arial" w:eastAsia="Arial" w:hAnsi="Arial"/>
         </w:rPr>
-        <w:t xml:space="preserve">13.2 Who does what</w:t>
+        <w:t xml:space="preserve">13.3 Who does what</w:t>
       </w:r>
     </w:p>
     <w:p>
@@ -28742,7 +31267,7 @@
         <w:rPr>
           <w:rFonts w:ascii="Arial" w:cs="Arial" w:eastAsia="Arial" w:hAnsi="Arial"/>
         </w:rPr>
-        <w:t xml:space="preserve">13.3 Budget alarm first</w:t>
+        <w:t xml:space="preserve">13.4 Budget alarm first</w:t>
       </w:r>
     </w:p>
     <w:p>
@@ -28872,7 +31397,7 @@
         <w:rPr>
           <w:rFonts w:ascii="Arial" w:cs="Arial" w:eastAsia="Arial" w:hAnsi="Arial"/>
         </w:rPr>
-        <w:t xml:space="preserve">13.4 Create a read-only GitHub token (when the repository is private)</w:t>
+        <w:t xml:space="preserve">13.5 Create a read-only GitHub token (when the repository is private)</w:t>
       </w:r>
     </w:p>
     <w:p>
@@ -29272,7 +31797,7 @@
                 <w:sz w:val="19"/>
                 <w:szCs w:val="19"/>
               </w:rPr>
-              <w:t xml:space="preserve"> into the GITHUB_TOKEN="" line of the server's user data (13.5, step 7), or into a terminal prompt that hides what you type. </w:t>
+              <w:t xml:space="preserve"> into the GITHUB_TOKEN="" line of the server's user data (13.6, step 7), or into a terminal prompt that hides what you type. </w:t>
             </w:r>
             <w:r>
               <w:rPr>
@@ -29309,7 +31834,7 @@
         <w:rPr>
           <w:rFonts w:ascii="Arial" w:cs="Arial" w:eastAsia="Arial" w:hAnsi="Arial"/>
         </w:rPr>
-        <w:t xml:space="preserve">13.5 Launch the server</w:t>
+        <w:t xml:space="preserve">13.6 Launch the server</w:t>
       </w:r>
     </w:p>
     <w:p>
@@ -29622,7 +32147,7 @@
         <w:rPr>
           <w:rFonts w:ascii="Arial" w:cs="Arial" w:eastAsia="Arial" w:hAnsi="Arial"/>
         </w:rPr>
-        <w:t xml:space="preserve"> paste the whole of deploy/ec2-user-data.sh from the repository. Public repository: leave GITHUB_TOKEN="" empty. Private: put your token from 13.4 between the quotes.</w:t>
+        <w:t xml:space="preserve"> paste the whole of deploy/ec2-user-data.sh from the repository. Public repository: leave GITHUB_TOKEN="" empty. Private: put your token from 13.5 between the quotes.</w:t>
       </w:r>
     </w:p>
     <w:p>
@@ -30146,7 +32671,7 @@
         <w:rPr>
           <w:rFonts w:ascii="Arial" w:cs="Arial" w:eastAsia="Arial" w:hAnsi="Arial"/>
         </w:rPr>
-        <w:t xml:space="preserve">13.6 A fixed IP address</w:t>
+        <w:t xml:space="preserve">13.7 A fixed IP address</w:t>
       </w:r>
     </w:p>
     <w:p>
@@ -30318,7 +32843,7 @@
         <w:rPr>
           <w:rFonts w:ascii="Arial" w:cs="Arial" w:eastAsia="Arial" w:hAnsi="Arial"/>
         </w:rPr>
-        <w:t xml:space="preserve">13.7 Go live</w:t>
+        <w:t xml:space="preserve">13.8 Go live</w:t>
       </w:r>
     </w:p>
     <w:p>
@@ -30610,7 +33135,7 @@
         <w:rPr>
           <w:rFonts w:ascii="Arial" w:cs="Arial" w:eastAsia="Arial" w:hAnsi="Arial"/>
         </w:rPr>
-        <w:t xml:space="preserve">13.8 Updating the live site</w:t>
+        <w:t xml:space="preserve">13.9 Updating the live site</w:t>
       </w:r>
     </w:p>
     <w:p>
@@ -31989,7 +34514,7 @@
         <w:rPr>
           <w:rFonts w:ascii="Arial" w:cs="Arial" w:eastAsia="Arial" w:hAnsi="Arial"/>
         </w:rPr>
-        <w:t xml:space="preserve">. All people are fictional.</w:t>
+        <w:t xml:space="preserve">. All people are fictional. They work on your local copy (http://localhost:3000) and on the live app (https://campusly.13-127-195-244.sslip.io).</w:t>
       </w:r>
     </w:p>
     <w:tbl>
@@ -34181,7 +36706,7 @@
                 <w:sz w:val="19"/>
                 <w:szCs w:val="19"/>
               </w:rPr>
-              <w:t xml:space="preserve">Secrets? Branch protection on your plan?</w:t>
+              <w:t xml:space="preserve">No secrets in any commit → public is simplest (students fork, the server needs no token)</w:t>
             </w:r>
           </w:p>
         </w:tc>
@@ -34279,7 +36804,7 @@
                 <w:sz w:val="19"/>
                 <w:szCs w:val="19"/>
               </w:rPr>
-              <w:t xml:space="preserve">Enough memory for the build; cheaper means the credit lasts longer</w:t>
+              <w:t xml:space="preserve">Enough memory for the build (Campusly: EC2 t3.small, 2 GiB); cheaper means the credit lasts longer</w:t>
             </w:r>
           </w:p>
         </w:tc>

</xml_diff>

<commit_message>
Guided document v4: everything happens in the Claude Code chat
Part 0 rewritten: fork → clone with GitHub Desktop → create the Claude Code project on the folder → Orient prompt,
with a no-GitHub-Desktop path and permission-prompt guidance. Every VERIFY and step that said 'Run pnpm/git …'
is now an 'Ask Claude: …' sentence; test output shown as 'What Claude reports'. Part 12 answers are chat asks.
Server commands in Part 13 are labelled as the instructor's AWS browser terminal. Fixed duplicate Figure 0.1.
Verified: full text read end to end; no student-facing commands left; 24 figures, no duplicate numbers.
Not verified: page layout in Word.

Co-Authored-By: Claude Opus 5.5 <noreply@anthropic.com>
</commit_message>
<xml_diff>
--- a/docs/Campusly-Live-Session-Idea-to-Live.docx
+++ b/docs/Campusly-Live-Session-Idea-to-Live.docx
@@ -617,7 +617,7 @@
                 <w:sz w:val="19"/>
                 <w:szCs w:val="19"/>
               </w:rPr>
-              <w:t xml:space="preserve">Fork the public repository, clone your fork, run the app</w:t>
+              <w:t xml:space="preserve">Fork the public repository, open your fork as a project in Claude Code, run the app</w:t>
             </w:r>
           </w:p>
         </w:tc>
@@ -1237,7 +1237,7 @@
                 <w:sz w:val="19"/>
                 <w:szCs w:val="19"/>
               </w:rPr>
-              <w:t xml:space="preserve">Fork the public repository and run it on your machine</w:t>
+              <w:t xml:space="preserve">Fork the public repository and make it a Claude Code project</w:t>
             </w:r>
           </w:p>
         </w:tc>
@@ -1866,7 +1866,7 @@
         <w:rPr>
           <w:rFonts w:ascii="Arial" w:cs="Arial" w:eastAsia="Arial" w:hAnsi="Arial"/>
         </w:rPr>
-        <w:t xml:space="preserve">Part 0 · Get set up</w:t>
+        <w:t xml:space="preserve">Part 0 · Get set up: the repository as a Claude Code project</w:t>
       </w:r>
     </w:p>
     <w:p>
@@ -1877,8 +1877,110 @@
         <w:rPr>
           <w:rFonts w:ascii="Arial" w:cs="Arial" w:eastAsia="Arial" w:hAnsi="Arial"/>
         </w:rPr>
-        <w:t xml:space="preserve">Do this before the session. It takes about ten minutes, and you need no coding knowledge.</w:t>
-      </w:r>
+        <w:t xml:space="preserve">Do this before the session. It takes about fifteen minutes, and you need no coding knowledge.</w:t>
+      </w:r>
+    </w:p>
+    <w:tbl>
+      <w:tblPr>
+        <w:tblW w:type="dxa" w:w="9026"/>
+        <w:tblBorders>
+          <w:top w:val="single" w:color="auto" w:sz="4"/>
+          <w:left w:val="single" w:color="auto" w:sz="4"/>
+          <w:bottom w:val="single" w:color="auto" w:sz="4"/>
+          <w:right w:val="single" w:color="auto" w:sz="4"/>
+          <w:insideH w:val="single" w:color="auto" w:sz="4"/>
+          <w:insideV w:val="single" w:color="auto" w:sz="4"/>
+        </w:tblBorders>
+        <w:tblLayout w:type="fixed"/>
+      </w:tblPr>
+      <w:tblGrid>
+        <w:gridCol w:w="9026"/>
+      </w:tblGrid>
+      <w:tr>
+        <w:tc>
+          <w:tcPr>
+            <w:tcW w:type="dxa" w:w="9026"/>
+            <w:tcBorders>
+              <w:top w:val="none" w:color="FFFFFF" w:sz="0"/>
+              <w:left w:val="none" w:color="FFFFFF" w:sz="0"/>
+              <w:bottom w:val="none" w:color="FFFFFF" w:sz="0"/>
+              <w:right w:val="none" w:color="FFFFFF" w:sz="0"/>
+            </w:tcBorders>
+            <w:shd w:fill="E3F3EF" w:color="auto" w:val="clear"/>
+            <w:tcMar>
+              <w:top w:type="dxa" w:w="80"/>
+              <w:left w:type="dxa" w:w="120"/>
+              <w:bottom w:type="dxa" w:w="80"/>
+              <w:right w:type="dxa" w:w="120"/>
+            </w:tcMar>
+          </w:tcPr>
+          <w:p>
+            <w:pPr>
+              <w:spacing w:after="20" w:line="252"/>
+            </w:pPr>
+            <w:r>
+              <w:rPr>
+                <w:rFonts w:ascii="Arial" w:cs="Arial" w:eastAsia="Arial" w:hAnsi="Arial"/>
+                <w:b/>
+                <w:bCs/>
+                <w:color w:val="0B6E5F"/>
+                <w:sz w:val="19"/>
+                <w:szCs w:val="19"/>
+              </w:rPr>
+              <w:t xml:space="preserve">HOW YOU WORK IN THIS COURSE  </w:t>
+            </w:r>
+            <w:r>
+              <w:rPr>
+                <w:rFonts w:ascii="Arial" w:cs="Arial" w:eastAsia="Arial" w:hAnsi="Arial"/>
+                <w:sz w:val="19"/>
+                <w:szCs w:val="19"/>
+              </w:rPr>
+              <w:t xml:space="preserve">Everything happens </w:t>
+            </w:r>
+            <w:r>
+              <w:rPr>
+                <w:rFonts w:ascii="Arial" w:cs="Arial" w:eastAsia="Arial" w:hAnsi="Arial"/>
+                <w:b/>
+                <w:bCs/>
+                <w:sz w:val="19"/>
+                <w:szCs w:val="19"/>
+              </w:rPr>
+              <w:t xml:space="preserve">in the Claude Code chat</w:t>
+            </w:r>
+            <w:r>
+              <w:rPr>
+                <w:rFonts w:ascii="Arial" w:cs="Arial" w:eastAsia="Arial" w:hAnsi="Arial"/>
+                <w:sz w:val="19"/>
+                <w:szCs w:val="19"/>
+              </w:rPr>
+              <w:t xml:space="preserve">. You never type commands into a terminal. When this guide says </w:t>
+            </w:r>
+            <w:r>
+              <w:rPr>
+                <w:rFonts w:ascii="Arial" w:cs="Arial" w:eastAsia="Arial" w:hAnsi="Arial"/>
+                <w:b/>
+                <w:bCs/>
+                <w:sz w:val="19"/>
+                <w:szCs w:val="19"/>
+              </w:rPr>
+              <w:t xml:space="preserve">Ask Claude:</w:t>
+            </w:r>
+            <w:r>
+              <w:rPr>
+                <w:rFonts w:ascii="Arial" w:cs="Arial" w:eastAsia="Arial" w:hAnsi="Arial"/>
+                <w:sz w:val="19"/>
+                <w:szCs w:val="19"/>
+              </w:rPr>
+              <w:t xml:space="preserve"> followed by a sentence in italics, type that sentence into the chat. When it shows a prompt box, copy the whole box into the chat. Claude runs whatever is needed and shows you the result.</w:t>
+            </w:r>
+          </w:p>
+        </w:tc>
+      </w:tr>
+    </w:tbl>
+    <w:p>
+      <w:pPr>
+        <w:spacing w:after="120" w:before="0" w:line="276"/>
+      </w:pPr>
     </w:p>
     <w:p>
       <w:pPr>
@@ -2077,7 +2179,7 @@
                 <w:sz w:val="19"/>
                 <w:szCs w:val="19"/>
               </w:rPr>
-              <w:t xml:space="preserve">GitHub Desktop (recommended)</w:t>
+              <w:t xml:space="preserve">GitHub Desktop: copies the code to your computer and signs you in to GitHub</w:t>
             </w:r>
           </w:p>
         </w:tc>
@@ -2108,7 +2210,7 @@
                 <w:sz w:val="19"/>
                 <w:szCs w:val="19"/>
               </w:rPr>
-              <w:t xml:space="preserve">desktop.github.com</w:t>
+              <w:t xml:space="preserve">desktop.github.com; open it once and sign in with your GitHub account</w:t>
             </w:r>
           </w:p>
         </w:tc>
@@ -2143,7 +2245,7 @@
                 <w:sz w:val="19"/>
                 <w:szCs w:val="19"/>
               </w:rPr>
-              <w:t xml:space="preserve">Node.js 22 or newer (choose the LTS version)</w:t>
+              <w:t xml:space="preserve">Node.js 22 or newer: the engine the app runs on</w:t>
             </w:r>
           </w:p>
         </w:tc>
@@ -2173,7 +2275,25 @@
                 <w:sz w:val="19"/>
                 <w:szCs w:val="19"/>
               </w:rPr>
-              <w:t xml:space="preserve">nodejs.org</w:t>
+              <w:t xml:space="preserve">nodejs.org → download the </w:t>
+            </w:r>
+            <w:r>
+              <w:rPr>
+                <w:rFonts w:ascii="Arial" w:cs="Arial" w:eastAsia="Arial" w:hAnsi="Arial"/>
+                <w:b/>
+                <w:bCs/>
+                <w:sz w:val="19"/>
+                <w:szCs w:val="19"/>
+              </w:rPr>
+              <w:t xml:space="preserve">LTS</w:t>
+            </w:r>
+            <w:r>
+              <w:rPr>
+                <w:rFonts w:ascii="Arial" w:cs="Arial" w:eastAsia="Arial" w:hAnsi="Arial"/>
+                <w:sz w:val="19"/>
+                <w:szCs w:val="19"/>
+              </w:rPr>
+              <w:t xml:space="preserve"> installer → click through it (no terminal needed)</w:t>
             </w:r>
           </w:p>
         </w:tc>
@@ -2209,7 +2329,25 @@
                 <w:sz w:val="19"/>
                 <w:szCs w:val="19"/>
               </w:rPr>
-              <w:t xml:space="preserve">Claude Code</w:t>
+              <w:t xml:space="preserve">The Claude desktop app with Claude Code (the </w:t>
+            </w:r>
+            <w:r>
+              <w:rPr>
+                <w:rFonts w:ascii="Arial" w:cs="Arial" w:eastAsia="Arial" w:hAnsi="Arial"/>
+                <w:b/>
+                <w:bCs/>
+                <w:sz w:val="19"/>
+                <w:szCs w:val="19"/>
+              </w:rPr>
+              <w:t xml:space="preserve">Code</w:t>
+            </w:r>
+            <w:r>
+              <w:rPr>
+                <w:rFonts w:ascii="Arial" w:cs="Arial" w:eastAsia="Arial" w:hAnsi="Arial"/>
+                <w:sz w:val="19"/>
+                <w:szCs w:val="19"/>
+              </w:rPr>
+              <w:t xml:space="preserve"> tab)</w:t>
             </w:r>
           </w:p>
         </w:tc>
@@ -2259,7 +2397,7 @@
         <w:rPr>
           <w:rFonts w:ascii="Arial" w:cs="Arial" w:eastAsia="Arial" w:hAnsi="Arial"/>
         </w:rPr>
-        <w:t xml:space="preserve">0.2 Get the code</w:t>
+        <w:t xml:space="preserve">0.2 Fork the public repository</w:t>
       </w:r>
     </w:p>
     <w:p>
@@ -2284,7 +2422,7 @@
         <w:rPr>
           <w:rFonts w:ascii="Arial" w:cs="Arial" w:eastAsia="Arial" w:hAnsi="Arial"/>
         </w:rPr>
-        <w:t xml:space="preserve"> repository. Everyone in the course uses this one address:</w:t>
+        <w:t xml:space="preserve"> repository. Everyone in the course starts from this one address:</w:t>
       </w:r>
     </w:p>
     <w:tbl>
@@ -2458,111 +2596,7 @@
         <w:rPr>
           <w:rFonts w:ascii="Arial" w:cs="Arial" w:eastAsia="Arial" w:hAnsi="Arial"/>
         </w:rPr>
-        <w:t xml:space="preserve">. You need your own copy because you can't push to the instructor's repository, and in Part 11 you push your own features.</w:t>
-      </w:r>
-    </w:p>
-    <w:p>
-      <w:pPr>
-        <w:pStyle w:val="ListParagraph"/>
-        <w:numPr>
-          <w:ilvl w:val="0"/>
-          <w:numId w:val="2"/>
-        </w:numPr>
-        <w:spacing w:after="70" w:line="264"/>
-      </w:pPr>
-      <w:r>
-        <w:rPr>
-          <w:rFonts w:ascii="Arial" w:cs="Arial" w:eastAsia="Arial" w:hAnsi="Arial"/>
-        </w:rPr>
-        <w:t xml:space="preserve">On </w:t>
-      </w:r>
-      <w:r>
-        <w:rPr>
-          <w:rFonts w:ascii="Arial" w:cs="Arial" w:eastAsia="Arial" w:hAnsi="Arial"/>
-          <w:b/>
-          <w:bCs/>
-        </w:rPr>
-        <w:t xml:space="preserve">your fork's</w:t>
-      </w:r>
-      <w:r>
-        <w:rPr>
-          <w:rFonts w:ascii="Arial" w:cs="Arial" w:eastAsia="Arial" w:hAnsi="Arial"/>
-        </w:rPr>
-        <w:t xml:space="preserve"> page, click </w:t>
-      </w:r>
-      <w:r>
-        <w:rPr>
-          <w:rFonts w:ascii="Arial" w:cs="Arial" w:eastAsia="Arial" w:hAnsi="Arial"/>
-          <w:b/>
-          <w:bCs/>
-        </w:rPr>
-        <w:t xml:space="preserve">Code → Open with GitHub Desktop</w:t>
-      </w:r>
-      <w:r>
-        <w:rPr>
-          <w:rFonts w:ascii="Arial" w:cs="Arial" w:eastAsia="Arial" w:hAnsi="Arial"/>
-        </w:rPr>
-        <w:t xml:space="preserve">.</w:t>
-      </w:r>
-    </w:p>
-    <w:p>
-      <w:pPr>
-        <w:pStyle w:val="ListParagraph"/>
-        <w:numPr>
-          <w:ilvl w:val="0"/>
-          <w:numId w:val="2"/>
-        </w:numPr>
-        <w:spacing w:after="70" w:line="264"/>
-      </w:pPr>
-      <w:r>
-        <w:rPr>
-          <w:rFonts w:ascii="Arial" w:cs="Arial" w:eastAsia="Arial" w:hAnsi="Arial"/>
-        </w:rPr>
-        <w:t xml:space="preserve">Choose a folder on your computer and click </w:t>
-      </w:r>
-      <w:r>
-        <w:rPr>
-          <w:rFonts w:ascii="Arial" w:cs="Arial" w:eastAsia="Arial" w:hAnsi="Arial"/>
-          <w:b/>
-          <w:bCs/>
-        </w:rPr>
-        <w:t xml:space="preserve">Clone</w:t>
-      </w:r>
-      <w:r>
-        <w:rPr>
-          <w:rFonts w:ascii="Arial" w:cs="Arial" w:eastAsia="Arial" w:hAnsi="Arial"/>
-        </w:rPr>
-        <w:t xml:space="preserve">.</w:t>
-      </w:r>
-    </w:p>
-    <w:p>
-      <w:pPr>
-        <w:pStyle w:val="ListParagraph"/>
-        <w:numPr>
-          <w:ilvl w:val="0"/>
-          <w:numId w:val="2"/>
-        </w:numPr>
-        <w:spacing w:after="70" w:line="264"/>
-      </w:pPr>
-      <w:r>
-        <w:rPr>
-          <w:rFonts w:ascii="Arial" w:cs="Arial" w:eastAsia="Arial" w:hAnsi="Arial"/>
-        </w:rPr>
-        <w:t xml:space="preserve">Do </w:t>
-      </w:r>
-      <w:r>
-        <w:rPr>
-          <w:rFonts w:ascii="Arial" w:cs="Arial" w:eastAsia="Arial" w:hAnsi="Arial"/>
-          <w:b/>
-          <w:bCs/>
-        </w:rPr>
-        <w:t xml:space="preserve">not</w:t>
-      </w:r>
-      <w:r>
-        <w:rPr>
-          <w:rFonts w:ascii="Arial" w:cs="Arial" w:eastAsia="Arial" w:hAnsi="Arial"/>
-        </w:rPr>
-        <w:t xml:space="preserve"> use "Download ZIP": it drops the history of commits, and Part 10 uses that history.</w:t>
+        <w:t xml:space="preserve">. You need your own copy because you can't change the instructor's repository, and in Part 11 you save your own features to yours.</w:t>
       </w:r>
     </w:p>
     <w:p>
@@ -2576,7 +2610,7 @@
           <wp:inline distT="0" distB="0" distL="0" distR="0">
             <wp:extent cx="5305425" cy="3009900"/>
             <wp:effectExtent t="0" r="0" b="0" l="0"/>
-            <wp:docPr id="2" name="Figure 0.1" descr="The public repository: Fork is at the top right, Code → Open with GitHub Desktop is the green button" title="Figure 0.1"/>
+            <wp:docPr id="2" name="Figure 0.2" descr="The public repository: Fork is at the top right; Code (the green button) is how you open it in GitHub Desktop" title="Figure 0.2"/>
             <wp:cNvGraphicFramePr>
               <a:graphicFrameLocks xmlns:a="http://schemas.openxmlformats.org/drawingml/2006/main" noChangeAspect="1"/>
             </wp:cNvGraphicFramePr>
@@ -2626,7 +2660,7 @@
           <w:sz w:val="17"/>
           <w:szCs w:val="17"/>
         </w:rPr>
-        <w:t xml:space="preserve">Figure 0.1  </w:t>
+        <w:t xml:space="preserve">Figure 0.2  </w:t>
       </w:r>
       <w:r>
         <w:rPr>
@@ -2637,7 +2671,7 @@
           <w:sz w:val="17"/>
           <w:szCs w:val="17"/>
         </w:rPr>
-        <w:t xml:space="preserve">The public repository: Fork is at the top right, Code → Open with GitHub Desktop is the green button</w:t>
+        <w:t xml:space="preserve">The public repository: Fork is at the top right; Code (the green button) is how you open it in GitHub Desktop</w:t>
       </w:r>
     </w:p>
     <w:tbl>
@@ -2732,7 +2766,323 @@
         <w:rPr>
           <w:rFonts w:ascii="Arial" w:cs="Arial" w:eastAsia="Arial" w:hAnsi="Arial"/>
         </w:rPr>
-        <w:t xml:space="preserve">0.3 Open it in Claude Code and run the Orient prompt</w:t>
+        <w:t xml:space="preserve">0.3 Copy your fork to your computer</w:t>
+      </w:r>
+    </w:p>
+    <w:p>
+      <w:pPr>
+        <w:pStyle w:val="ListParagraph"/>
+        <w:numPr>
+          <w:ilvl w:val="0"/>
+          <w:numId w:val="3"/>
+        </w:numPr>
+        <w:spacing w:after="70" w:line="264"/>
+      </w:pPr>
+      <w:r>
+        <w:rPr>
+          <w:rFonts w:ascii="Arial" w:cs="Arial" w:eastAsia="Arial" w:hAnsi="Arial"/>
+        </w:rPr>
+        <w:t xml:space="preserve">On </w:t>
+      </w:r>
+      <w:r>
+        <w:rPr>
+          <w:rFonts w:ascii="Arial" w:cs="Arial" w:eastAsia="Arial" w:hAnsi="Arial"/>
+          <w:b/>
+          <w:bCs/>
+        </w:rPr>
+        <w:t xml:space="preserve">your fork's</w:t>
+      </w:r>
+      <w:r>
+        <w:rPr>
+          <w:rFonts w:ascii="Arial" w:cs="Arial" w:eastAsia="Arial" w:hAnsi="Arial"/>
+        </w:rPr>
+        <w:t xml:space="preserve"> page, click </w:t>
+      </w:r>
+      <w:r>
+        <w:rPr>
+          <w:rFonts w:ascii="Arial" w:cs="Arial" w:eastAsia="Arial" w:hAnsi="Arial"/>
+          <w:b/>
+          <w:bCs/>
+        </w:rPr>
+        <w:t xml:space="preserve">Code → Open with GitHub Desktop</w:t>
+      </w:r>
+      <w:r>
+        <w:rPr>
+          <w:rFonts w:ascii="Arial" w:cs="Arial" w:eastAsia="Arial" w:hAnsi="Arial"/>
+        </w:rPr>
+        <w:t xml:space="preserve">.</w:t>
+      </w:r>
+    </w:p>
+    <w:p>
+      <w:pPr>
+        <w:pStyle w:val="ListParagraph"/>
+        <w:numPr>
+          <w:ilvl w:val="0"/>
+          <w:numId w:val="3"/>
+        </w:numPr>
+        <w:spacing w:after="70" w:line="264"/>
+      </w:pPr>
+      <w:r>
+        <w:rPr>
+          <w:rFonts w:ascii="Arial" w:cs="Arial" w:eastAsia="Arial" w:hAnsi="Arial"/>
+        </w:rPr>
+        <w:t xml:space="preserve">GitHub Desktop shows where it will save the folder (usually Documents/GitHub/campusly). Note that place, then click </w:t>
+      </w:r>
+      <w:r>
+        <w:rPr>
+          <w:rFonts w:ascii="Arial" w:cs="Arial" w:eastAsia="Arial" w:hAnsi="Arial"/>
+          <w:b/>
+          <w:bCs/>
+        </w:rPr>
+        <w:t xml:space="preserve">Clone</w:t>
+      </w:r>
+      <w:r>
+        <w:rPr>
+          <w:rFonts w:ascii="Arial" w:cs="Arial" w:eastAsia="Arial" w:hAnsi="Arial"/>
+        </w:rPr>
+        <w:t xml:space="preserve">.</w:t>
+      </w:r>
+    </w:p>
+    <w:p>
+      <w:pPr>
+        <w:pStyle w:val="ListParagraph"/>
+        <w:numPr>
+          <w:ilvl w:val="0"/>
+          <w:numId w:val="3"/>
+        </w:numPr>
+        <w:spacing w:after="70" w:line="264"/>
+      </w:pPr>
+      <w:r>
+        <w:rPr>
+          <w:rFonts w:ascii="Arial" w:cs="Arial" w:eastAsia="Arial" w:hAnsi="Arial"/>
+        </w:rPr>
+        <w:t xml:space="preserve">Do </w:t>
+      </w:r>
+      <w:r>
+        <w:rPr>
+          <w:rFonts w:ascii="Arial" w:cs="Arial" w:eastAsia="Arial" w:hAnsi="Arial"/>
+          <w:b/>
+          <w:bCs/>
+        </w:rPr>
+        <w:t xml:space="preserve">not</w:t>
+      </w:r>
+      <w:r>
+        <w:rPr>
+          <w:rFonts w:ascii="Arial" w:cs="Arial" w:eastAsia="Arial" w:hAnsi="Arial"/>
+        </w:rPr>
+        <w:t xml:space="preserve"> use "Download ZIP": it drops the history of commits, and Part 10 uses that history.</w:t>
+      </w:r>
+    </w:p>
+    <w:p>
+      <w:pPr>
+        <w:pStyle w:val="Heading2"/>
+      </w:pPr>
+      <w:r>
+        <w:rPr>
+          <w:rFonts w:ascii="Arial" w:cs="Arial" w:eastAsia="Arial" w:hAnsi="Arial"/>
+        </w:rPr>
+        <w:t xml:space="preserve">0.4 Create the project in Claude Code</w:t>
+      </w:r>
+    </w:p>
+    <w:p>
+      <w:pPr>
+        <w:pStyle w:val="ListParagraph"/>
+        <w:numPr>
+          <w:ilvl w:val="0"/>
+          <w:numId w:val="4"/>
+        </w:numPr>
+        <w:spacing w:after="70" w:line="264"/>
+      </w:pPr>
+      <w:r>
+        <w:rPr>
+          <w:rFonts w:ascii="Arial" w:cs="Arial" w:eastAsia="Arial" w:hAnsi="Arial"/>
+        </w:rPr>
+        <w:t xml:space="preserve">Open the Claude desktop app and go to the </w:t>
+      </w:r>
+      <w:r>
+        <w:rPr>
+          <w:rFonts w:ascii="Arial" w:cs="Arial" w:eastAsia="Arial" w:hAnsi="Arial"/>
+          <w:b/>
+          <w:bCs/>
+        </w:rPr>
+        <w:t xml:space="preserve">Code</w:t>
+      </w:r>
+      <w:r>
+        <w:rPr>
+          <w:rFonts w:ascii="Arial" w:cs="Arial" w:eastAsia="Arial" w:hAnsi="Arial"/>
+        </w:rPr>
+        <w:t xml:space="preserve"> tab.</w:t>
+      </w:r>
+    </w:p>
+    <w:p>
+      <w:pPr>
+        <w:pStyle w:val="ListParagraph"/>
+        <w:numPr>
+          <w:ilvl w:val="0"/>
+          <w:numId w:val="4"/>
+        </w:numPr>
+        <w:spacing w:after="70" w:line="264"/>
+      </w:pPr>
+      <w:r>
+        <w:rPr>
+          <w:rFonts w:ascii="Arial" w:cs="Arial" w:eastAsia="Arial" w:hAnsi="Arial"/>
+        </w:rPr>
+        <w:t xml:space="preserve">Start a new session and, when it asks for a folder, choose the </w:t>
+      </w:r>
+      <w:r>
+        <w:rPr>
+          <w:rFonts w:ascii="Arial" w:cs="Arial" w:eastAsia="Arial" w:hAnsi="Arial"/>
+          <w:b/>
+          <w:bCs/>
+        </w:rPr>
+        <w:t xml:space="preserve">campusly</w:t>
+      </w:r>
+      <w:r>
+        <w:rPr>
+          <w:rFonts w:ascii="Arial" w:cs="Arial" w:eastAsia="Arial" w:hAnsi="Arial"/>
+        </w:rPr>
+        <w:t xml:space="preserve"> folder from 0.3. That folder is now your project: every prompt in this guide is sent in a session opened on it.</w:t>
+      </w:r>
+    </w:p>
+    <w:p>
+      <w:pPr>
+        <w:pStyle w:val="ListParagraph"/>
+        <w:numPr>
+          <w:ilvl w:val="0"/>
+          <w:numId w:val="4"/>
+        </w:numPr>
+        <w:spacing w:after="70" w:line="264"/>
+      </w:pPr>
+      <w:r>
+        <w:rPr>
+          <w:rFonts w:ascii="Arial" w:cs="Arial" w:eastAsia="Arial" w:hAnsi="Arial"/>
+        </w:rPr>
+        <w:t xml:space="preserve">Claude reads </w:t>
+      </w:r>
+      <w:r>
+        <w:rPr>
+          <w:rFonts w:ascii="Arial" w:cs="Arial" w:eastAsia="Arial" w:hAnsi="Arial"/>
+          <w:b/>
+          <w:bCs/>
+        </w:rPr>
+        <w:t xml:space="preserve">CLAUDE.md</w:t>
+      </w:r>
+      <w:r>
+        <w:rPr>
+          <w:rFonts w:ascii="Arial" w:cs="Arial" w:eastAsia="Arial" w:hAnsi="Arial"/>
+        </w:rPr>
+        <w:t xml:space="preserve">, the project's briefing file, by itself. You don't need to paste it.</w:t>
+      </w:r>
+    </w:p>
+    <w:p>
+      <w:pPr>
+        <w:pStyle w:val="ListParagraph"/>
+        <w:numPr>
+          <w:ilvl w:val="0"/>
+          <w:numId w:val="4"/>
+        </w:numPr>
+        <w:spacing w:after="70" w:line="264"/>
+      </w:pPr>
+      <w:r>
+        <w:rPr>
+          <w:rFonts w:ascii="Arial" w:cs="Arial" w:eastAsia="Arial" w:hAnsi="Arial"/>
+        </w:rPr>
+        <w:t xml:space="preserve">When Claude asks permission to run something (installing packages, starting the app, running tests), read the one-line reason and allow it. Say no to anything that wants to delete files outside the campusly folder or asks for a password.</w:t>
+      </w:r>
+    </w:p>
+    <w:tbl>
+      <w:tblPr>
+        <w:tblW w:type="dxa" w:w="9026"/>
+        <w:tblBorders>
+          <w:top w:val="single" w:color="auto" w:sz="4"/>
+          <w:left w:val="single" w:color="auto" w:sz="4"/>
+          <w:bottom w:val="single" w:color="auto" w:sz="4"/>
+          <w:right w:val="single" w:color="auto" w:sz="4"/>
+          <w:insideH w:val="single" w:color="auto" w:sz="4"/>
+          <w:insideV w:val="single" w:color="auto" w:sz="4"/>
+        </w:tblBorders>
+        <w:tblLayout w:type="fixed"/>
+      </w:tblPr>
+      <w:tblGrid>
+        <w:gridCol w:w="9026"/>
+      </w:tblGrid>
+      <w:tr>
+        <w:tc>
+          <w:tcPr>
+            <w:tcW w:type="dxa" w:w="9026"/>
+            <w:tcBorders>
+              <w:top w:val="none" w:color="FFFFFF" w:sz="0"/>
+              <w:left w:val="none" w:color="FFFFFF" w:sz="0"/>
+              <w:bottom w:val="none" w:color="FFFFFF" w:sz="0"/>
+              <w:right w:val="none" w:color="FFFFFF" w:sz="0"/>
+            </w:tcBorders>
+            <w:shd w:fill="E3F3EF" w:color="auto" w:val="clear"/>
+            <w:tcMar>
+              <w:top w:type="dxa" w:w="80"/>
+              <w:left w:type="dxa" w:w="120"/>
+              <w:bottom w:type="dxa" w:w="80"/>
+              <w:right w:type="dxa" w:w="120"/>
+            </w:tcMar>
+          </w:tcPr>
+          <w:p>
+            <w:pPr>
+              <w:spacing w:after="20" w:line="252"/>
+            </w:pPr>
+            <w:r>
+              <w:rPr>
+                <w:rFonts w:ascii="Arial" w:cs="Arial" w:eastAsia="Arial" w:hAnsi="Arial"/>
+                <w:b/>
+                <w:bCs/>
+                <w:color w:val="0B6E5F"/>
+                <w:sz w:val="19"/>
+                <w:szCs w:val="19"/>
+              </w:rPr>
+              <w:t xml:space="preserve">NO GITHUB DESKTOP?  </w:t>
+            </w:r>
+            <w:r>
+              <w:rPr>
+                <w:rFonts w:ascii="Arial" w:cs="Arial" w:eastAsia="Arial" w:hAnsi="Arial"/>
+                <w:sz w:val="19"/>
+                <w:szCs w:val="19"/>
+              </w:rPr>
+              <w:t xml:space="preserve">Open a Claude Code session on an empty folder and ask Claude: </w:t>
+            </w:r>
+            <w:r>
+              <w:rPr>
+                <w:rFonts w:ascii="Arial" w:cs="Arial" w:eastAsia="Arial" w:hAnsi="Arial"/>
+                <w:i/>
+                <w:iCs/>
+                <w:sz w:val="19"/>
+                <w:szCs w:val="19"/>
+              </w:rPr>
+              <w:t xml:space="preserve">Clone https://github.com/&lt;your-username&gt;/campusly into this folder, then open it.</w:t>
+            </w:r>
+            <w:r>
+              <w:rPr>
+                <w:rFonts w:ascii="Arial" w:cs="Arial" w:eastAsia="Arial" w:hAnsi="Arial"/>
+                <w:sz w:val="19"/>
+                <w:szCs w:val="19"/>
+              </w:rPr>
+              <w:t xml:space="preserve"> Then start a new session on the campusly folder it creates. You may need to sign in to GitHub later, when you save your work (Part 11).</w:t>
+            </w:r>
+          </w:p>
+        </w:tc>
+      </w:tr>
+    </w:tbl>
+    <w:p>
+      <w:pPr>
+        <w:spacing w:after="120" w:before="0" w:line="276"/>
+      </w:pPr>
+    </w:p>
+    <w:p>
+      <w:pPr>
+        <w:pStyle w:val="Heading2"/>
+      </w:pPr>
+      <w:r>
+        <w:rPr>
+          <w:rFonts w:ascii="Arial" w:cs="Arial" w:eastAsia="Arial" w:hAnsi="Arial"/>
+        </w:rPr>
+        <w:t xml:space="preserve">0.5 Orient prompt: set up and run</w:t>
       </w:r>
     </w:p>
     <w:p>
@@ -2743,21 +3093,7 @@
         <w:rPr>
           <w:rFonts w:ascii="Arial" w:cs="Arial" w:eastAsia="Arial" w:hAnsi="Arial"/>
         </w:rPr>
-        <w:t xml:space="preserve">Open the cloned folder in Claude Code. Claude automatically reads </w:t>
-      </w:r>
-      <w:r>
-        <w:rPr>
-          <w:rFonts w:ascii="Arial" w:cs="Arial" w:eastAsia="Arial" w:hAnsi="Arial"/>
-          <w:b/>
-          <w:bCs/>
-        </w:rPr>
-        <w:t xml:space="preserve">CLAUDE.md</w:t>
-      </w:r>
-      <w:r>
-        <w:rPr>
-          <w:rFonts w:ascii="Arial" w:cs="Arial" w:eastAsia="Arial" w:hAnsi="Arial"/>
-        </w:rPr>
-        <w:t xml:space="preserve">, the project's briefing file. Then send this prompt:</w:t>
+        <w:t xml:space="preserve">This is the first message you send in the new project:</w:t>
       </w:r>
     </w:p>
     <w:tbl>
@@ -2808,7 +3144,7 @@
                 <w:sz w:val="18"/>
                 <w:szCs w:val="18"/>
               </w:rPr>
-              <w:t xml:space="preserve">EXPLORE PROMPT 0.3</w:t>
+              <w:t xml:space="preserve">EXPLORE PROMPT 0.5</w:t>
             </w:r>
           </w:p>
         </w:tc>
@@ -2910,7 +3246,7 @@
                 <w:sz w:val="19"/>
                 <w:szCs w:val="19"/>
               </w:rPr>
-              <w:t xml:space="preserve">I have just cloned my fork of the public Campusly repository (github.com/shivavashishtha/campusly). I am new to coding.</w:t>
+              <w:t xml:space="preserve">This folder is my fork of the public Campusly repository (github.com/shivavashishtha/campusly). I am new to coding and I will do everything through this chat.</w:t>
             </w:r>
           </w:p>
         </w:tc>
@@ -3114,7 +3450,7 @@
                 <w:sz w:val="19"/>
                 <w:szCs w:val="19"/>
               </w:rPr>
-              <w:t xml:space="preserve">Do not change any code. If Node.js is missing, tell me how to install it instead of trying workarounds. Never ask me to paste passwords or keys into the chat.</w:t>
+              <w:t xml:space="preserve">Do not change any code. If Node.js is missing, tell me how to install it from nodejs.org instead of trying workarounds. Never ask me to paste passwords or keys into the chat.</w:t>
             </w:r>
           </w:p>
         </w:tc>
@@ -3263,13 +3599,38 @@
     </w:p>
     <w:p>
       <w:pPr>
+        <w:spacing w:after="120" w:before="0" w:line="276"/>
+      </w:pPr>
+      <w:r>
+        <w:rPr>
+          <w:rFonts w:ascii="Arial" w:cs="Arial" w:eastAsia="Arial" w:hAnsi="Arial"/>
+        </w:rPr>
+        <w:t xml:space="preserve">The first run takes a few minutes: Claude installs the packages, creates the demo schools and starts the app. </w:t>
+      </w:r>
+      <w:r>
+        <w:rPr>
+          <w:rFonts w:ascii="Arial" w:cs="Arial" w:eastAsia="Arial" w:hAnsi="Arial"/>
+          <w:b/>
+          <w:bCs/>
+        </w:rPr>
+        <w:t xml:space="preserve">Keep this session open while you use the app</w:t>
+      </w:r>
+      <w:r>
+        <w:rPr>
+          <w:rFonts w:ascii="Arial" w:cs="Arial" w:eastAsia="Arial" w:hAnsi="Arial"/>
+        </w:rPr>
+        <w:t xml:space="preserve">; if you close it, ask Claude to start the app again.</w:t>
+      </w:r>
+    </w:p>
+    <w:p>
+      <w:pPr>
         <w:pStyle w:val="Heading2"/>
       </w:pPr>
       <w:r>
         <w:rPr>
           <w:rFonts w:ascii="Arial" w:cs="Arial" w:eastAsia="Arial" w:hAnsi="Arial"/>
         </w:rPr>
-        <w:t xml:space="preserve">0.4 Sign in</w:t>
+        <w:t xml:space="preserve">0.6 Sign in</w:t>
       </w:r>
     </w:p>
     <w:p>
@@ -3277,7 +3638,7 @@
         <w:pStyle w:val="ListParagraph"/>
         <w:numPr>
           <w:ilvl w:val="0"/>
-          <w:numId w:val="3"/>
+          <w:numId w:val="5"/>
         </w:numPr>
         <w:spacing w:after="70" w:line="264"/>
       </w:pPr>
@@ -3299,7 +3660,7 @@
         <w:rPr>
           <w:rFonts w:ascii="Arial" w:cs="Arial" w:eastAsia="Arial" w:hAnsi="Arial"/>
         </w:rPr>
-        <w:t xml:space="preserve"> and click </w:t>
+        <w:t xml:space="preserve"> in your browser and click </w:t>
       </w:r>
       <w:r>
         <w:rPr>
@@ -3321,7 +3682,7 @@
         <w:pStyle w:val="ListParagraph"/>
         <w:numPr>
           <w:ilvl w:val="0"/>
-          <w:numId w:val="3"/>
+          <w:numId w:val="5"/>
         </w:numPr>
         <w:spacing w:after="70" w:line="264"/>
       </w:pPr>
@@ -3365,7 +3726,7 @@
         <w:pStyle w:val="ListParagraph"/>
         <w:numPr>
           <w:ilvl w:val="0"/>
-          <w:numId w:val="3"/>
+          <w:numId w:val="5"/>
         </w:numPr>
         <w:spacing w:after="70" w:line="264"/>
       </w:pPr>
@@ -3401,7 +3762,7 @@
           <wp:inline distT="0" distB="0" distL="0" distR="0">
             <wp:extent cx="5486400" cy="3429000"/>
             <wp:effectExtent t="0" r="0" b="0" l="0"/>
-            <wp:docPr id="3" name="Figure 0.2" descr="After signing in as the principal: two schools to choose from" title="Figure 0.2"/>
+            <wp:docPr id="3" name="Figure 0.3" descr="After signing in as the principal: two schools to choose from" title="Figure 0.3"/>
             <wp:cNvGraphicFramePr>
               <a:graphicFrameLocks xmlns:a="http://schemas.openxmlformats.org/drawingml/2006/main" noChangeAspect="1"/>
             </wp:cNvGraphicFramePr>
@@ -3451,7 +3812,7 @@
           <w:sz w:val="17"/>
           <w:szCs w:val="17"/>
         </w:rPr>
-        <w:t xml:space="preserve">Figure 0.2  </w:t>
+        <w:t xml:space="preserve">Figure 0.3  </w:t>
       </w:r>
       <w:r>
         <w:rPr>
@@ -3593,7 +3954,7 @@
         <w:rPr>
           <w:rFonts w:ascii="Arial" w:cs="Arial" w:eastAsia="Arial" w:hAnsi="Arial"/>
         </w:rPr>
-        <w:t xml:space="preserve">0.5 Compare with the live app</w:t>
+        <w:t xml:space="preserve">0.7 Compare with the live app</w:t>
       </w:r>
     </w:p>
     <w:p>
@@ -3618,7 +3979,7 @@
         <w:rPr>
           <w:rFonts w:ascii="Arial" w:cs="Arial" w:eastAsia="Arial" w:hAnsi="Arial"/>
         </w:rPr>
-        <w:t xml:space="preserve">. Open it on your phone and sign in with the same account. Sign-up is closed there on purpose (it's a shared classroom demo), and the demo data is reset before each class. Your local copy is yours to change; the live one is not.</w:t>
+        <w:t xml:space="preserve">. Open it on your phone and sign in with the same account. Sign-up is closed there on purpose (it's a shared classroom demo), and the demo data is reset before each class. Your copy in Claude Code is yours to change; the live one is not.</w:t>
       </w:r>
     </w:p>
     <w:p>
@@ -4305,7 +4666,7 @@
         <w:pStyle w:val="ListParagraph"/>
         <w:numPr>
           <w:ilvl w:val="0"/>
-          <w:numId w:val="4"/>
+          <w:numId w:val="6"/>
         </w:numPr>
         <w:spacing w:after="70" w:line="264"/>
       </w:pPr>
@@ -4329,7 +4690,7 @@
         <w:pStyle w:val="ListParagraph"/>
         <w:numPr>
           <w:ilvl w:val="0"/>
-          <w:numId w:val="4"/>
+          <w:numId w:val="6"/>
         </w:numPr>
         <w:spacing w:after="70" w:line="264"/>
       </w:pPr>
@@ -4353,7 +4714,7 @@
         <w:pStyle w:val="ListParagraph"/>
         <w:numPr>
           <w:ilvl w:val="0"/>
-          <w:numId w:val="4"/>
+          <w:numId w:val="6"/>
         </w:numPr>
         <w:spacing w:after="70" w:line="264"/>
       </w:pPr>
@@ -5089,7 +5450,7 @@
                 <w:sz w:val="19"/>
                 <w:szCs w:val="19"/>
               </w:rPr>
-              <w:t xml:space="preserve">Changes files?</w:t>
+              <w:t xml:space="preserve">Where you send it</w:t>
             </w:r>
           </w:p>
         </w:tc>
@@ -5117,20 +5478,10 @@
             <w:r>
               <w:rPr>
                 <w:rFonts w:ascii="Arial" w:cs="Arial" w:eastAsia="Arial" w:hAnsi="Arial"/>
-                <w:b/>
-                <w:bCs/>
-                <w:sz w:val="19"/>
-                <w:szCs w:val="19"/>
-              </w:rPr>
-              <w:t xml:space="preserve">Never.</w:t>
-            </w:r>
-            <w:r>
-              <w:rPr>
-                <w:rFonts w:ascii="Arial" w:cs="Arial" w:eastAsia="Arial" w:hAnsi="Arial"/>
-                <w:sz w:val="19"/>
-                <w:szCs w:val="19"/>
-              </w:rPr>
-              <w:t xml:space="preserve"> Always says "Do not change any files"</w:t>
+                <w:sz w:val="19"/>
+                <w:szCs w:val="19"/>
+              </w:rPr>
+              <w:t xml:space="preserve">The Claude Code chat, in your campusly project</w:t>
             </w:r>
           </w:p>
         </w:tc>
@@ -5161,7 +5512,7 @@
                 <w:sz w:val="19"/>
                 <w:szCs w:val="19"/>
               </w:rPr>
-              <w:t xml:space="preserve">Yes, on a separate branch</w:t>
+              <w:t xml:space="preserve">The Claude Code chat, in your campusly project</w:t>
             </w:r>
           </w:p>
         </w:tc>
@@ -5196,7 +5547,7 @@
                 <w:sz w:val="19"/>
                 <w:szCs w:val="19"/>
               </w:rPr>
-              <w:t xml:space="preserve">What Claude returns</w:t>
+              <w:t xml:space="preserve">Changes files?</w:t>
             </w:r>
           </w:p>
         </w:tc>
@@ -5223,10 +5574,20 @@
             <w:r>
               <w:rPr>
                 <w:rFonts w:ascii="Arial" w:cs="Arial" w:eastAsia="Arial" w:hAnsi="Arial"/>
-                <w:sz w:val="19"/>
-                <w:szCs w:val="19"/>
-              </w:rPr>
-              <w:t xml:space="preserve">Evidence: file names, the relevant lines, a command you can run</w:t>
+                <w:b/>
+                <w:bCs/>
+                <w:sz w:val="19"/>
+                <w:szCs w:val="19"/>
+              </w:rPr>
+              <w:t xml:space="preserve">Never.</w:t>
+            </w:r>
+            <w:r>
+              <w:rPr>
+                <w:rFonts w:ascii="Arial" w:cs="Arial" w:eastAsia="Arial" w:hAnsi="Arial"/>
+                <w:sz w:val="19"/>
+                <w:szCs w:val="19"/>
+              </w:rPr>
+              <w:t xml:space="preserve"> Always says "Do not change any files"</w:t>
             </w:r>
           </w:p>
         </w:tc>
@@ -5256,7 +5617,7 @@
                 <w:sz w:val="19"/>
                 <w:szCs w:val="19"/>
               </w:rPr>
-              <w:t xml:space="preserve">A plan, then code, tests and a summary</w:t>
+              <w:t xml:space="preserve">Yes, on a separate branch</w:t>
             </w:r>
           </w:p>
         </w:tc>
@@ -5292,6 +5653,103 @@
                 <w:sz w:val="19"/>
                 <w:szCs w:val="19"/>
               </w:rPr>
+              <w:t xml:space="preserve">What Claude returns</w:t>
+            </w:r>
+          </w:p>
+        </w:tc>
+        <w:tc>
+          <w:tcPr>
+            <w:tcW w:type="dxa" w:w="3563"/>
+            <w:tcBorders>
+              <w:top w:val="single" w:color="DBE3DA" w:sz="4"/>
+              <w:left w:val="single" w:color="DBE3DA" w:sz="4"/>
+              <w:bottom w:val="single" w:color="DBE3DA" w:sz="4"/>
+              <w:right w:val="single" w:color="DBE3DA" w:sz="4"/>
+            </w:tcBorders>
+            <w:shd w:fill="FAFBF9" w:color="auto" w:val="clear"/>
+            <w:tcMar>
+              <w:top w:type="dxa" w:w="80"/>
+              <w:left w:type="dxa" w:w="120"/>
+              <w:bottom w:type="dxa" w:w="80"/>
+              <w:right w:type="dxa" w:w="120"/>
+            </w:tcMar>
+          </w:tcPr>
+          <w:p>
+            <w:pPr>
+              <w:spacing w:after="40" w:line="252"/>
+            </w:pPr>
+            <w:r>
+              <w:rPr>
+                <w:rFonts w:ascii="Arial" w:cs="Arial" w:eastAsia="Arial" w:hAnsi="Arial"/>
+                <w:sz w:val="19"/>
+                <w:szCs w:val="19"/>
+              </w:rPr>
+              <w:t xml:space="preserve">Evidence: file names, the relevant lines, and the result of anything it ran</w:t>
+            </w:r>
+          </w:p>
+        </w:tc>
+        <w:tc>
+          <w:tcPr>
+            <w:tcW w:type="dxa" w:w="3563"/>
+            <w:tcBorders>
+              <w:top w:val="single" w:color="DBE3DA" w:sz="4"/>
+              <w:left w:val="single" w:color="DBE3DA" w:sz="4"/>
+              <w:bottom w:val="single" w:color="DBE3DA" w:sz="4"/>
+              <w:right w:val="single" w:color="DBE3DA" w:sz="4"/>
+            </w:tcBorders>
+            <w:shd w:fill="FAFBF9" w:color="auto" w:val="clear"/>
+            <w:tcMar>
+              <w:top w:type="dxa" w:w="80"/>
+              <w:left w:type="dxa" w:w="120"/>
+              <w:bottom w:type="dxa" w:w="80"/>
+              <w:right w:type="dxa" w:w="120"/>
+            </w:tcMar>
+          </w:tcPr>
+          <w:p>
+            <w:pPr>
+              <w:spacing w:after="40" w:line="252"/>
+            </w:pPr>
+            <w:r>
+              <w:rPr>
+                <w:rFonts w:ascii="Arial" w:cs="Arial" w:eastAsia="Arial" w:hAnsi="Arial"/>
+                <w:sz w:val="19"/>
+                <w:szCs w:val="19"/>
+              </w:rPr>
+              <w:t xml:space="preserve">A plan, then code, tests and a summary</w:t>
+            </w:r>
+          </w:p>
+        </w:tc>
+      </w:tr>
+      <w:tr>
+        <w:trPr>
+          <w:cantSplit/>
+        </w:trPr>
+        <w:tc>
+          <w:tcPr>
+            <w:tcW w:type="dxa" w:w="1900"/>
+            <w:tcBorders>
+              <w:top w:val="single" w:color="DBE3DA" w:sz="4"/>
+              <w:left w:val="single" w:color="DBE3DA" w:sz="4"/>
+              <w:bottom w:val="single" w:color="DBE3DA" w:sz="4"/>
+              <w:right w:val="single" w:color="DBE3DA" w:sz="4"/>
+            </w:tcBorders>
+            <w:tcMar>
+              <w:top w:type="dxa" w:w="80"/>
+              <w:left w:type="dxa" w:w="120"/>
+              <w:bottom w:type="dxa" w:w="80"/>
+              <w:right w:type="dxa" w:w="120"/>
+            </w:tcMar>
+          </w:tcPr>
+          <w:p>
+            <w:pPr>
+              <w:spacing w:after="40" w:line="252"/>
+            </w:pPr>
+            <w:r>
+              <w:rPr>
+                <w:rFonts w:ascii="Arial" w:cs="Arial" w:eastAsia="Arial" w:hAnsi="Arial"/>
+                <w:sz w:val="19"/>
+                <w:szCs w:val="19"/>
+              </w:rPr>
               <w:t xml:space="preserve">You finish by</w:t>
             </w:r>
           </w:p>
@@ -5305,7 +5763,6 @@
               <w:bottom w:val="single" w:color="DBE3DA" w:sz="4"/>
               <w:right w:val="single" w:color="DBE3DA" w:sz="4"/>
             </w:tcBorders>
-            <w:shd w:fill="FAFBF9" w:color="auto" w:val="clear"/>
             <w:tcMar>
               <w:top w:type="dxa" w:w="80"/>
               <w:left w:type="dxa" w:w="120"/>
@@ -5336,7 +5793,6 @@
               <w:bottom w:val="single" w:color="DBE3DA" w:sz="4"/>
               <w:right w:val="single" w:color="DBE3DA" w:sz="4"/>
             </w:tcBorders>
-            <w:shd w:fill="FAFBF9" w:color="auto" w:val="clear"/>
             <w:tcMar>
               <w:top w:type="dxa" w:w="80"/>
               <w:left w:type="dxa" w:w="120"/>
@@ -7449,23 +7905,25 @@
                 <w:sz w:val="19"/>
                 <w:szCs w:val="19"/>
               </w:rPr>
-              <w:t xml:space="preserve">Open </w:t>
-            </w:r>
-            <w:r>
-              <w:rPr>
-                <w:rFonts w:ascii="Courier New" w:cs="Courier New" w:eastAsia="Courier New" w:hAnsi="Courier New"/>
-                <w:sz w:val="17"/>
-                <w:szCs w:val="17"/>
-              </w:rPr>
-              <w:t xml:space="preserve">docs/research/SPEC.md</w:t>
-            </w:r>
-            <w:r>
-              <w:rPr>
-                <w:rFonts w:ascii="Arial" w:cs="Arial" w:eastAsia="Arial" w:hAnsi="Arial"/>
-                <w:sz w:val="19"/>
-                <w:szCs w:val="19"/>
-              </w:rPr>
-              <w:t xml:space="preserve"> and count the must-never lines. There should be </w:t>
+              <w:t xml:space="preserve">Ask Claude: </w:t>
+            </w:r>
+            <w:r>
+              <w:rPr>
+                <w:rFonts w:ascii="Arial" w:cs="Arial" w:eastAsia="Arial" w:hAnsi="Arial"/>
+                <w:i/>
+                <w:iCs/>
+                <w:sz w:val="19"/>
+                <w:szCs w:val="19"/>
+              </w:rPr>
+              <w:t xml:space="preserve">Show me the must-never lines in docs/research/SPEC.md, numbered.</w:t>
+            </w:r>
+            <w:r>
+              <w:rPr>
+                <w:rFonts w:ascii="Arial" w:cs="Arial" w:eastAsia="Arial" w:hAnsi="Arial"/>
+                <w:sz w:val="19"/>
+                <w:szCs w:val="19"/>
+              </w:rPr>
+              <w:t xml:space="preserve"> There should be </w:t>
             </w:r>
             <w:r>
               <w:rPr>
@@ -7483,23 +7941,25 @@
                 <w:sz w:val="19"/>
                 <w:szCs w:val="19"/>
               </w:rPr>
-              <w:t xml:space="preserve">. Then read Entry 2 of </w:t>
-            </w:r>
-            <w:r>
-              <w:rPr>
-                <w:rFonts w:ascii="Courier New" w:cs="Courier New" w:eastAsia="Courier New" w:hAnsi="Courier New"/>
-                <w:sz w:val="17"/>
-                <w:szCs w:val="17"/>
-              </w:rPr>
-              <w:t xml:space="preserve">docs/DECISION_JOURNAL.md</w:t>
-            </w:r>
-            <w:r>
-              <w:rPr>
-                <w:rFonts w:ascii="Arial" w:cs="Arial" w:eastAsia="Arial" w:hAnsi="Arial"/>
-                <w:sz w:val="19"/>
-                <w:szCs w:val="19"/>
-              </w:rPr>
-              <w:t xml:space="preserve"> to see the four questions that were asked.</w:t>
+              <w:t xml:space="preserve">. Then ask: </w:t>
+            </w:r>
+            <w:r>
+              <w:rPr>
+                <w:rFonts w:ascii="Arial" w:cs="Arial" w:eastAsia="Arial" w:hAnsi="Arial"/>
+                <w:i/>
+                <w:iCs/>
+                <w:sz w:val="19"/>
+                <w:szCs w:val="19"/>
+              </w:rPr>
+              <w:t xml:space="preserve">Show me Entry 2 of docs/DECISION_JOURNAL.md.</w:t>
+            </w:r>
+            <w:r>
+              <w:rPr>
+                <w:rFonts w:ascii="Arial" w:cs="Arial" w:eastAsia="Arial" w:hAnsi="Arial"/>
+                <w:sz w:val="19"/>
+                <w:szCs w:val="19"/>
+              </w:rPr>
+              <w:t xml:space="preserve"> You see the four questions that were asked.</w:t>
             </w:r>
           </w:p>
         </w:tc>
@@ -9044,23 +9504,25 @@
                 <w:sz w:val="19"/>
                 <w:szCs w:val="19"/>
               </w:rPr>
-              <w:t xml:space="preserve">Run </w:t>
-            </w:r>
-            <w:r>
-              <w:rPr>
-                <w:rFonts w:ascii="Courier New" w:cs="Courier New" w:eastAsia="Courier New" w:hAnsi="Courier New"/>
-                <w:sz w:val="17"/>
-                <w:szCs w:val="17"/>
-              </w:rPr>
-              <w:t xml:space="preserve">pnpm vitest run tests/integration/exams-fees.test.ts</w:t>
-            </w:r>
-            <w:r>
-              <w:rPr>
-                <w:rFonts w:ascii="Arial" w:cs="Arial" w:eastAsia="Arial" w:hAnsi="Arial"/>
-                <w:sz w:val="19"/>
-                <w:szCs w:val="19"/>
-              </w:rPr>
-              <w:t xml:space="preserve">. All tests pass, including </w:t>
+              <w:t xml:space="preserve">Ask Claude: </w:t>
+            </w:r>
+            <w:r>
+              <w:rPr>
+                <w:rFonts w:ascii="Arial" w:cs="Arial" w:eastAsia="Arial" w:hAnsi="Arial"/>
+                <w:i/>
+                <w:iCs/>
+                <w:sz w:val="19"/>
+                <w:szCs w:val="19"/>
+              </w:rPr>
+              <w:t xml:space="preserve">Run the exams and fees integration tests and tell me if the double-click payment test passes.</w:t>
+            </w:r>
+            <w:r>
+              <w:rPr>
+                <w:rFonts w:ascii="Arial" w:cs="Arial" w:eastAsia="Arial" w:hAnsi="Arial"/>
+                <w:sz w:val="19"/>
+                <w:szCs w:val="19"/>
+              </w:rPr>
+              <w:t xml:space="preserve"> Claude reports that all of them pass, including </w:t>
             </w:r>
             <w:r>
               <w:rPr>
@@ -10928,39 +11390,25 @@
                 <w:sz w:val="19"/>
                 <w:szCs w:val="19"/>
               </w:rPr>
-              <w:t xml:space="preserve">Click the sun/moon button on any page and reload: your choice stays. Then run </w:t>
-            </w:r>
-            <w:r>
-              <w:rPr>
-                <w:rFonts w:ascii="Courier New" w:cs="Courier New" w:eastAsia="Courier New" w:hAnsi="Courier New"/>
-                <w:sz w:val="17"/>
-                <w:szCs w:val="17"/>
-              </w:rPr>
-              <w:t xml:space="preserve">pnpm exec playwright test tests/e2e/theme.spec.ts</w:t>
-            </w:r>
-            <w:r>
-              <w:rPr>
-                <w:rFonts w:ascii="Arial" w:cs="Arial" w:eastAsia="Arial" w:hAnsi="Arial"/>
-                <w:sz w:val="19"/>
-                <w:szCs w:val="19"/>
-              </w:rPr>
-              <w:t xml:space="preserve"> (first time: </w:t>
-            </w:r>
-            <w:r>
-              <w:rPr>
-                <w:rFonts w:ascii="Courier New" w:cs="Courier New" w:eastAsia="Courier New" w:hAnsi="Courier New"/>
-                <w:sz w:val="17"/>
-                <w:szCs w:val="17"/>
-              </w:rPr>
-              <w:t xml:space="preserve">pnpm exec playwright install chromium</w:t>
-            </w:r>
-            <w:r>
-              <w:rPr>
-                <w:rFonts w:ascii="Arial" w:cs="Arial" w:eastAsia="Arial" w:hAnsi="Arial"/>
-                <w:sz w:val="19"/>
-                <w:szCs w:val="19"/>
-              </w:rPr>
-              <w:t xml:space="preserve">). </w:t>
+              <w:t xml:space="preserve">Click the sun/moon button on any page and reload: your choice stays. Then ask Claude: </w:t>
+            </w:r>
+            <w:r>
+              <w:rPr>
+                <w:rFonts w:ascii="Arial" w:cs="Arial" w:eastAsia="Arial" w:hAnsi="Arial"/>
+                <w:i/>
+                <w:iCs/>
+                <w:sz w:val="19"/>
+                <w:szCs w:val="19"/>
+              </w:rPr>
+              <w:t xml:space="preserve">Run the browser tests for the theme toggle.</w:t>
+            </w:r>
+            <w:r>
+              <w:rPr>
+                <w:rFonts w:ascii="Arial" w:cs="Arial" w:eastAsia="Arial" w:hAnsi="Arial"/>
+                <w:sz w:val="19"/>
+                <w:szCs w:val="19"/>
+              </w:rPr>
+              <w:t xml:space="preserve"> (The first time, Claude also installs the test browser.) Claude reports </w:t>
             </w:r>
             <w:r>
               <w:rPr>
@@ -10970,7 +11418,15 @@
                 <w:sz w:val="19"/>
                 <w:szCs w:val="19"/>
               </w:rPr>
-              <w:t xml:space="preserve">2 passed.</w:t>
+              <w:t xml:space="preserve">2 passed</w:t>
+            </w:r>
+            <w:r>
+              <w:rPr>
+                <w:rFonts w:ascii="Arial" w:cs="Arial" w:eastAsia="Arial" w:hAnsi="Arial"/>
+                <w:sz w:val="19"/>
+                <w:szCs w:val="19"/>
+              </w:rPr>
+              <w:t xml:space="preserve">.</w:t>
             </w:r>
           </w:p>
         </w:tc>
@@ -12653,39 +13109,25 @@
                 <w:sz w:val="19"/>
                 <w:szCs w:val="19"/>
               </w:rPr>
-              <w:t xml:space="preserve">Run </w:t>
-            </w:r>
-            <w:r>
-              <w:rPr>
-                <w:rFonts w:ascii="Courier New" w:cs="Courier New" w:eastAsia="Courier New" w:hAnsi="Courier New"/>
-                <w:sz w:val="17"/>
-                <w:szCs w:val="17"/>
-              </w:rPr>
-              <w:t xml:space="preserve">pnpm typecheck</w:t>
-            </w:r>
-            <w:r>
-              <w:rPr>
-                <w:rFonts w:ascii="Arial" w:cs="Arial" w:eastAsia="Arial" w:hAnsi="Arial"/>
-                <w:sz w:val="19"/>
-                <w:szCs w:val="19"/>
-              </w:rPr>
-              <w:t xml:space="preserve"> then </w:t>
-            </w:r>
-            <w:r>
-              <w:rPr>
-                <w:rFonts w:ascii="Courier New" w:cs="Courier New" w:eastAsia="Courier New" w:hAnsi="Courier New"/>
-                <w:sz w:val="17"/>
-                <w:szCs w:val="17"/>
-              </w:rPr>
-              <w:t xml:space="preserve">pnpm lint</w:t>
-            </w:r>
-            <w:r>
-              <w:rPr>
-                <w:rFonts w:ascii="Arial" w:cs="Arial" w:eastAsia="Arial" w:hAnsi="Arial"/>
-                <w:sz w:val="19"/>
-                <w:szCs w:val="19"/>
-              </w:rPr>
-              <w:t xml:space="preserve">. Both finish </w:t>
+              <w:t xml:space="preserve">Ask Claude: </w:t>
+            </w:r>
+            <w:r>
+              <w:rPr>
+                <w:rFonts w:ascii="Arial" w:cs="Arial" w:eastAsia="Arial" w:hAnsi="Arial"/>
+                <w:i/>
+                <w:iCs/>
+                <w:sz w:val="19"/>
+                <w:szCs w:val="19"/>
+              </w:rPr>
+              <w:t xml:space="preserve">Run the type check and the linter, and tell me if there are any errors.</w:t>
+            </w:r>
+            <w:r>
+              <w:rPr>
+                <w:rFonts w:ascii="Arial" w:cs="Arial" w:eastAsia="Arial" w:hAnsi="Arial"/>
+                <w:sz w:val="19"/>
+                <w:szCs w:val="19"/>
+              </w:rPr>
+              <w:t xml:space="preserve"> Claude reports </w:t>
             </w:r>
             <w:r>
               <w:rPr>
@@ -12695,7 +13137,7 @@
                 <w:sz w:val="19"/>
                 <w:szCs w:val="19"/>
               </w:rPr>
-              <w:t xml:space="preserve">with no errors</w:t>
+              <w:t xml:space="preserve">no errors</w:t>
             </w:r>
             <w:r>
               <w:rPr>
@@ -14435,6 +14877,24 @@
         <w:spacing w:after="80" w:before="0" w:line="276"/>
       </w:pPr>
     </w:p>
+    <w:p>
+      <w:pPr>
+        <w:keepNext/>
+        <w:spacing w:after="60" w:before="160"/>
+      </w:pPr>
+      <w:r>
+        <w:rPr>
+          <w:rFonts w:ascii="Arial" w:cs="Arial" w:eastAsia="Arial" w:hAnsi="Arial"/>
+          <w:b/>
+          <w:bCs/>
+          <w:color w:val="0B6E5F"/>
+          <w:spacing w:val="20"/>
+          <w:sz w:val="18"/>
+          <w:szCs w:val="18"/>
+        </w:rPr>
+        <w:t xml:space="preserve">WHAT CLAUDE REPORTS</w:t>
+      </w:r>
+    </w:p>
     <w:tbl>
       <w:tblPr>
         <w:tblW w:type="dxa" w:w="9026"/>
@@ -14479,7 +14939,7 @@
                 <w:sz w:val="17"/>
                 <w:szCs w:val="17"/>
               </w:rPr>
-              <w:t xml:space="preserve">$ pnpm vitest run tests/unit</w:t>
+              <w:t xml:space="preserve">Test Files  5 passed (5)</w:t>
             </w:r>
           </w:p>
           <w:p>
@@ -14492,20 +14952,7 @@
                 <w:sz w:val="17"/>
                 <w:szCs w:val="17"/>
               </w:rPr>
-              <w:t xml:space="preserve"> Test Files  5 passed (5)</w:t>
-            </w:r>
-          </w:p>
-          <w:p>
-            <w:pPr>
-              <w:spacing w:after="0" w:line="240"/>
-            </w:pPr>
-            <w:r>
-              <w:rPr>
-                <w:rFonts w:ascii="Courier New" w:cs="Courier New" w:eastAsia="Courier New" w:hAnsi="Courier New"/>
-                <w:sz w:val="17"/>
-                <w:szCs w:val="17"/>
-              </w:rPr>
-              <w:t xml:space="preserve">      Tests  20 passed (20)</w:t>
+              <w:t xml:space="preserve">     Tests  20 passed (20)</w:t>
             </w:r>
           </w:p>
         </w:tc>
@@ -14571,23 +15018,25 @@
                 <w:sz w:val="19"/>
                 <w:szCs w:val="19"/>
               </w:rPr>
-              <w:t xml:space="preserve">Run </w:t>
-            </w:r>
-            <w:r>
-              <w:rPr>
-                <w:rFonts w:ascii="Courier New" w:cs="Courier New" w:eastAsia="Courier New" w:hAnsi="Courier New"/>
-                <w:sz w:val="17"/>
-                <w:szCs w:val="17"/>
-              </w:rPr>
-              <w:t xml:space="preserve">pnpm vitest run tests/unit</w:t>
-            </w:r>
-            <w:r>
-              <w:rPr>
-                <w:rFonts w:ascii="Arial" w:cs="Arial" w:eastAsia="Arial" w:hAnsi="Arial"/>
-                <w:sz w:val="19"/>
-                <w:szCs w:val="19"/>
-              </w:rPr>
-              <w:t xml:space="preserve">. </w:t>
+              <w:t xml:space="preserve">Ask Claude: </w:t>
+            </w:r>
+            <w:r>
+              <w:rPr>
+                <w:rFonts w:ascii="Arial" w:cs="Arial" w:eastAsia="Arial" w:hAnsi="Arial"/>
+                <w:i/>
+                <w:iCs/>
+                <w:sz w:val="19"/>
+                <w:szCs w:val="19"/>
+              </w:rPr>
+              <w:t xml:space="preserve">Run the unit tests.</w:t>
+            </w:r>
+            <w:r>
+              <w:rPr>
+                <w:rFonts w:ascii="Arial" w:cs="Arial" w:eastAsia="Arial" w:hAnsi="Arial"/>
+                <w:sz w:val="19"/>
+                <w:szCs w:val="19"/>
+              </w:rPr>
+              <w:t xml:space="preserve"> </w:t>
             </w:r>
             <w:r>
               <w:rPr>
@@ -14605,7 +15054,7 @@
                 <w:sz w:val="19"/>
                 <w:szCs w:val="19"/>
               </w:rPr>
-              <w:t xml:space="preserve"> Then ask Claude: </w:t>
+              <w:t xml:space="preserve"> Then ask: </w:t>
             </w:r>
             <w:r>
               <w:rPr>
@@ -14615,31 +15064,7 @@
                 <w:sz w:val="19"/>
                 <w:szCs w:val="19"/>
               </w:rPr>
-              <w:t xml:space="preserve">why does tests/unit/money.test.ts check 0.29?</w:t>
-            </w:r>
-            <w:r>
-              <w:rPr>
-                <w:rFonts w:ascii="Arial" w:cs="Arial" w:eastAsia="Arial" w:hAnsi="Arial"/>
-                <w:sz w:val="19"/>
-                <w:szCs w:val="19"/>
-              </w:rPr>
-              <w:t xml:space="preserve"> (Hint: type </w:t>
-            </w:r>
-            <w:r>
-              <w:rPr>
-                <w:rFonts w:ascii="Courier New" w:cs="Courier New" w:eastAsia="Courier New" w:hAnsi="Courier New"/>
-                <w:sz w:val="17"/>
-                <w:szCs w:val="17"/>
-              </w:rPr>
-              <w:t xml:space="preserve">0.29 * 100</w:t>
-            </w:r>
-            <w:r>
-              <w:rPr>
-                <w:rFonts w:ascii="Arial" w:cs="Arial" w:eastAsia="Arial" w:hAnsi="Arial"/>
-                <w:sz w:val="19"/>
-                <w:szCs w:val="19"/>
-              </w:rPr>
-              <w:t xml:space="preserve"> into a JavaScript console.)</w:t>
+              <w:t xml:space="preserve">Why does tests/unit/money.test.ts check 0.29? Show me what 0.29 × 100 gives in JavaScript.</w:t>
             </w:r>
           </w:p>
         </w:tc>
@@ -17395,23 +17820,7 @@
                 <w:sz w:val="19"/>
                 <w:szCs w:val="19"/>
               </w:rPr>
-              <w:t xml:space="preserve">You run </w:t>
-            </w:r>
-            <w:r>
-              <w:rPr>
-                <w:rFonts w:ascii="Courier New" w:cs="Courier New" w:eastAsia="Courier New" w:hAnsi="Courier New"/>
-                <w:sz w:val="17"/>
-                <w:szCs w:val="17"/>
-              </w:rPr>
-              <w:t xml:space="preserve">pnpm test</w:t>
-            </w:r>
-            <w:r>
-              <w:rPr>
-                <w:rFonts w:ascii="Arial" w:cs="Arial" w:eastAsia="Arial" w:hAnsi="Arial"/>
-                <w:sz w:val="19"/>
-                <w:szCs w:val="19"/>
-              </w:rPr>
-              <w:t xml:space="preserve"> and report the totals.</w:t>
+              <w:t xml:space="preserve">You run all the tests and report the totals.</w:t>
             </w:r>
           </w:p>
         </w:tc>
@@ -18076,6 +18485,24 @@
         <w:spacing w:after="80" w:before="0" w:line="276"/>
       </w:pPr>
     </w:p>
+    <w:p>
+      <w:pPr>
+        <w:keepNext/>
+        <w:spacing w:after="60" w:before="160"/>
+      </w:pPr>
+      <w:r>
+        <w:rPr>
+          <w:rFonts w:ascii="Arial" w:cs="Arial" w:eastAsia="Arial" w:hAnsi="Arial"/>
+          <w:b/>
+          <w:bCs/>
+          <w:color w:val="0B6E5F"/>
+          <w:spacing w:val="20"/>
+          <w:sz w:val="18"/>
+          <w:szCs w:val="18"/>
+        </w:rPr>
+        <w:t xml:space="preserve">WHAT CLAUDE REPORTS</w:t>
+      </w:r>
+    </w:p>
     <w:tbl>
       <w:tblPr>
         <w:tblW w:type="dxa" w:w="9026"/>
@@ -18120,7 +18547,7 @@
                 <w:sz w:val="17"/>
                 <w:szCs w:val="17"/>
               </w:rPr>
-              <w:t xml:space="preserve">$ pnpm test</w:t>
+              <w:t xml:space="preserve">Test Files  11 passed (11)</w:t>
             </w:r>
           </w:p>
           <w:p>
@@ -18133,20 +18560,7 @@
                 <w:sz w:val="17"/>
                 <w:szCs w:val="17"/>
               </w:rPr>
-              <w:t xml:space="preserve"> Test Files  11 passed (11)</w:t>
-            </w:r>
-          </w:p>
-          <w:p>
-            <w:pPr>
-              <w:spacing w:after="0" w:line="240"/>
-            </w:pPr>
-            <w:r>
-              <w:rPr>
-                <w:rFonts w:ascii="Courier New" w:cs="Courier New" w:eastAsia="Courier New" w:hAnsi="Courier New"/>
-                <w:sz w:val="17"/>
-                <w:szCs w:val="17"/>
-              </w:rPr>
-              <w:t xml:space="preserve">      Tests  130 passed (130)</w:t>
+              <w:t xml:space="preserve">     Tests  130 passed (130)</w:t>
             </w:r>
           </w:p>
         </w:tc>
@@ -18411,39 +18825,7 @@
                 <w:sz w:val="19"/>
                 <w:szCs w:val="19"/>
               </w:rPr>
-              <w:t xml:space="preserve">In src/lib/services/students.ts, make visibleStudents() let teachers see every student, run </w:t>
-            </w:r>
-            <w:r>
-              <w:rPr>
-                <w:rFonts w:ascii="Courier New" w:cs="Courier New" w:eastAsia="Courier New" w:hAnsi="Courier New"/>
-                <w:sz w:val="17"/>
-                <w:szCs w:val="17"/>
-              </w:rPr>
-              <w:t xml:space="preserve">pnpm test</w:t>
-            </w:r>
-            <w:r>
-              <w:rPr>
-                <w:rFonts w:ascii="Arial" w:cs="Arial" w:eastAsia="Arial" w:hAnsi="Arial"/>
-                <w:sz w:val="19"/>
-                <w:szCs w:val="19"/>
-              </w:rPr>
-              <w:t xml:space="preserve">, show me which tests fail, then undo the change with </w:t>
-            </w:r>
-            <w:r>
-              <w:rPr>
-                <w:rFonts w:ascii="Courier New" w:cs="Courier New" w:eastAsia="Courier New" w:hAnsi="Courier New"/>
-                <w:sz w:val="17"/>
-                <w:szCs w:val="17"/>
-              </w:rPr>
-              <w:t xml:space="preserve">git restore</w:t>
-            </w:r>
-            <w:r>
-              <w:rPr>
-                <w:rFonts w:ascii="Arial" w:cs="Arial" w:eastAsia="Arial" w:hAnsi="Arial"/>
-                <w:sz w:val="19"/>
-                <w:szCs w:val="19"/>
-              </w:rPr>
-              <w:t xml:space="preserve"> and run the tests again.</w:t>
+              <w:t xml:space="preserve">In src/lib/services/students.ts, make visibleStudents() let teachers see every student, run all the tests, show me which tests fail, then undo the change and run the tests again.</w:t>
             </w:r>
           </w:p>
         </w:tc>
@@ -18647,23 +19029,7 @@
                 <w:sz w:val="19"/>
                 <w:szCs w:val="19"/>
               </w:rPr>
-              <w:t xml:space="preserve">First run: 2 tests fail. After restoring: all 130 pass, and </w:t>
-            </w:r>
-            <w:r>
-              <w:rPr>
-                <w:rFonts w:ascii="Courier New" w:cs="Courier New" w:eastAsia="Courier New" w:hAnsi="Courier New"/>
-                <w:sz w:val="17"/>
-                <w:szCs w:val="17"/>
-              </w:rPr>
-              <w:t xml:space="preserve">git status</w:t>
-            </w:r>
-            <w:r>
-              <w:rPr>
-                <w:rFonts w:ascii="Arial" w:cs="Arial" w:eastAsia="Arial" w:hAnsi="Arial"/>
-                <w:sz w:val="19"/>
-                <w:szCs w:val="19"/>
-              </w:rPr>
-              <w:t xml:space="preserve"> shows no changes.</w:t>
+              <w:t xml:space="preserve">First run: 2 tests fail. After undoing: all 130 pass, and no changed files are left.</w:t>
             </w:r>
           </w:p>
         </w:tc>
@@ -20141,45 +20507,47 @@
                 <w:sz w:val="19"/>
                 <w:szCs w:val="19"/>
               </w:rPr>
-              <w:t xml:space="preserve">Reset everything: stop the app, then </w:t>
-            </w:r>
-            <w:r>
-              <w:rPr>
-                <w:rFonts w:ascii="Courier New" w:cs="Courier New" w:eastAsia="Courier New" w:hAnsi="Courier New"/>
+              <w:t xml:space="preserve">Reset everything: ask Claude </w:t>
+            </w:r>
+            <w:r>
+              <w:rPr>
+                <w:rFonts w:ascii="Arial" w:cs="Arial" w:eastAsia="Arial" w:hAnsi="Arial"/>
+                <w:i/>
+                <w:iCs/>
+                <w:sz w:val="19"/>
+                <w:szCs w:val="19"/>
+              </w:rPr>
+              <w:t xml:space="preserve">Stop the app, reset the demo data, then start it again</w:t>
+            </w:r>
+          </w:p>
+        </w:tc>
+        <w:tc>
+          <w:tcPr>
+            <w:tcW w:type="dxa" w:w="3226"/>
+            <w:tcBorders>
+              <w:top w:val="single" w:color="DBE3DA" w:sz="4"/>
+              <w:left w:val="single" w:color="DBE3DA" w:sz="4"/>
+              <w:bottom w:val="single" w:color="DBE3DA" w:sz="4"/>
+              <w:right w:val="single" w:color="DBE3DA" w:sz="4"/>
+            </w:tcBorders>
+            <w:tcMar>
+              <w:top w:type="dxa" w:w="80"/>
+              <w:left w:type="dxa" w:w="120"/>
+              <w:bottom w:type="dxa" w:w="80"/>
+              <w:right w:type="dxa" w:w="120"/>
+            </w:tcMar>
+          </w:tcPr>
+          <w:p>
+            <w:pPr>
+              <w:spacing w:after="40" w:line="252"/>
+            </w:pPr>
+            <w:r>
+              <w:rPr>
+                <w:rFonts w:ascii="Arial" w:cs="Arial" w:eastAsia="Arial" w:hAnsi="Arial"/>
                 <w:sz w:val="17"/>
                 <w:szCs w:val="17"/>
               </w:rPr>
-              <w:t xml:space="preserve">pnpm seed:reset</w:t>
-            </w:r>
-          </w:p>
-        </w:tc>
-        <w:tc>
-          <w:tcPr>
-            <w:tcW w:type="dxa" w:w="3226"/>
-            <w:tcBorders>
-              <w:top w:val="single" w:color="DBE3DA" w:sz="4"/>
-              <w:left w:val="single" w:color="DBE3DA" w:sz="4"/>
-              <w:bottom w:val="single" w:color="DBE3DA" w:sz="4"/>
-              <w:right w:val="single" w:color="DBE3DA" w:sz="4"/>
-            </w:tcBorders>
-            <w:tcMar>
-              <w:top w:type="dxa" w:w="80"/>
-              <w:left w:type="dxa" w:w="120"/>
-              <w:bottom w:type="dxa" w:w="80"/>
-              <w:right w:type="dxa" w:w="120"/>
-            </w:tcMar>
-          </w:tcPr>
-          <w:p>
-            <w:pPr>
-              <w:spacing w:after="40" w:line="252"/>
-            </w:pPr>
-            <w:r>
-              <w:rPr>
-                <w:rFonts w:ascii="Arial" w:cs="Arial" w:eastAsia="Arial" w:hAnsi="Arial"/>
-                <w:sz w:val="17"/>
-                <w:szCs w:val="17"/>
-              </w:rPr>
-              <w:t xml:space="preserve">package.json</w:t>
+              <w:t xml:space="preserve">package.json (the seed:reset script)</w:t>
             </w:r>
           </w:p>
         </w:tc>
@@ -21011,23 +21379,7 @@
                 <w:sz w:val="19"/>
                 <w:szCs w:val="19"/>
               </w:rPr>
-              <w:t xml:space="preserve">You run </w:t>
-            </w:r>
-            <w:r>
-              <w:rPr>
-                <w:rFonts w:ascii="Courier New" w:cs="Courier New" w:eastAsia="Courier New" w:hAnsi="Courier New"/>
-                <w:sz w:val="17"/>
-                <w:szCs w:val="17"/>
-              </w:rPr>
-              <w:t xml:space="preserve">git log --oneline --reverse</w:t>
-            </w:r>
-            <w:r>
-              <w:rPr>
-                <w:rFonts w:ascii="Arial" w:cs="Arial" w:eastAsia="Arial" w:hAnsi="Arial"/>
-                <w:sz w:val="19"/>
-                <w:szCs w:val="19"/>
-              </w:rPr>
-              <w:t xml:space="preserve"> and map every commit to a stage.</w:t>
+              <w:t xml:space="preserve">You list every commit, oldest first, and map each one to a stage.</w:t>
             </w:r>
           </w:p>
         </w:tc>
@@ -21617,7 +21969,7 @@
                 <w:sz w:val="17"/>
                 <w:szCs w:val="17"/>
               </w:rPr>
-              <w:t xml:space="preserve">git log</w:t>
+              <w:t xml:space="preserve">The commit history</w:t>
             </w:r>
           </w:p>
         </w:tc>
@@ -21778,23 +22130,25 @@
                 <w:sz w:val="19"/>
                 <w:szCs w:val="19"/>
               </w:rPr>
-              <w:t xml:space="preserve">Run </w:t>
-            </w:r>
-            <w:r>
-              <w:rPr>
-                <w:rFonts w:ascii="Courier New" w:cs="Courier New" w:eastAsia="Courier New" w:hAnsi="Courier New"/>
-                <w:sz w:val="17"/>
-                <w:szCs w:val="17"/>
-              </w:rPr>
-              <w:t xml:space="preserve">git log --oneline --reverse</w:t>
-            </w:r>
-            <w:r>
-              <w:rPr>
-                <w:rFonts w:ascii="Arial" w:cs="Arial" w:eastAsia="Arial" w:hAnsi="Arial"/>
-                <w:sz w:val="19"/>
-                <w:szCs w:val="19"/>
-              </w:rPr>
-              <w:t xml:space="preserve">. The first commit is </w:t>
+              <w:t xml:space="preserve">Ask Claude: </w:t>
+            </w:r>
+            <w:r>
+              <w:rPr>
+                <w:rFonts w:ascii="Arial" w:cs="Arial" w:eastAsia="Arial" w:hAnsi="Arial"/>
+                <w:i/>
+                <w:iCs/>
+                <w:sz w:val="19"/>
+                <w:szCs w:val="19"/>
+              </w:rPr>
+              <w:t xml:space="preserve">List the commits, oldest first.</w:t>
+            </w:r>
+            <w:r>
+              <w:rPr>
+                <w:rFonts w:ascii="Arial" w:cs="Arial" w:eastAsia="Arial" w:hAnsi="Arial"/>
+                <w:sz w:val="19"/>
+                <w:szCs w:val="19"/>
+              </w:rPr>
+              <w:t xml:space="preserve"> The first one is </w:t>
             </w:r>
             <w:r>
               <w:rPr>
@@ -22164,7 +22518,7 @@
         <w:pStyle w:val="ListParagraph"/>
         <w:numPr>
           <w:ilvl w:val="0"/>
-          <w:numId w:val="5"/>
+          <w:numId w:val="7"/>
         </w:numPr>
         <w:spacing w:after="70" w:line="264"/>
       </w:pPr>
@@ -22172,21 +22526,21 @@
         <w:rPr>
           <w:rFonts w:ascii="Arial" w:cs="Arial" w:eastAsia="Arial" w:hAnsi="Arial"/>
         </w:rPr>
-        <w:t xml:space="preserve">Make sure the app's tests pass: </w:t>
-      </w:r>
-      <w:r>
-        <w:rPr>
-          <w:rFonts w:ascii="Courier New" w:cs="Courier New" w:eastAsia="Courier New" w:hAnsi="Courier New"/>
-          <w:sz w:val="19"/>
-          <w:szCs w:val="19"/>
-        </w:rPr>
-        <w:t xml:space="preserve">pnpm test</w:t>
-      </w:r>
-      <w:r>
-        <w:rPr>
-          <w:rFonts w:ascii="Arial" w:cs="Arial" w:eastAsia="Arial" w:hAnsi="Arial"/>
-        </w:rPr>
-        <w:t xml:space="preserve">.</w:t>
+        <w:t xml:space="preserve">Ask Claude: </w:t>
+      </w:r>
+      <w:r>
+        <w:rPr>
+          <w:rFonts w:ascii="Arial" w:cs="Arial" w:eastAsia="Arial" w:hAnsi="Arial"/>
+          <w:i/>
+          <w:iCs/>
+        </w:rPr>
+        <w:t xml:space="preserve">Run all the tests and tell me if they pass.</w:t>
+      </w:r>
+      <w:r>
+        <w:rPr>
+          <w:rFonts w:ascii="Arial" w:cs="Arial" w:eastAsia="Arial" w:hAnsi="Arial"/>
+        </w:rPr>
+        <w:t xml:space="preserve"> Start a feature only from a green state.</w:t>
       </w:r>
     </w:p>
     <w:p>
@@ -22194,7 +22548,7 @@
         <w:pStyle w:val="ListParagraph"/>
         <w:numPr>
           <w:ilvl w:val="0"/>
-          <w:numId w:val="5"/>
+          <w:numId w:val="7"/>
         </w:numPr>
         <w:spacing w:after="70" w:line="264"/>
       </w:pPr>
@@ -22218,7 +22572,7 @@
         <w:pStyle w:val="ListParagraph"/>
         <w:numPr>
           <w:ilvl w:val="0"/>
-          <w:numId w:val="5"/>
+          <w:numId w:val="7"/>
         </w:numPr>
         <w:spacing w:after="70" w:line="264"/>
       </w:pPr>
@@ -22259,7 +22613,7 @@
         <w:pStyle w:val="ListParagraph"/>
         <w:numPr>
           <w:ilvl w:val="0"/>
-          <w:numId w:val="6"/>
+          <w:numId w:val="8"/>
         </w:numPr>
         <w:spacing w:after="70" w:line="264"/>
       </w:pPr>
@@ -22289,7 +22643,7 @@
         <w:pStyle w:val="ListParagraph"/>
         <w:numPr>
           <w:ilvl w:val="0"/>
-          <w:numId w:val="6"/>
+          <w:numId w:val="8"/>
         </w:numPr>
         <w:spacing w:after="70" w:line="264"/>
       </w:pPr>
@@ -22305,7 +22659,7 @@
           <w:i/>
           <w:iCs/>
         </w:rPr>
-        <w:t xml:space="preserve">Run pnpm typecheck, pnpm lint and pnpm test, then commit with a message that says what was verified.</w:t>
+        <w:t xml:space="preserve">Run the type check, the linter and all the tests, then commit with a message that says what was verified.</w:t>
       </w:r>
     </w:p>
     <w:p>
@@ -22313,7 +22667,7 @@
         <w:pStyle w:val="ListParagraph"/>
         <w:numPr>
           <w:ilvl w:val="0"/>
-          <w:numId w:val="6"/>
+          <w:numId w:val="8"/>
         </w:numPr>
         <w:spacing w:after="70" w:line="264"/>
       </w:pPr>
@@ -22329,13 +22683,13 @@
           <w:i/>
           <w:iCs/>
         </w:rPr>
-        <w:t xml:space="preserve">Push the branch to my fork and open a pull request into my fork's main branch.</w:t>
-      </w:r>
-      <w:r>
-        <w:rPr>
-          <w:rFonts w:ascii="Arial" w:cs="Arial" w:eastAsia="Arial" w:hAnsi="Arial"/>
-        </w:rPr>
-        <w:t xml:space="preserve"> (Or use GitHub Desktop: </w:t>
+        <w:t xml:space="preserve">Push this branch to my fork and give me the link to open a pull request into my fork's main branch.</w:t>
+      </w:r>
+      <w:r>
+        <w:rPr>
+          <w:rFonts w:ascii="Arial" w:cs="Arial" w:eastAsia="Arial" w:hAnsi="Arial"/>
+        </w:rPr>
+        <w:t xml:space="preserve"> Open the link and click </w:t>
       </w:r>
       <w:r>
         <w:rPr>
@@ -22343,13 +22697,13 @@
           <w:b/>
           <w:bCs/>
         </w:rPr>
-        <w:t xml:space="preserve">Push origin</w:t>
-      </w:r>
-      <w:r>
-        <w:rPr>
-          <w:rFonts w:ascii="Arial" w:cs="Arial" w:eastAsia="Arial" w:hAnsi="Arial"/>
-        </w:rPr>
-        <w:t xml:space="preserve">, then </w:t>
+        <w:t xml:space="preserve">Create pull request</w:t>
+      </w:r>
+      <w:r>
+        <w:rPr>
+          <w:rFonts w:ascii="Arial" w:cs="Arial" w:eastAsia="Arial" w:hAnsi="Arial"/>
+        </w:rPr>
+        <w:t xml:space="preserve">. Check the base is </w:t>
       </w:r>
       <w:r>
         <w:rPr>
@@ -22357,13 +22711,29 @@
           <w:b/>
           <w:bCs/>
         </w:rPr>
-        <w:t xml:space="preserve">Create Pull Request</w:t>
-      </w:r>
-      <w:r>
-        <w:rPr>
-          <w:rFonts w:ascii="Arial" w:cs="Arial" w:eastAsia="Arial" w:hAnsi="Arial"/>
-        </w:rPr>
-        <w:t xml:space="preserve">, and choose </w:t>
+        <w:t xml:space="preserve">your fork</w:t>
+      </w:r>
+      <w:r>
+        <w:rPr>
+          <w:rFonts w:ascii="Arial" w:cs="Arial" w:eastAsia="Arial" w:hAnsi="Arial"/>
+        </w:rPr>
+        <w:t xml:space="preserve">, not the instructor's repository.</w:t>
+      </w:r>
+    </w:p>
+    <w:p>
+      <w:pPr>
+        <w:pStyle w:val="ListParagraph"/>
+        <w:numPr>
+          <w:ilvl w:val="0"/>
+          <w:numId w:val="8"/>
+        </w:numPr>
+        <w:spacing w:after="70" w:line="264"/>
+      </w:pPr>
+      <w:r>
+        <w:rPr>
+          <w:rFonts w:ascii="Arial" w:cs="Arial" w:eastAsia="Arial" w:hAnsi="Arial"/>
+        </w:rPr>
+        <w:t xml:space="preserve">If Claude says it can't sign in to GitHub, open GitHub Desktop: it shows your branch, so click </w:t>
       </w:r>
       <w:r>
         <w:rPr>
@@ -22371,13 +22741,13 @@
           <w:b/>
           <w:bCs/>
         </w:rPr>
-        <w:t xml:space="preserve">your fork</w:t>
-      </w:r>
-      <w:r>
-        <w:rPr>
-          <w:rFonts w:ascii="Arial" w:cs="Arial" w:eastAsia="Arial" w:hAnsi="Arial"/>
-        </w:rPr>
-        <w:t xml:space="preserve"> as the base, not the instructor's repository.)</w:t>
+        <w:t xml:space="preserve">Push origin</w:t>
+      </w:r>
+      <w:r>
+        <w:rPr>
+          <w:rFonts w:ascii="Arial" w:cs="Arial" w:eastAsia="Arial" w:hAnsi="Arial"/>
+        </w:rPr>
+        <w:t xml:space="preserve"> there, then come back to the chat.</w:t>
       </w:r>
     </w:p>
     <w:tbl>
@@ -23648,23 +24018,7 @@
                 <w:sz w:val="19"/>
                 <w:szCs w:val="19"/>
               </w:rPr>
-              <w:t xml:space="preserve">New table with school_id and a database migration (</w:t>
-            </w:r>
-            <w:r>
-              <w:rPr>
-                <w:rFonts w:ascii="Courier New" w:cs="Courier New" w:eastAsia="Courier New" w:hAnsi="Courier New"/>
-                <w:sz w:val="17"/>
-                <w:szCs w:val="17"/>
-              </w:rPr>
-              <w:t xml:space="preserve">pnpm db:generate --name notices</w:t>
-            </w:r>
-            <w:r>
-              <w:rPr>
-                <w:rFonts w:ascii="Arial" w:cs="Arial" w:eastAsia="Arial" w:hAnsi="Arial"/>
-                <w:sz w:val="19"/>
-                <w:szCs w:val="19"/>
-              </w:rPr>
-              <w:t xml:space="preserve">); follow the module pattern in docs/ENGINEERING_GUIDE.md; audit every post; titles max 120 characters, text max 2,000; brand tokens only.</w:t>
+              <w:t xml:space="preserve">New table with school_id and a reviewed database migration (CLAUDE.md, Schema change); follow the module pattern in docs/ENGINEERING_GUIDE.md; audit every post; titles max 120 characters, text max 2,000; brand tokens only.</w:t>
             </w:r>
           </w:p>
         </w:tc>
@@ -27274,7 +27628,7 @@
                 <w:sz w:val="19"/>
                 <w:szCs w:val="19"/>
               </w:rPr>
-              <w:t xml:space="preserve"> in .env (I add it myself; never ask me to paste it into the chat); put the model name in an environment setting, not in the code; if there is no key, show a clearly labelled sample draft; record each call (who, when, how long it took) without storing the student's data in the log; label approved comments "AI-assisted".</w:t>
+              <w:t xml:space="preserve"> in .env: create that line empty, and I will paste the key into the file myself in a text editor (never ask me to paste it into the chat); put the model name in an environment setting, not in the code; if there is no key, show a clearly labelled sample draft; record each call (who, when, how long it took) without storing the student's data in the log; label approved comments "AI-assisted".</w:t>
             </w:r>
           </w:p>
         </w:tc>
@@ -27668,11 +28022,11 @@
             </w:pPr>
             <w:r>
               <w:rPr>
-                <w:rFonts w:ascii="Courier New" w:cs="Courier New" w:eastAsia="Courier New" w:hAnsi="Courier New"/>
-                <w:sz w:val="17"/>
-                <w:szCs w:val="17"/>
-              </w:rPr>
-              <w:t xml:space="preserve">pnpm: command not found</w:t>
+                <w:rFonts w:ascii="Arial" w:cs="Arial" w:eastAsia="Arial" w:hAnsi="Arial"/>
+                <w:sz w:val="19"/>
+                <w:szCs w:val="19"/>
+              </w:rPr>
+              <w:t xml:space="preserve">Claude says Node.js is missing or too old</w:t>
             </w:r>
           </w:p>
         </w:tc>
@@ -27702,7 +28056,7 @@
                 <w:sz w:val="19"/>
                 <w:szCs w:val="19"/>
               </w:rPr>
-              <w:t xml:space="preserve">pnpm isn't switched on yet</w:t>
+              <w:t xml:space="preserve">Node.js 22 isn't installed</w:t>
             </w:r>
           </w:p>
         </w:tc>
@@ -27732,23 +28086,25 @@
                 <w:sz w:val="19"/>
                 <w:szCs w:val="19"/>
               </w:rPr>
-              <w:t xml:space="preserve">Run </w:t>
-            </w:r>
-            <w:r>
-              <w:rPr>
-                <w:rFonts w:ascii="Courier New" w:cs="Courier New" w:eastAsia="Courier New" w:hAnsi="Courier New"/>
-                <w:sz w:val="17"/>
-                <w:szCs w:val="17"/>
-              </w:rPr>
-              <w:t xml:space="preserve">corepack enable</w:t>
-            </w:r>
-            <w:r>
-              <w:rPr>
-                <w:rFonts w:ascii="Arial" w:cs="Arial" w:eastAsia="Arial" w:hAnsi="Arial"/>
-                <w:sz w:val="19"/>
-                <w:szCs w:val="19"/>
-              </w:rPr>
-              <w:t xml:space="preserve">, or ask Claude to install pnpm</w:t>
+              <w:t xml:space="preserve">Install the </w:t>
+            </w:r>
+            <w:r>
+              <w:rPr>
+                <w:rFonts w:ascii="Arial" w:cs="Arial" w:eastAsia="Arial" w:hAnsi="Arial"/>
+                <w:b/>
+                <w:bCs/>
+                <w:sz w:val="19"/>
+                <w:szCs w:val="19"/>
+              </w:rPr>
+              <w:t xml:space="preserve">LTS</w:t>
+            </w:r>
+            <w:r>
+              <w:rPr>
+                <w:rFonts w:ascii="Arial" w:cs="Arial" w:eastAsia="Arial" w:hAnsi="Arial"/>
+                <w:sz w:val="19"/>
+                <w:szCs w:val="19"/>
+              </w:rPr>
+              <w:t xml:space="preserve"> version from nodejs.org, then start a new Claude Code session on the campusly folder</w:t>
             </w:r>
           </w:p>
         </w:tc>
@@ -27784,7 +28140,7 @@
                 <w:sz w:val="19"/>
                 <w:szCs w:val="19"/>
               </w:rPr>
-              <w:t xml:space="preserve">The page at localhost:3000 doesn't open</w:t>
+              <w:t xml:space="preserve">Claude says pnpm is not found</w:t>
             </w:r>
           </w:p>
         </w:tc>
@@ -27815,7 +28171,7 @@
                 <w:sz w:val="19"/>
                 <w:szCs w:val="19"/>
               </w:rPr>
-              <w:t xml:space="preserve">The app isn't running</w:t>
+              <w:t xml:space="preserve">pnpm isn't switched on yet</w:t>
             </w:r>
           </w:p>
         </w:tc>
@@ -27846,23 +28202,17 @@
                 <w:sz w:val="19"/>
                 <w:szCs w:val="19"/>
               </w:rPr>
-              <w:t xml:space="preserve">Run </w:t>
-            </w:r>
-            <w:r>
-              <w:rPr>
-                <w:rFonts w:ascii="Courier New" w:cs="Courier New" w:eastAsia="Courier New" w:hAnsi="Courier New"/>
-                <w:sz w:val="17"/>
-                <w:szCs w:val="17"/>
-              </w:rPr>
-              <w:t xml:space="preserve">pnpm dev</w:t>
-            </w:r>
-            <w:r>
-              <w:rPr>
-                <w:rFonts w:ascii="Arial" w:cs="Arial" w:eastAsia="Arial" w:hAnsi="Arial"/>
-                <w:sz w:val="19"/>
-                <w:szCs w:val="19"/>
-              </w:rPr>
-              <w:t xml:space="preserve"> and wait for "Ready"</w:t>
+              <w:t xml:space="preserve">Ask Claude: </w:t>
+            </w:r>
+            <w:r>
+              <w:rPr>
+                <w:rFonts w:ascii="Arial" w:cs="Arial" w:eastAsia="Arial" w:hAnsi="Arial"/>
+                <w:i/>
+                <w:iCs/>
+                <w:sz w:val="19"/>
+                <w:szCs w:val="19"/>
+              </w:rPr>
+              <w:t xml:space="preserve">Set up pnpm the way CLAUDE.md says, then try again.</w:t>
             </w:r>
           </w:p>
         </w:tc>
@@ -27897,7 +28247,7 @@
                 <w:sz w:val="19"/>
                 <w:szCs w:val="19"/>
               </w:rPr>
-              <w:t xml:space="preserve">Sign-in says "Too many attempts"</w:t>
+              <w:t xml:space="preserve">The page at localhost:3000 doesn't open</w:t>
             </w:r>
           </w:p>
         </w:tc>
@@ -27927,7 +28277,7 @@
                 <w:sz w:val="19"/>
                 <w:szCs w:val="19"/>
               </w:rPr>
-              <w:t xml:space="preserve">Sign-in is limited to 5 tries a minute (a security rule)</w:t>
+              <w:t xml:space="preserve">The app isn't running (for example, the session that started it was closed)</w:t>
             </w:r>
           </w:p>
         </w:tc>
@@ -27957,7 +28307,17 @@
                 <w:sz w:val="19"/>
                 <w:szCs w:val="19"/>
               </w:rPr>
-              <w:t xml:space="preserve">Wait one minute and try again</w:t>
+              <w:t xml:space="preserve">Ask Claude: </w:t>
+            </w:r>
+            <w:r>
+              <w:rPr>
+                <w:rFonts w:ascii="Arial" w:cs="Arial" w:eastAsia="Arial" w:hAnsi="Arial"/>
+                <w:i/>
+                <w:iCs/>
+                <w:sz w:val="19"/>
+                <w:szCs w:val="19"/>
+              </w:rPr>
+              <w:t xml:space="preserve">Start the app and tell me when it's ready.</w:t>
             </w:r>
           </w:p>
         </w:tc>
@@ -27989,19 +28349,11 @@
             </w:pPr>
             <w:r>
               <w:rPr>
-                <w:rFonts w:ascii="Courier New" w:cs="Courier New" w:eastAsia="Courier New" w:hAnsi="Courier New"/>
-                <w:sz w:val="17"/>
-                <w:szCs w:val="17"/>
-              </w:rPr>
-              <w:t xml:space="preserve">pnpm seed:reset</w:t>
-            </w:r>
-            <w:r>
-              <w:rPr>
-                <w:rFonts w:ascii="Arial" w:cs="Arial" w:eastAsia="Arial" w:hAnsi="Arial"/>
-                <w:sz w:val="19"/>
-                <w:szCs w:val="19"/>
-              </w:rPr>
-              <w:t xml:space="preserve"> fails or the data looks broken</w:t>
+                <w:rFonts w:ascii="Arial" w:cs="Arial" w:eastAsia="Arial" w:hAnsi="Arial"/>
+                <w:sz w:val="19"/>
+                <w:szCs w:val="19"/>
+              </w:rPr>
+              <w:t xml:space="preserve">Sign-in says "Too many attempts"</w:t>
             </w:r>
           </w:p>
         </w:tc>
@@ -28032,7 +28384,7 @@
                 <w:sz w:val="19"/>
                 <w:szCs w:val="19"/>
               </w:rPr>
-              <w:t xml:space="preserve">The app is still running and holding the database</w:t>
+              <w:t xml:space="preserve">Sign-in is limited to 5 tries a minute (a security rule)</w:t>
             </w:r>
           </w:p>
         </w:tc>
@@ -28063,23 +28415,7 @@
                 <w:sz w:val="19"/>
                 <w:szCs w:val="19"/>
               </w:rPr>
-              <w:t xml:space="preserve">Stop </w:t>
-            </w:r>
-            <w:r>
-              <w:rPr>
-                <w:rFonts w:ascii="Courier New" w:cs="Courier New" w:eastAsia="Courier New" w:hAnsi="Courier New"/>
-                <w:sz w:val="17"/>
-                <w:szCs w:val="17"/>
-              </w:rPr>
-              <w:t xml:space="preserve">pnpm dev</w:t>
-            </w:r>
-            <w:r>
-              <w:rPr>
-                <w:rFonts w:ascii="Arial" w:cs="Arial" w:eastAsia="Arial" w:hAnsi="Arial"/>
-                <w:sz w:val="19"/>
-                <w:szCs w:val="19"/>
-              </w:rPr>
-              <w:t xml:space="preserve"> first, then run it again</w:t>
+              <w:t xml:space="preserve">Wait one minute and try again</w:t>
             </w:r>
           </w:p>
         </w:tc>
@@ -28114,7 +28450,7 @@
                 <w:sz w:val="19"/>
                 <w:szCs w:val="19"/>
               </w:rPr>
-              <w:t xml:space="preserve">Browser tests fail before starting</w:t>
+              <w:t xml:space="preserve">Resetting the demo data fails, or the data looks broken</w:t>
             </w:r>
           </w:p>
         </w:tc>
@@ -28144,7 +28480,7 @@
                 <w:sz w:val="19"/>
                 <w:szCs w:val="19"/>
               </w:rPr>
-              <w:t xml:space="preserve">The test browser isn't installed</w:t>
+              <w:t xml:space="preserve">The app is still running and holding the database</w:t>
             </w:r>
           </w:p>
         </w:tc>
@@ -28174,15 +28510,17 @@
                 <w:sz w:val="19"/>
                 <w:szCs w:val="19"/>
               </w:rPr>
-              <w:t xml:space="preserve">Run </w:t>
-            </w:r>
-            <w:r>
-              <w:rPr>
-                <w:rFonts w:ascii="Courier New" w:cs="Courier New" w:eastAsia="Courier New" w:hAnsi="Courier New"/>
-                <w:sz w:val="17"/>
-                <w:szCs w:val="17"/>
-              </w:rPr>
-              <w:t xml:space="preserve">pnpm exec playwright install chromium</w:t>
+              <w:t xml:space="preserve">Ask Claude: </w:t>
+            </w:r>
+            <w:r>
+              <w:rPr>
+                <w:rFonts w:ascii="Arial" w:cs="Arial" w:eastAsia="Arial" w:hAnsi="Arial"/>
+                <w:i/>
+                <w:iCs/>
+                <w:sz w:val="19"/>
+                <w:szCs w:val="19"/>
+              </w:rPr>
+              <w:t xml:space="preserve">Stop the app, reset the demo data, then start it again.</w:t>
             </w:r>
           </w:p>
         </w:tc>
@@ -28218,7 +28556,7 @@
                 <w:sz w:val="19"/>
                 <w:szCs w:val="19"/>
               </w:rPr>
-              <w:t xml:space="preserve">A Build prompt's plan changes something users see that you didn't decide</w:t>
+              <w:t xml:space="preserve">Browser tests fail before starting</w:t>
             </w:r>
           </w:p>
         </w:tc>
@@ -28249,7 +28587,7 @@
                 <w:sz w:val="19"/>
                 <w:szCs w:val="19"/>
               </w:rPr>
-              <w:t xml:space="preserve">The prompt left a decision open</w:t>
+              <w:t xml:space="preserve">The test browser isn't installed</w:t>
             </w:r>
           </w:p>
         </w:tc>
@@ -28280,7 +28618,17 @@
                 <w:sz w:val="19"/>
                 <w:szCs w:val="19"/>
               </w:rPr>
-              <w:t xml:space="preserve">Stop. Decide it yourself, or ask Claude for options and a recommendation</w:t>
+              <w:t xml:space="preserve">Ask Claude: </w:t>
+            </w:r>
+            <w:r>
+              <w:rPr>
+                <w:rFonts w:ascii="Arial" w:cs="Arial" w:eastAsia="Arial" w:hAnsi="Arial"/>
+                <w:i/>
+                <w:iCs/>
+                <w:sz w:val="19"/>
+                <w:szCs w:val="19"/>
+              </w:rPr>
+              <w:t xml:space="preserve">Install the test browser, then run the browser tests again.</w:t>
             </w:r>
           </w:p>
         </w:tc>
@@ -28315,7 +28663,7 @@
                 <w:sz w:val="19"/>
                 <w:szCs w:val="19"/>
               </w:rPr>
-              <w:t xml:space="preserve">Tests fail after your feature</w:t>
+              <w:t xml:space="preserve">Claude asks permission to run something</w:t>
             </w:r>
           </w:p>
         </w:tc>
@@ -28345,7 +28693,7 @@
                 <w:sz w:val="19"/>
                 <w:szCs w:val="19"/>
               </w:rPr>
-              <w:t xml:space="preserve">The new code broke an existing rule</w:t>
+              <w:t xml:space="preserve">Claude Code asks before running commands</w:t>
             </w:r>
           </w:p>
         </w:tc>
@@ -28375,7 +28723,7 @@
                 <w:sz w:val="19"/>
                 <w:szCs w:val="19"/>
               </w:rPr>
-              <w:t xml:space="preserve">Ask Claude to explain the failing test before changing anything; never weaken a test to make it pass</w:t>
+              <w:t xml:space="preserve">Read the reason. Allow installs, tests and starting the app; refuse anything outside the campusly folder or anything asking for a password</w:t>
             </w:r>
           </w:p>
         </w:tc>
@@ -28411,35 +28759,7 @@
                 <w:sz w:val="19"/>
                 <w:szCs w:val="19"/>
               </w:rPr>
-              <w:t xml:space="preserve">Push fails with </w:t>
-            </w:r>
-            <w:r>
-              <w:rPr>
-                <w:rFonts w:ascii="Arial" w:cs="Arial" w:eastAsia="Arial" w:hAnsi="Arial"/>
-                <w:i/>
-                <w:iCs/>
-                <w:sz w:val="19"/>
-                <w:szCs w:val="19"/>
-              </w:rPr>
-              <w:t xml:space="preserve">Permission denied</w:t>
-            </w:r>
-            <w:r>
-              <w:rPr>
-                <w:rFonts w:ascii="Arial" w:cs="Arial" w:eastAsia="Arial" w:hAnsi="Arial"/>
-                <w:sz w:val="19"/>
-                <w:szCs w:val="19"/>
-              </w:rPr>
-              <w:t xml:space="preserve"> or </w:t>
-            </w:r>
-            <w:r>
-              <w:rPr>
-                <w:rFonts w:ascii="Arial" w:cs="Arial" w:eastAsia="Arial" w:hAnsi="Arial"/>
-                <w:i/>
-                <w:iCs/>
-                <w:sz w:val="19"/>
-                <w:szCs w:val="19"/>
-              </w:rPr>
-              <w:t xml:space="preserve">403</w:t>
+              <w:t xml:space="preserve">A Build prompt's plan changes something users see that you didn't decide</w:t>
             </w:r>
           </w:p>
         </w:tc>
@@ -28470,7 +28790,7 @@
                 <w:sz w:val="19"/>
                 <w:szCs w:val="19"/>
               </w:rPr>
-              <w:t xml:space="preserve">You cloned the instructor's repository instead of your fork</w:t>
+              <w:t xml:space="preserve">The prompt left a decision open</w:t>
             </w:r>
           </w:p>
         </w:tc>
@@ -28501,17 +28821,7 @@
                 <w:sz w:val="19"/>
                 <w:szCs w:val="19"/>
               </w:rPr>
-              <w:t xml:space="preserve">Fork it (Part 0.2), then ask Claude: </w:t>
-            </w:r>
-            <w:r>
-              <w:rPr>
-                <w:rFonts w:ascii="Arial" w:cs="Arial" w:eastAsia="Arial" w:hAnsi="Arial"/>
-                <w:i/>
-                <w:iCs/>
-                <w:sz w:val="19"/>
-                <w:szCs w:val="19"/>
-              </w:rPr>
-              <w:t xml:space="preserve">point origin at my fork, github.com/&lt;your-username&gt;/campusly, and push again</w:t>
+              <w:t xml:space="preserve">Stop. Decide it yourself, or ask Claude for options and a recommendation</w:t>
             </w:r>
           </w:p>
         </w:tc>
@@ -28546,25 +28856,7 @@
                 <w:sz w:val="19"/>
                 <w:szCs w:val="19"/>
               </w:rPr>
-              <w:t xml:space="preserve">On the live app, </w:t>
-            </w:r>
-            <w:r>
-              <w:rPr>
-                <w:rFonts w:ascii="Arial" w:cs="Arial" w:eastAsia="Arial" w:hAnsi="Arial"/>
-                <w:i/>
-                <w:iCs/>
-                <w:sz w:val="19"/>
-                <w:szCs w:val="19"/>
-              </w:rPr>
-              <w:t xml:space="preserve">Create an account</w:t>
-            </w:r>
-            <w:r>
-              <w:rPr>
-                <w:rFonts w:ascii="Arial" w:cs="Arial" w:eastAsia="Arial" w:hAnsi="Arial"/>
-                <w:sz w:val="19"/>
-                <w:szCs w:val="19"/>
-              </w:rPr>
-              <w:t xml:space="preserve"> says sign-ups are closed</w:t>
+              <w:t xml:space="preserve">Tests fail after your feature</w:t>
             </w:r>
           </w:p>
         </w:tc>
@@ -28594,7 +28886,7 @@
                 <w:sz w:val="19"/>
                 <w:szCs w:val="19"/>
               </w:rPr>
-              <w:t xml:space="preserve">The live app is a shared classroom demo (decision D-015)</w:t>
+              <w:t xml:space="preserve">The new code broke an existing rule</w:t>
             </w:r>
           </w:p>
         </w:tc>
@@ -28624,7 +28916,7 @@
                 <w:sz w:val="19"/>
                 <w:szCs w:val="19"/>
               </w:rPr>
-              <w:t xml:space="preserve">Sign in with a demo account; to try sign-up, use your local copy (emails appear at localhost:3000/dev/mail)</w:t>
+              <w:t xml:space="preserve">Ask Claude to explain the failing test before changing anything; never weaken a test to make it pass</w:t>
             </w:r>
           </w:p>
         </w:tc>
@@ -28660,61 +28952,7 @@
                 <w:sz w:val="19"/>
                 <w:szCs w:val="19"/>
               </w:rPr>
-              <w:t xml:space="preserve">You changed something by accident</w:t>
-            </w:r>
-          </w:p>
-        </w:tc>
-        <w:tc>
-          <w:tcPr>
-            <w:tcW w:type="dxa" w:w="3013"/>
-            <w:tcBorders>
-              <w:top w:val="single" w:color="DBE3DA" w:sz="4"/>
-              <w:left w:val="single" w:color="DBE3DA" w:sz="4"/>
-              <w:bottom w:val="single" w:color="DBE3DA" w:sz="4"/>
-              <w:right w:val="single" w:color="DBE3DA" w:sz="4"/>
-            </w:tcBorders>
-            <w:shd w:fill="FAFBF9" w:color="auto" w:val="clear"/>
-            <w:tcMar>
-              <w:top w:type="dxa" w:w="80"/>
-              <w:left w:type="dxa" w:w="120"/>
-              <w:bottom w:type="dxa" w:w="80"/>
-              <w:right w:type="dxa" w:w="120"/>
-            </w:tcMar>
-          </w:tcPr>
-          <w:p>
-            <w:pPr>
-              <w:spacing w:after="40" w:line="252"/>
-            </w:pPr>
-          </w:p>
-        </w:tc>
-        <w:tc>
-          <w:tcPr>
-            <w:tcW w:type="dxa" w:w="3013"/>
-            <w:tcBorders>
-              <w:top w:val="single" w:color="DBE3DA" w:sz="4"/>
-              <w:left w:val="single" w:color="DBE3DA" w:sz="4"/>
-              <w:bottom w:val="single" w:color="DBE3DA" w:sz="4"/>
-              <w:right w:val="single" w:color="DBE3DA" w:sz="4"/>
-            </w:tcBorders>
-            <w:shd w:fill="FAFBF9" w:color="auto" w:val="clear"/>
-            <w:tcMar>
-              <w:top w:type="dxa" w:w="80"/>
-              <w:left w:type="dxa" w:w="120"/>
-              <w:bottom w:type="dxa" w:w="80"/>
-              <w:right w:type="dxa" w:w="120"/>
-            </w:tcMar>
-          </w:tcPr>
-          <w:p>
-            <w:pPr>
-              <w:spacing w:after="40" w:line="252"/>
-            </w:pPr>
-            <w:r>
-              <w:rPr>
-                <w:rFonts w:ascii="Arial" w:cs="Arial" w:eastAsia="Arial" w:hAnsi="Arial"/>
-                <w:sz w:val="19"/>
-                <w:szCs w:val="19"/>
-              </w:rPr>
-              <w:t xml:space="preserve">Ask Claude: </w:t>
+              <w:t xml:space="preserve">Push fails with </w:t>
             </w:r>
             <w:r>
               <w:rPr>
@@ -28724,7 +28962,310 @@
                 <w:sz w:val="19"/>
                 <w:szCs w:val="19"/>
               </w:rPr>
-              <w:t xml:space="preserve">show me git status, then restore the files I didn't mean to change</w:t>
+              <w:t xml:space="preserve">Permission denied</w:t>
+            </w:r>
+            <w:r>
+              <w:rPr>
+                <w:rFonts w:ascii="Arial" w:cs="Arial" w:eastAsia="Arial" w:hAnsi="Arial"/>
+                <w:sz w:val="19"/>
+                <w:szCs w:val="19"/>
+              </w:rPr>
+              <w:t xml:space="preserve"> or </w:t>
+            </w:r>
+            <w:r>
+              <w:rPr>
+                <w:rFonts w:ascii="Arial" w:cs="Arial" w:eastAsia="Arial" w:hAnsi="Arial"/>
+                <w:i/>
+                <w:iCs/>
+                <w:sz w:val="19"/>
+                <w:szCs w:val="19"/>
+              </w:rPr>
+              <w:t xml:space="preserve">403</w:t>
+            </w:r>
+          </w:p>
+        </w:tc>
+        <w:tc>
+          <w:tcPr>
+            <w:tcW w:type="dxa" w:w="3013"/>
+            <w:tcBorders>
+              <w:top w:val="single" w:color="DBE3DA" w:sz="4"/>
+              <w:left w:val="single" w:color="DBE3DA" w:sz="4"/>
+              <w:bottom w:val="single" w:color="DBE3DA" w:sz="4"/>
+              <w:right w:val="single" w:color="DBE3DA" w:sz="4"/>
+            </w:tcBorders>
+            <w:shd w:fill="FAFBF9" w:color="auto" w:val="clear"/>
+            <w:tcMar>
+              <w:top w:type="dxa" w:w="80"/>
+              <w:left w:type="dxa" w:w="120"/>
+              <w:bottom w:type="dxa" w:w="80"/>
+              <w:right w:type="dxa" w:w="120"/>
+            </w:tcMar>
+          </w:tcPr>
+          <w:p>
+            <w:pPr>
+              <w:spacing w:after="40" w:line="252"/>
+            </w:pPr>
+            <w:r>
+              <w:rPr>
+                <w:rFonts w:ascii="Arial" w:cs="Arial" w:eastAsia="Arial" w:hAnsi="Arial"/>
+                <w:sz w:val="19"/>
+                <w:szCs w:val="19"/>
+              </w:rPr>
+              <w:t xml:space="preserve">You cloned the instructor's repository instead of your fork</w:t>
+            </w:r>
+          </w:p>
+        </w:tc>
+        <w:tc>
+          <w:tcPr>
+            <w:tcW w:type="dxa" w:w="3013"/>
+            <w:tcBorders>
+              <w:top w:val="single" w:color="DBE3DA" w:sz="4"/>
+              <w:left w:val="single" w:color="DBE3DA" w:sz="4"/>
+              <w:bottom w:val="single" w:color="DBE3DA" w:sz="4"/>
+              <w:right w:val="single" w:color="DBE3DA" w:sz="4"/>
+            </w:tcBorders>
+            <w:shd w:fill="FAFBF9" w:color="auto" w:val="clear"/>
+            <w:tcMar>
+              <w:top w:type="dxa" w:w="80"/>
+              <w:left w:type="dxa" w:w="120"/>
+              <w:bottom w:type="dxa" w:w="80"/>
+              <w:right w:type="dxa" w:w="120"/>
+            </w:tcMar>
+          </w:tcPr>
+          <w:p>
+            <w:pPr>
+              <w:spacing w:after="40" w:line="252"/>
+            </w:pPr>
+            <w:r>
+              <w:rPr>
+                <w:rFonts w:ascii="Arial" w:cs="Arial" w:eastAsia="Arial" w:hAnsi="Arial"/>
+                <w:sz w:val="19"/>
+                <w:szCs w:val="19"/>
+              </w:rPr>
+              <w:t xml:space="preserve">Fork it (Part 0.2), then ask Claude: </w:t>
+            </w:r>
+            <w:r>
+              <w:rPr>
+                <w:rFonts w:ascii="Arial" w:cs="Arial" w:eastAsia="Arial" w:hAnsi="Arial"/>
+                <w:i/>
+                <w:iCs/>
+                <w:sz w:val="19"/>
+                <w:szCs w:val="19"/>
+              </w:rPr>
+              <w:t xml:space="preserve">point origin at my fork, github.com/&lt;your-username&gt;/campusly, and push again</w:t>
+            </w:r>
+          </w:p>
+        </w:tc>
+      </w:tr>
+      <w:tr>
+        <w:trPr>
+          <w:cantSplit/>
+        </w:trPr>
+        <w:tc>
+          <w:tcPr>
+            <w:tcW w:type="dxa" w:w="3000"/>
+            <w:tcBorders>
+              <w:top w:val="single" w:color="DBE3DA" w:sz="4"/>
+              <w:left w:val="single" w:color="DBE3DA" w:sz="4"/>
+              <w:bottom w:val="single" w:color="DBE3DA" w:sz="4"/>
+              <w:right w:val="single" w:color="DBE3DA" w:sz="4"/>
+            </w:tcBorders>
+            <w:tcMar>
+              <w:top w:type="dxa" w:w="80"/>
+              <w:left w:type="dxa" w:w="120"/>
+              <w:bottom w:type="dxa" w:w="80"/>
+              <w:right w:type="dxa" w:w="120"/>
+            </w:tcMar>
+          </w:tcPr>
+          <w:p>
+            <w:pPr>
+              <w:spacing w:after="40" w:line="252"/>
+            </w:pPr>
+            <w:r>
+              <w:rPr>
+                <w:rFonts w:ascii="Arial" w:cs="Arial" w:eastAsia="Arial" w:hAnsi="Arial"/>
+                <w:sz w:val="19"/>
+                <w:szCs w:val="19"/>
+              </w:rPr>
+              <w:t xml:space="preserve">On the live app, </w:t>
+            </w:r>
+            <w:r>
+              <w:rPr>
+                <w:rFonts w:ascii="Arial" w:cs="Arial" w:eastAsia="Arial" w:hAnsi="Arial"/>
+                <w:i/>
+                <w:iCs/>
+                <w:sz w:val="19"/>
+                <w:szCs w:val="19"/>
+              </w:rPr>
+              <w:t xml:space="preserve">Create an account</w:t>
+            </w:r>
+            <w:r>
+              <w:rPr>
+                <w:rFonts w:ascii="Arial" w:cs="Arial" w:eastAsia="Arial" w:hAnsi="Arial"/>
+                <w:sz w:val="19"/>
+                <w:szCs w:val="19"/>
+              </w:rPr>
+              <w:t xml:space="preserve"> says sign-ups are closed</w:t>
+            </w:r>
+          </w:p>
+        </w:tc>
+        <w:tc>
+          <w:tcPr>
+            <w:tcW w:type="dxa" w:w="3013"/>
+            <w:tcBorders>
+              <w:top w:val="single" w:color="DBE3DA" w:sz="4"/>
+              <w:left w:val="single" w:color="DBE3DA" w:sz="4"/>
+              <w:bottom w:val="single" w:color="DBE3DA" w:sz="4"/>
+              <w:right w:val="single" w:color="DBE3DA" w:sz="4"/>
+            </w:tcBorders>
+            <w:tcMar>
+              <w:top w:type="dxa" w:w="80"/>
+              <w:left w:type="dxa" w:w="120"/>
+              <w:bottom w:type="dxa" w:w="80"/>
+              <w:right w:type="dxa" w:w="120"/>
+            </w:tcMar>
+          </w:tcPr>
+          <w:p>
+            <w:pPr>
+              <w:spacing w:after="40" w:line="252"/>
+            </w:pPr>
+            <w:r>
+              <w:rPr>
+                <w:rFonts w:ascii="Arial" w:cs="Arial" w:eastAsia="Arial" w:hAnsi="Arial"/>
+                <w:sz w:val="19"/>
+                <w:szCs w:val="19"/>
+              </w:rPr>
+              <w:t xml:space="preserve">The live app is a shared classroom demo (decision D-015)</w:t>
+            </w:r>
+          </w:p>
+        </w:tc>
+        <w:tc>
+          <w:tcPr>
+            <w:tcW w:type="dxa" w:w="3013"/>
+            <w:tcBorders>
+              <w:top w:val="single" w:color="DBE3DA" w:sz="4"/>
+              <w:left w:val="single" w:color="DBE3DA" w:sz="4"/>
+              <w:bottom w:val="single" w:color="DBE3DA" w:sz="4"/>
+              <w:right w:val="single" w:color="DBE3DA" w:sz="4"/>
+            </w:tcBorders>
+            <w:tcMar>
+              <w:top w:type="dxa" w:w="80"/>
+              <w:left w:type="dxa" w:w="120"/>
+              <w:bottom w:type="dxa" w:w="80"/>
+              <w:right w:type="dxa" w:w="120"/>
+            </w:tcMar>
+          </w:tcPr>
+          <w:p>
+            <w:pPr>
+              <w:spacing w:after="40" w:line="252"/>
+            </w:pPr>
+            <w:r>
+              <w:rPr>
+                <w:rFonts w:ascii="Arial" w:cs="Arial" w:eastAsia="Arial" w:hAnsi="Arial"/>
+                <w:sz w:val="19"/>
+                <w:szCs w:val="19"/>
+              </w:rPr>
+              <w:t xml:space="preserve">Sign in with a demo account; to try sign-up, use your local copy (emails appear at localhost:3000/dev/mail)</w:t>
+            </w:r>
+          </w:p>
+        </w:tc>
+      </w:tr>
+      <w:tr>
+        <w:trPr>
+          <w:cantSplit/>
+        </w:trPr>
+        <w:tc>
+          <w:tcPr>
+            <w:tcW w:type="dxa" w:w="3000"/>
+            <w:tcBorders>
+              <w:top w:val="single" w:color="DBE3DA" w:sz="4"/>
+              <w:left w:val="single" w:color="DBE3DA" w:sz="4"/>
+              <w:bottom w:val="single" w:color="DBE3DA" w:sz="4"/>
+              <w:right w:val="single" w:color="DBE3DA" w:sz="4"/>
+            </w:tcBorders>
+            <w:shd w:fill="FAFBF9" w:color="auto" w:val="clear"/>
+            <w:tcMar>
+              <w:top w:type="dxa" w:w="80"/>
+              <w:left w:type="dxa" w:w="120"/>
+              <w:bottom w:type="dxa" w:w="80"/>
+              <w:right w:type="dxa" w:w="120"/>
+            </w:tcMar>
+          </w:tcPr>
+          <w:p>
+            <w:pPr>
+              <w:spacing w:after="40" w:line="252"/>
+            </w:pPr>
+            <w:r>
+              <w:rPr>
+                <w:rFonts w:ascii="Arial" w:cs="Arial" w:eastAsia="Arial" w:hAnsi="Arial"/>
+                <w:sz w:val="19"/>
+                <w:szCs w:val="19"/>
+              </w:rPr>
+              <w:t xml:space="preserve">You changed something by accident</w:t>
+            </w:r>
+          </w:p>
+        </w:tc>
+        <w:tc>
+          <w:tcPr>
+            <w:tcW w:type="dxa" w:w="3013"/>
+            <w:tcBorders>
+              <w:top w:val="single" w:color="DBE3DA" w:sz="4"/>
+              <w:left w:val="single" w:color="DBE3DA" w:sz="4"/>
+              <w:bottom w:val="single" w:color="DBE3DA" w:sz="4"/>
+              <w:right w:val="single" w:color="DBE3DA" w:sz="4"/>
+            </w:tcBorders>
+            <w:shd w:fill="FAFBF9" w:color="auto" w:val="clear"/>
+            <w:tcMar>
+              <w:top w:type="dxa" w:w="80"/>
+              <w:left w:type="dxa" w:w="120"/>
+              <w:bottom w:type="dxa" w:w="80"/>
+              <w:right w:type="dxa" w:w="120"/>
+            </w:tcMar>
+          </w:tcPr>
+          <w:p>
+            <w:pPr>
+              <w:spacing w:after="40" w:line="252"/>
+            </w:pPr>
+          </w:p>
+        </w:tc>
+        <w:tc>
+          <w:tcPr>
+            <w:tcW w:type="dxa" w:w="3013"/>
+            <w:tcBorders>
+              <w:top w:val="single" w:color="DBE3DA" w:sz="4"/>
+              <w:left w:val="single" w:color="DBE3DA" w:sz="4"/>
+              <w:bottom w:val="single" w:color="DBE3DA" w:sz="4"/>
+              <w:right w:val="single" w:color="DBE3DA" w:sz="4"/>
+            </w:tcBorders>
+            <w:shd w:fill="FAFBF9" w:color="auto" w:val="clear"/>
+            <w:tcMar>
+              <w:top w:type="dxa" w:w="80"/>
+              <w:left w:type="dxa" w:w="120"/>
+              <w:bottom w:type="dxa" w:w="80"/>
+              <w:right w:type="dxa" w:w="120"/>
+            </w:tcMar>
+          </w:tcPr>
+          <w:p>
+            <w:pPr>
+              <w:spacing w:after="40" w:line="252"/>
+            </w:pPr>
+            <w:r>
+              <w:rPr>
+                <w:rFonts w:ascii="Arial" w:cs="Arial" w:eastAsia="Arial" w:hAnsi="Arial"/>
+                <w:sz w:val="19"/>
+                <w:szCs w:val="19"/>
+              </w:rPr>
+              <w:t xml:space="preserve">Ask Claude: </w:t>
+            </w:r>
+            <w:r>
+              <w:rPr>
+                <w:rFonts w:ascii="Arial" w:cs="Arial" w:eastAsia="Arial" w:hAnsi="Arial"/>
+                <w:i/>
+                <w:iCs/>
+                <w:sz w:val="19"/>
+                <w:szCs w:val="19"/>
+              </w:rPr>
+              <w:t xml:space="preserve">Show me which files changed, then undo the changes I didn't mean to make.</w:t>
             </w:r>
           </w:p>
         </w:tc>
@@ -29853,7 +30394,7 @@
                 <w:sz w:val="19"/>
                 <w:szCs w:val="19"/>
               </w:rPr>
-              <w:t xml:space="preserve">Updating and resetting the live app: sudo campusly-update, sudo campusly-reset-demo</w:t>
+              <w:t xml:space="preserve">Updating and resetting the live app (the instructor's campusly-update and campusly-reset-demo)</w:t>
             </w:r>
           </w:p>
         </w:tc>
@@ -31275,7 +31816,7 @@
         <w:pStyle w:val="ListParagraph"/>
         <w:numPr>
           <w:ilvl w:val="0"/>
-          <w:numId w:val="7"/>
+          <w:numId w:val="9"/>
         </w:numPr>
         <w:spacing w:after="70" w:line="264"/>
       </w:pPr>
@@ -31444,7 +31985,7 @@
         <w:pStyle w:val="ListParagraph"/>
         <w:numPr>
           <w:ilvl w:val="0"/>
-          <w:numId w:val="8"/>
+          <w:numId w:val="10"/>
         </w:numPr>
         <w:spacing w:after="70" w:line="264"/>
       </w:pPr>
@@ -31488,7 +32029,7 @@
         <w:pStyle w:val="ListParagraph"/>
         <w:numPr>
           <w:ilvl w:val="0"/>
-          <w:numId w:val="8"/>
+          <w:numId w:val="10"/>
         </w:numPr>
         <w:spacing w:after="70" w:line="264"/>
       </w:pPr>
@@ -31506,7 +32047,7 @@
         <w:pStyle w:val="ListParagraph"/>
         <w:numPr>
           <w:ilvl w:val="0"/>
-          <w:numId w:val="8"/>
+          <w:numId w:val="10"/>
         </w:numPr>
         <w:spacing w:after="70" w:line="264"/>
       </w:pPr>
@@ -31550,7 +32091,7 @@
         <w:pStyle w:val="ListParagraph"/>
         <w:numPr>
           <w:ilvl w:val="0"/>
-          <w:numId w:val="8"/>
+          <w:numId w:val="10"/>
         </w:numPr>
         <w:spacing w:after="70" w:line="264"/>
       </w:pPr>
@@ -31594,7 +32135,7 @@
         <w:pStyle w:val="ListParagraph"/>
         <w:numPr>
           <w:ilvl w:val="0"/>
-          <w:numId w:val="8"/>
+          <w:numId w:val="10"/>
         </w:numPr>
         <w:spacing w:after="70" w:line="264"/>
       </w:pPr>
@@ -31624,7 +32165,7 @@
         <w:pStyle w:val="ListParagraph"/>
         <w:numPr>
           <w:ilvl w:val="0"/>
-          <w:numId w:val="8"/>
+          <w:numId w:val="10"/>
         </w:numPr>
         <w:spacing w:after="70" w:line="264"/>
       </w:pPr>
@@ -31861,7 +32402,7 @@
         <w:pStyle w:val="ListParagraph"/>
         <w:numPr>
           <w:ilvl w:val="0"/>
-          <w:numId w:val="9"/>
+          <w:numId w:val="11"/>
         </w:numPr>
         <w:spacing w:after="70" w:line="264"/>
       </w:pPr>
@@ -31885,7 +32426,7 @@
         <w:pStyle w:val="ListParagraph"/>
         <w:numPr>
           <w:ilvl w:val="0"/>
-          <w:numId w:val="9"/>
+          <w:numId w:val="11"/>
         </w:numPr>
         <w:spacing w:after="70" w:line="264"/>
       </w:pPr>
@@ -31951,7 +32492,7 @@
         <w:pStyle w:val="ListParagraph"/>
         <w:numPr>
           <w:ilvl w:val="0"/>
-          <w:numId w:val="9"/>
+          <w:numId w:val="11"/>
         </w:numPr>
         <w:spacing w:after="70" w:line="264"/>
       </w:pPr>
@@ -31989,7 +32530,7 @@
         <w:pStyle w:val="ListParagraph"/>
         <w:numPr>
           <w:ilvl w:val="0"/>
-          <w:numId w:val="9"/>
+          <w:numId w:val="11"/>
         </w:numPr>
         <w:spacing w:after="70" w:line="264"/>
       </w:pPr>
@@ -32027,7 +32568,7 @@
         <w:pStyle w:val="ListParagraph"/>
         <w:numPr>
           <w:ilvl w:val="0"/>
-          <w:numId w:val="9"/>
+          <w:numId w:val="11"/>
         </w:numPr>
         <w:spacing w:after="70" w:line="264"/>
       </w:pPr>
@@ -32093,7 +32634,7 @@
         <w:pStyle w:val="ListParagraph"/>
         <w:numPr>
           <w:ilvl w:val="0"/>
-          <w:numId w:val="9"/>
+          <w:numId w:val="11"/>
         </w:numPr>
         <w:spacing w:after="70" w:line="264"/>
       </w:pPr>
@@ -32131,7 +32672,7 @@
         <w:pStyle w:val="ListParagraph"/>
         <w:numPr>
           <w:ilvl w:val="0"/>
-          <w:numId w:val="9"/>
+          <w:numId w:val="11"/>
         </w:numPr>
         <w:spacing w:after="70" w:line="264"/>
       </w:pPr>
@@ -32155,7 +32696,7 @@
         <w:pStyle w:val="ListParagraph"/>
         <w:numPr>
           <w:ilvl w:val="0"/>
-          <w:numId w:val="9"/>
+          <w:numId w:val="11"/>
         </w:numPr>
         <w:spacing w:after="70" w:line="264"/>
       </w:pPr>
@@ -32679,7 +33220,7 @@
         <w:pStyle w:val="ListParagraph"/>
         <w:numPr>
           <w:ilvl w:val="0"/>
-          <w:numId w:val="10"/>
+          <w:numId w:val="12"/>
         </w:numPr>
         <w:spacing w:after="70" w:line="264"/>
       </w:pPr>
@@ -32697,7 +33238,7 @@
         <w:pStyle w:val="ListParagraph"/>
         <w:numPr>
           <w:ilvl w:val="0"/>
-          <w:numId w:val="10"/>
+          <w:numId w:val="12"/>
         </w:numPr>
         <w:spacing w:after="70" w:line="264"/>
       </w:pPr>
@@ -32735,7 +33276,7 @@
         <w:pStyle w:val="ListParagraph"/>
         <w:numPr>
           <w:ilvl w:val="0"/>
-          <w:numId w:val="10"/>
+          <w:numId w:val="12"/>
         </w:numPr>
         <w:spacing w:after="70" w:line="264"/>
       </w:pPr>
@@ -32851,7 +33392,7 @@
         <w:pStyle w:val="ListParagraph"/>
         <w:numPr>
           <w:ilvl w:val="0"/>
-          <w:numId w:val="11"/>
+          <w:numId w:val="13"/>
         </w:numPr>
         <w:spacing w:after="70" w:line="264"/>
       </w:pPr>
@@ -32867,7 +33408,7 @@
         <w:pStyle w:val="ListParagraph"/>
         <w:numPr>
           <w:ilvl w:val="0"/>
-          <w:numId w:val="11"/>
+          <w:numId w:val="13"/>
         </w:numPr>
         <w:spacing w:after="70" w:line="264"/>
       </w:pPr>
@@ -32875,7 +33416,7 @@
         <w:rPr>
           <w:rFonts w:ascii="Arial" w:cs="Arial" w:eastAsia="Arial" w:hAnsi="Arial"/>
         </w:rPr>
-        <w:t xml:space="preserve">To watch: instance → </w:t>
+        <w:t xml:space="preserve">The instructor watches it in AWS's browser terminal (instance → </w:t>
       </w:r>
       <w:r>
         <w:rPr>
@@ -32889,21 +33430,7 @@
         <w:rPr>
           <w:rFonts w:ascii="Arial" w:cs="Arial" w:eastAsia="Arial" w:hAnsi="Arial"/>
         </w:rPr>
-        <w:t xml:space="preserve">, then type </w:t>
-      </w:r>
-      <w:r>
-        <w:rPr>
-          <w:rFonts w:ascii="Arial" w:cs="Arial" w:eastAsia="Arial" w:hAnsi="Arial"/>
-          <w:b/>
-          <w:bCs/>
-        </w:rPr>
-        <w:t xml:space="preserve">sudo tail -n 20 /var/log/campusly-install.log</w:t>
-      </w:r>
-      <w:r>
-        <w:rPr>
-          <w:rFonts w:ascii="Arial" w:cs="Arial" w:eastAsia="Arial" w:hAnsi="Arial"/>
-        </w:rPr>
-        <w:t xml:space="preserve">. It is done when the last line is </w:t>
+        <w:t xml:space="preserve">) by reading the install log. It is done when the last line is </w:t>
       </w:r>
       <w:r>
         <w:rPr>
@@ -32925,7 +33452,7 @@
         <w:pStyle w:val="ListParagraph"/>
         <w:numPr>
           <w:ilvl w:val="0"/>
-          <w:numId w:val="11"/>
+          <w:numId w:val="13"/>
         </w:numPr>
         <w:spacing w:after="70" w:line="264"/>
       </w:pPr>
@@ -33146,7 +33673,7 @@
         <w:rPr>
           <w:rFonts w:ascii="Arial" w:cs="Arial" w:eastAsia="Arial" w:hAnsi="Arial"/>
         </w:rPr>
-        <w:t xml:space="preserve">After pushing changes to GitHub: instance → Connect → EC2 Instance Connect, then type </w:t>
+        <w:t xml:space="preserve">The live app belongs to the instructor. After pushing changes to the original repository, the instructor opens AWS's browser terminal (EC2 Instance Connect) and runs the update script, </w:t>
       </w:r>
       <w:r>
         <w:rPr>
@@ -33154,13 +33681,13 @@
           <w:b/>
           <w:bCs/>
         </w:rPr>
-        <w:t xml:space="preserve">sudo campusly-update</w:t>
-      </w:r>
-      <w:r>
-        <w:rPr>
-          <w:rFonts w:ascii="Arial" w:cs="Arial" w:eastAsia="Arial" w:hAnsi="Arial"/>
-        </w:rPr>
-        <w:t xml:space="preserve">. It pulls the code, rebuilds and restarts in 2–3 minutes and keeps the data. </w:t>
+        <w:t xml:space="preserve">campusly-update</w:t>
+      </w:r>
+      <w:r>
+        <w:rPr>
+          <w:rFonts w:ascii="Arial" w:cs="Arial" w:eastAsia="Arial" w:hAnsi="Arial"/>
+        </w:rPr>
+        <w:t xml:space="preserve">: it pulls the code, rebuilds and restarts in 2–3 minutes and keeps the data. </w:t>
       </w:r>
       <w:r>
         <w:rPr>
@@ -33168,13 +33695,13 @@
           <w:b/>
           <w:bCs/>
         </w:rPr>
-        <w:t xml:space="preserve">sudo campusly-reset-demo</w:t>
-      </w:r>
-      <w:r>
-        <w:rPr>
-          <w:rFonts w:ascii="Arial" w:cs="Arial" w:eastAsia="Arial" w:hAnsi="Arial"/>
-        </w:rPr>
-        <w:t xml:space="preserve"> restores the demo data.</w:t>
+        <w:t xml:space="preserve">campusly-reset-demo</w:t>
+      </w:r>
+      <w:r>
+        <w:rPr>
+          <w:rFonts w:ascii="Arial" w:cs="Arial" w:eastAsia="Arial" w:hAnsi="Arial"/>
+        </w:rPr>
+        <w:t xml:space="preserve"> restores the demo data before each class. Your own changes stay in your fork and on your machine.</w:t>
       </w:r>
     </w:p>
     <w:p>
@@ -37253,6 +37780,42 @@
       </w:rPr>
     </w:lvl>
   </w:abstractNum>
+  <w:abstractNum w:abstractNumId="13" w15:restartNumberingAfterBreak="0">
+    <w:multiLevelType w:val="hybridMultilevel"/>
+    <w:lvl w:ilvl="0" w:tentative="1">
+      <w:start w:val="1"/>
+      <w:numFmt w:val="decimal"/>
+      <w:lvlText w:val="%1."/>
+      <w:lvlJc w:val="left"/>
+      <w:pPr>
+        <w:ind w:left="540" w:hanging="300"/>
+      </w:pPr>
+      <w:rPr>
+        <w:rFonts w:ascii="Arial" w:cs="Arial" w:eastAsia="Arial" w:hAnsi="Arial"/>
+        <w:b/>
+        <w:bCs/>
+        <w:color w:val="0B6E5F"/>
+      </w:rPr>
+    </w:lvl>
+  </w:abstractNum>
+  <w:abstractNum w:abstractNumId="14" w15:restartNumberingAfterBreak="0">
+    <w:multiLevelType w:val="hybridMultilevel"/>
+    <w:lvl w:ilvl="0" w:tentative="1">
+      <w:start w:val="1"/>
+      <w:numFmt w:val="decimal"/>
+      <w:lvlText w:val="%1."/>
+      <w:lvlJc w:val="left"/>
+      <w:pPr>
+        <w:ind w:left="540" w:hanging="300"/>
+      </w:pPr>
+      <w:rPr>
+        <w:rFonts w:ascii="Arial" w:cs="Arial" w:eastAsia="Arial" w:hAnsi="Arial"/>
+        <w:b/>
+        <w:bCs/>
+        <w:color w:val="0B6E5F"/>
+      </w:rPr>
+    </w:lvl>
+  </w:abstractNum>
   <w:num w:numId="1">
     <w:abstractNumId w:val="1"/>
     <w:lvlOverride w:ilvl="0">
@@ -37315,6 +37878,18 @@
   </w:num>
   <w:num w:numId="11">
     <w:abstractNumId w:val="12"/>
+    <w:lvlOverride w:ilvl="0">
+      <w:startOverride w:val="1"/>
+    </w:lvlOverride>
+  </w:num>
+  <w:num w:numId="12">
+    <w:abstractNumId w:val="13"/>
+    <w:lvlOverride w:ilvl="0">
+      <w:startOverride w:val="1"/>
+    </w:lvlOverride>
+  </w:num>
+  <w:num w:numId="13">
+    <w:abstractNumId w:val="14"/>
     <w:lvlOverride w:ilvl="0">
       <w:startOverride w:val="1"/>
     </w:lvlOverride>

</xml_diff>